<commit_message>
feat: generate header, footer, and title page programmatically
Drops docxtpl/Jinja templating for Part A (header/footer) and Part C
(title page) in favor of plain py-docx calls, matching the
signature/revision table pattern. Fixes real formatting bugs surfaced
in review: borderless signature/header/title tables (Normal Table has
no borders), header table overflowing the page width, a broken
left-justification on the doc_number line, and cramped column widths
across the signature/revision/header tables.

TEMPLATE_Word_Content.docx is removed (its content is now hardcoded in
build_title_page()); the base template's header/footer are cleared to
empty containers since Python builds them fresh at compile time.
docxtpl is dropped as a dependency; check_deps.py updated for both
compiler skills.

Co-Authored-By: Claude Sonnet 5 <noreply@anthropic.com>
</commit_message>
<xml_diff>
--- a/templates/TEMPLATE_Word_Base.docx
+++ b/templates/TEMPLATE_Word_Base.docx
@@ -15,7 +15,7 @@
       <w:headerReference w:type="default" r:id="rId11"/>
       <w:footerReference w:type="default" r:id="rId12"/>
       <w:pgSz w:w="11906" w:h="16838"/>
-      <w:pgMar w:top="1440" w:right="1440" w:bottom="1440" w:left="1440" w:header="708" w:footer="708" w:gutter="0"/>
+      <w:pgMar w:top="2016" w:right="1440" w:bottom="1440" w:left="1440" w:header="708" w:footer="708" w:gutter="0"/>
       <w:cols w:space="708"/>
       <w:docGrid w:linePitch="360"/>
     </w:sectPr>
@@ -43,59 +43,7 @@
 </file>
 
 <file path=word/footer1.xml><?xml version="1.0" encoding="utf-8"?>
-<w:ftr xmlns:wpc="http://schemas.microsoft.com/office/word/2010/wordprocessingCanvas" xmlns:cx="http://schemas.microsoft.com/office/drawing/2014/chartex" xmlns:cx1="http://schemas.microsoft.com/office/drawing/2015/9/8/chartex" xmlns:cx2="http://schemas.microsoft.com/office/drawing/2015/10/21/chartex" xmlns:cx3="http://schemas.microsoft.com/office/drawing/2016/5/9/chartex" xmlns:cx4="http://schemas.microsoft.com/office/drawing/2016/5/10/chartex" xmlns:cx5="http://schemas.microsoft.com/office/drawing/2016/5/11/chartex" xmlns:cx6="http://schemas.microsoft.com/office/drawing/2016/5/12/chartex" xmlns:cx7="http://schemas.microsoft.com/office/drawing/2016/5/13/chartex" xmlns:cx8="http://schemas.microsoft.com/office/drawing/2016/5/14/chartex" xmlns:mc="http://schemas.openxmlformats.org/markup-compatibility/2006" xmlns:aink="http://schemas.microsoft.com/office/drawing/2016/ink" xmlns:am3d="http://schemas.microsoft.com/office/drawing/2017/model3d" xmlns:o="urn:schemas-microsoft-com:office:office" xmlns:oel="http://schemas.microsoft.com/office/2019/extlst" xmlns:r="http://schemas.openxmlformats.org/officeDocument/2006/relationships" xmlns:m="http://schemas.openxmlformats.org/officeDocument/2006/math" xmlns:v="urn:schemas-microsoft-com:vml" xmlns:wp14="http://schemas.microsoft.com/office/word/2010/wordprocessingDrawing" xmlns:wp="http://schemas.openxmlformats.org/drawingml/2006/wordprocessingDrawing" xmlns:w10="urn:schemas-microsoft-com:office:word" xmlns:w="http://schemas.openxmlformats.org/wordprocessingml/2006/main" xmlns:w14="http://schemas.microsoft.com/office/word/2010/wordml" xmlns:w15="http://schemas.microsoft.com/office/word/2012/wordml" xmlns:w16cei="http://schemas.microsoft.com/office/word/2026/wordml/cei" xmlns:w16cex="http://schemas.microsoft.com/office/word/2018/wordml/cex" xmlns:w16cid="http://schemas.microsoft.com/office/word/2016/wordml/cid" xmlns:w16="http://schemas.microsoft.com/office/word/2018/wordml" xmlns:w16du="http://schemas.microsoft.com/office/word/2023/wordml/word16du" xmlns:w16sdtdh="http://schemas.microsoft.com/office/word/2020/wordml/sdtdatahash" xmlns:w16sdtfl="http://schemas.microsoft.com/office/word/2024/wordml/sdtformatlock" xmlns:w16se="http://schemas.microsoft.com/office/word/2015/wordml/symex" xmlns:wpg="http://schemas.microsoft.com/office/word/2010/wordprocessingGroup" xmlns:wpi="http://schemas.microsoft.com/office/word/2010/wordprocessingInk" xmlns:wne="http://schemas.microsoft.com/office/word/2006/wordml" xmlns:wps="http://schemas.microsoft.com/office/word/2010/wordprocessingShape" mc:Ignorable="w14 w15 w16se w16cid w16 w16cex w16sdtdh w16sdtfl w16du wp14">
-  <w:tbl>
-    <w:tblPr>
-      <w:tblW w:w="0" w:type="auto"/>
-      <w:tblLayout w:type="fixed"/>
-      <w:tblLook w:val="06A0" w:firstRow="1" w:lastRow="0" w:firstColumn="1" w:lastColumn="0" w:noHBand="1" w:noVBand="1"/>
-    </w:tblPr>
-    <w:tblGrid>
-      <w:gridCol w:w="3005"/>
-      <w:gridCol w:w="3005"/>
-      <w:gridCol w:w="3005"/>
-    </w:tblGrid>
-    <w:tr>
-      <w:trPr>
-        <w:trHeight w:val="300"/>
-      </w:trPr>
-      <w:tc>
-        <w:tcPr>
-          <w:tcW w:w="3005" w:type="dxa"/>
-        </w:tcPr>
-        <w:p>
-          <w:pPr>
-            <w:pStyle w:val="Header"/>
-            <w:ind w:left="-115"/>
-          </w:pPr>
-        </w:p>
-      </w:tc>
-      <w:tc>
-        <w:tcPr>
-          <w:tcW w:w="3005" w:type="dxa"/>
-        </w:tcPr>
-        <w:p/>
-      </w:tc>
-      <w:tc>
-        <w:tcPr>
-          <w:tcW w:w="3005" w:type="dxa"/>
-        </w:tcPr>
-        <w:p>
-          <w:pPr>
-            <w:pStyle w:val="Header"/>
-            <w:ind w:right="-115"/>
-            <w:jc w:val="right"/>
-          </w:pPr>
-        </w:p>
-      </w:tc>
-    </w:tr>
-  </w:tbl>
-  <w:p>
-    <w:pPr>
-      <w:pStyle w:val="Footer"/>
-    </w:pPr>
-  </w:p>
-</w:ftr>
+<w:ftr xmlns:wpc="http://schemas.microsoft.com/office/word/2010/wordprocessingCanvas" xmlns:cx="http://schemas.microsoft.com/office/drawing/2014/chartex" xmlns:cx1="http://schemas.microsoft.com/office/drawing/2015/9/8/chartex" xmlns:cx2="http://schemas.microsoft.com/office/drawing/2015/10/21/chartex" xmlns:cx3="http://schemas.microsoft.com/office/drawing/2016/5/9/chartex" xmlns:cx4="http://schemas.microsoft.com/office/drawing/2016/5/10/chartex" xmlns:cx5="http://schemas.microsoft.com/office/drawing/2016/5/11/chartex" xmlns:cx6="http://schemas.microsoft.com/office/drawing/2016/5/12/chartex" xmlns:cx7="http://schemas.microsoft.com/office/drawing/2016/5/13/chartex" xmlns:cx8="http://schemas.microsoft.com/office/drawing/2016/5/14/chartex" xmlns:mc="http://schemas.openxmlformats.org/markup-compatibility/2006" xmlns:aink="http://schemas.microsoft.com/office/drawing/2016/ink" xmlns:am3d="http://schemas.microsoft.com/office/drawing/2017/model3d" xmlns:o="urn:schemas-microsoft-com:office:office" xmlns:oel="http://schemas.microsoft.com/office/2019/extlst" xmlns:r="http://schemas.openxmlformats.org/officeDocument/2006/relationships" xmlns:m="http://schemas.openxmlformats.org/officeDocument/2006/math" xmlns:v="urn:schemas-microsoft-com:vml" xmlns:wp14="http://schemas.microsoft.com/office/word/2010/wordprocessingDrawing" xmlns:wp="http://schemas.openxmlformats.org/drawingml/2006/wordprocessingDrawing" xmlns:w10="urn:schemas-microsoft-com:office:word" xmlns:w="http://schemas.openxmlformats.org/wordprocessingml/2006/main" xmlns:w14="http://schemas.microsoft.com/office/word/2010/wordml" xmlns:w15="http://schemas.microsoft.com/office/word/2012/wordml" xmlns:w16cei="http://schemas.microsoft.com/office/word/2026/wordml/cei" xmlns:w16cex="http://schemas.microsoft.com/office/word/2018/wordml/cex" xmlns:w16cid="http://schemas.microsoft.com/office/word/2016/wordml/cid" xmlns:w16="http://schemas.microsoft.com/office/word/2018/wordml" xmlns:w16du="http://schemas.microsoft.com/office/word/2023/wordml/word16du" xmlns:w16sdtdh="http://schemas.microsoft.com/office/word/2020/wordml/sdtdatahash" xmlns:w16sdtfl="http://schemas.microsoft.com/office/word/2024/wordml/sdtformatlock" xmlns:w16se="http://schemas.microsoft.com/office/word/2015/wordml/symex" xmlns:wpg="http://schemas.microsoft.com/office/word/2010/wordprocessingGroup" xmlns:wpi="http://schemas.microsoft.com/office/word/2010/wordprocessingInk" xmlns:wne="http://schemas.microsoft.com/office/word/2006/wordml" xmlns:wps="http://schemas.microsoft.com/office/word/2010/wordprocessingShape" mc:Ignorable="w14 w15 w16se w16cid w16 w16cex w16sdtdh w16sdtfl w16du wp14"/>
 </file>
 
 <file path=word/footnotes.xml><?xml version="1.0" encoding="utf-8"?>
@@ -118,349 +66,7 @@
 </file>
 
 <file path=word/header1.xml><?xml version="1.0" encoding="utf-8"?>
-<w:hdr xmlns:wpc="http://schemas.microsoft.com/office/word/2010/wordprocessingCanvas" xmlns:cx="http://schemas.microsoft.com/office/drawing/2014/chartex" xmlns:cx1="http://schemas.microsoft.com/office/drawing/2015/9/8/chartex" xmlns:cx2="http://schemas.microsoft.com/office/drawing/2015/10/21/chartex" xmlns:cx3="http://schemas.microsoft.com/office/drawing/2016/5/9/chartex" xmlns:cx4="http://schemas.microsoft.com/office/drawing/2016/5/10/chartex" xmlns:cx5="http://schemas.microsoft.com/office/drawing/2016/5/11/chartex" xmlns:cx6="http://schemas.microsoft.com/office/drawing/2016/5/12/chartex" xmlns:cx7="http://schemas.microsoft.com/office/drawing/2016/5/13/chartex" xmlns:cx8="http://schemas.microsoft.com/office/drawing/2016/5/14/chartex" xmlns:mc="http://schemas.openxmlformats.org/markup-compatibility/2006" xmlns:aink="http://schemas.microsoft.com/office/drawing/2016/ink" xmlns:am3d="http://schemas.microsoft.com/office/drawing/2017/model3d" xmlns:o="urn:schemas-microsoft-com:office:office" xmlns:oel="http://schemas.microsoft.com/office/2019/extlst" xmlns:r="http://schemas.openxmlformats.org/officeDocument/2006/relationships" xmlns:m="http://schemas.openxmlformats.org/officeDocument/2006/math" xmlns:v="urn:schemas-microsoft-com:vml" xmlns:wp14="http://schemas.microsoft.com/office/word/2010/wordprocessingDrawing" xmlns:wp="http://schemas.openxmlformats.org/drawingml/2006/wordprocessingDrawing" xmlns:w10="urn:schemas-microsoft-com:office:word" xmlns:w="http://schemas.openxmlformats.org/wordprocessingml/2006/main" xmlns:w14="http://schemas.microsoft.com/office/word/2010/wordml" xmlns:w15="http://schemas.microsoft.com/office/word/2012/wordml" xmlns:w16cei="http://schemas.microsoft.com/office/word/2026/wordml/cei" xmlns:w16cex="http://schemas.microsoft.com/office/word/2018/wordml/cex" xmlns:w16cid="http://schemas.microsoft.com/office/word/2016/wordml/cid" xmlns:w16="http://schemas.microsoft.com/office/word/2018/wordml" xmlns:w16du="http://schemas.microsoft.com/office/word/2023/wordml/word16du" xmlns:w16sdtdh="http://schemas.microsoft.com/office/word/2020/wordml/sdtdatahash" xmlns:w16sdtfl="http://schemas.microsoft.com/office/word/2024/wordml/sdtformatlock" xmlns:w16se="http://schemas.microsoft.com/office/word/2015/wordml/symex" xmlns:wpg="http://schemas.microsoft.com/office/word/2010/wordprocessingGroup" xmlns:wpi="http://schemas.microsoft.com/office/word/2010/wordprocessingInk" xmlns:wne="http://schemas.microsoft.com/office/word/2006/wordml" xmlns:wps="http://schemas.microsoft.com/office/word/2010/wordprocessingShape" mc:Ignorable="w14 w15 w16se w16cid w16 w16cex w16sdtdh w16sdtfl w16du wp14">
-  <w:tbl>
-    <w:tblPr>
-      <w:tblW w:w="9625" w:type="dxa"/>
-      <w:tblBorders>
-        <w:top w:val="single" w:sz="4" w:space="0" w:color="auto"/>
-        <w:left w:val="single" w:sz="4" w:space="0" w:color="auto"/>
-        <w:bottom w:val="single" w:sz="4" w:space="0" w:color="auto"/>
-        <w:right w:val="single" w:sz="4" w:space="0" w:color="auto"/>
-        <w:insideH w:val="single" w:sz="4" w:space="0" w:color="auto"/>
-        <w:insideV w:val="single" w:sz="4" w:space="0" w:color="auto"/>
-      </w:tblBorders>
-      <w:tblLayout w:type="fixed"/>
-      <w:tblCellMar>
-        <w:top w:w="29" w:type="dxa"/>
-        <w:left w:w="29" w:type="dxa"/>
-        <w:bottom w:w="29" w:type="dxa"/>
-        <w:right w:w="29" w:type="dxa"/>
-      </w:tblCellMar>
-      <w:tblLook w:val="0000" w:firstRow="0" w:lastRow="0" w:firstColumn="0" w:lastColumn="0" w:noHBand="0" w:noVBand="0"/>
-    </w:tblPr>
-    <w:tblGrid>
-      <w:gridCol w:w="2065"/>
-      <w:gridCol w:w="5130"/>
-      <w:gridCol w:w="1080"/>
-      <w:gridCol w:w="1350"/>
-    </w:tblGrid>
-    <w:tr>
-      <w:trPr>
-        <w:cantSplit/>
-        <w:trHeight w:val="945"/>
-      </w:trPr>
-      <w:tc>
-        <w:tcPr>
-          <w:tcW w:w="2065" w:type="dxa"/>
-          <w:tcBorders>
-            <w:bottom w:val="single" w:sz="4" w:space="0" w:color="auto"/>
-          </w:tcBorders>
-          <w:vAlign w:val="center"/>
-        </w:tcPr>
-        <w:p>
-          <w:pPr>
-            <w:jc w:val="center"/>
-            <w:rPr>
-              <w:rFonts w:ascii="Arial Narrow" w:hAnsi="Arial Narrow"/>
-              <w:b/>
-            </w:rPr>
-          </w:pPr>
-          <w:r>
-            <w:rPr>
-              <w:noProof/>
-            </w:rPr>
-            <w:drawing>
-              <wp:inline distT="0" distB="0" distL="0" distR="0" wp14:anchorId="252AFDB9" wp14:editId="7720A69F">
-                <wp:extent cx="804545" cy="600075"/>
-                <wp:effectExtent l="0" t="0" r="0" b="9525"/>
-                <wp:docPr id="1053709729" name="Picture 1053709729"/>
-                <wp:cNvGraphicFramePr>
-                  <a:graphicFrameLocks xmlns:a="http://schemas.openxmlformats.org/drawingml/2006/main" noChangeAspect="1"/>
-                </wp:cNvGraphicFramePr>
-                <a:graphic xmlns:a="http://schemas.openxmlformats.org/drawingml/2006/main">
-                  <a:graphicData uri="http://schemas.openxmlformats.org/drawingml/2006/picture">
-                    <pic:pic xmlns:pic="http://schemas.openxmlformats.org/drawingml/2006/picture">
-                      <pic:nvPicPr>
-                        <pic:cNvPr id="0" name="Picture 1"/>
-                        <pic:cNvPicPr>
-                          <a:picLocks noChangeAspect="1" noChangeArrowheads="1"/>
-                        </pic:cNvPicPr>
-                      </pic:nvPicPr>
-                      <pic:blipFill>
-                        <a:blip r:embed="rId1">
-                          <a:extLst>
-                            <a:ext uri="{28A0092B-C50C-407E-A947-70E740481C1C}">
-                              <a14:useLocalDpi xmlns:a14="http://schemas.microsoft.com/office/drawing/2010/main" val="0"/>
-                            </a:ext>
-                          </a:extLst>
-                        </a:blip>
-                        <a:srcRect/>
-                        <a:stretch>
-                          <a:fillRect/>
-                        </a:stretch>
-                      </pic:blipFill>
-                      <pic:spPr bwMode="auto">
-                        <a:xfrm>
-                          <a:off x="0" y="0"/>
-                          <a:ext cx="804545" cy="600075"/>
-                        </a:xfrm>
-                        <a:prstGeom prst="rect">
-                          <a:avLst/>
-                        </a:prstGeom>
-                        <a:noFill/>
-                        <a:ln>
-                          <a:noFill/>
-                        </a:ln>
-                      </pic:spPr>
-                    </pic:pic>
-                  </a:graphicData>
-                </a:graphic>
-              </wp:inline>
-            </w:drawing>
-          </w:r>
-        </w:p>
-      </w:tc>
-      <w:tc>
-        <w:tcPr>
-          <w:tcW w:w="5130" w:type="dxa"/>
-          <w:vAlign w:val="center"/>
-        </w:tcPr>
-        <w:p>
-          <w:pPr>
-            <w:tabs>
-              <w:tab w:val="right" w:pos="951"/>
-              <w:tab w:val="left" w:pos="1135"/>
-            </w:tabs>
-            <w:rPr>
-              <w:bCs/>
-            </w:rPr>
-          </w:pPr>
-          <w:proofErr w:type="gramStart"/>
-          <w:r>
-            <w:rPr>
-              <w:bCs/>
-            </w:rPr>
-            <w:t>Title</w:t>
-          </w:r>
-          <w:r>
-            <w:rPr>
-              <w:bCs/>
-            </w:rPr>
-            <w:t>: {{</w:t>
-          </w:r>
-          <w:proofErr w:type="gramEnd"/>
-          <w:r>
-            <w:rPr>
-              <w:bCs/>
-            </w:rPr>
-            <w:t>title}}</w:t>
-          </w:r>
-        </w:p>
-        <w:p>
-          <w:pPr>
-            <w:tabs>
-              <w:tab w:val="right" w:pos="951"/>
-              <w:tab w:val="left" w:pos="1135"/>
-            </w:tabs>
-            <w:ind w:left="1152" w:hanging="1152"/>
-          </w:pPr>
-          <w:r>
-            <w:rPr>
-              <w:bCs/>
-            </w:rPr>
-            <w:tab/>
-          </w:r>
-          <w:proofErr w:type="gramStart"/>
-          <w:r>
-            <w:rPr>
-              <w:bCs/>
-            </w:rPr>
-            <w:t>Number:</w:t>
-          </w:r>
-          <w:r>
-            <w:rPr>
-              <w:bCs/>
-            </w:rPr>
-            <w:t xml:space="preserve"> {{</w:t>
-          </w:r>
-          <w:proofErr w:type="spellStart"/>
-          <w:proofErr w:type="gramEnd"/>
-          <w:r>
-            <w:rPr>
-              <w:bCs/>
-            </w:rPr>
-            <w:t>doc_number</w:t>
-          </w:r>
-          <w:proofErr w:type="spellEnd"/>
-          <w:r>
-            <w:rPr>
-              <w:bCs/>
-            </w:rPr>
-            <w:t>}}</w:t>
-          </w:r>
-        </w:p>
-      </w:tc>
-      <w:tc>
-        <w:tcPr>
-          <w:tcW w:w="1080" w:type="dxa"/>
-          <w:vAlign w:val="center"/>
-        </w:tcPr>
-        <w:p>
-          <w:pPr>
-            <w:spacing w:line="276" w:lineRule="auto"/>
-            <w:jc w:val="center"/>
-            <w:rPr>
-              <w:b/>
-              <w:bCs/>
-            </w:rPr>
-          </w:pPr>
-          <w:r>
-            <w:rPr>
-              <w:b/>
-              <w:bCs/>
-            </w:rPr>
-            <w:t xml:space="preserve">Rev </w:t>
-          </w:r>
-          <w:r>
-            <w:rPr>
-              <w:b/>
-              <w:bCs/>
-            </w:rPr>
-            <w:t>{{</w:t>
-          </w:r>
-          <w:proofErr w:type="spellStart"/>
-          <w:r>
-            <w:rPr>
-              <w:b/>
-              <w:bCs/>
-            </w:rPr>
-            <w:t>current_revision</w:t>
-          </w:r>
-          <w:proofErr w:type="spellEnd"/>
-          <w:r>
-            <w:rPr>
-              <w:b/>
-              <w:bCs/>
-            </w:rPr>
-            <w:t>}}</w:t>
-          </w:r>
-        </w:p>
-      </w:tc>
-      <w:tc>
-        <w:tcPr>
-          <w:tcW w:w="1350" w:type="dxa"/>
-          <w:vAlign w:val="center"/>
-        </w:tcPr>
-        <w:p>
-          <w:pPr>
-            <w:spacing w:line="276" w:lineRule="auto"/>
-            <w:jc w:val="center"/>
-            <w:rPr>
-              <w:b/>
-            </w:rPr>
-          </w:pPr>
-          <w:r>
-            <w:rPr>
-              <w:b/>
-            </w:rPr>
-            <w:t>Page</w:t>
-          </w:r>
-        </w:p>
-        <w:p>
-          <w:pPr>
-            <w:spacing w:line="276" w:lineRule="auto"/>
-            <w:jc w:val="center"/>
-            <w:rPr>
-              <w:b/>
-            </w:rPr>
-          </w:pPr>
-          <w:r>
-            <w:rPr>
-              <w:b/>
-            </w:rPr>
-            <w:fldChar w:fldCharType="begin"/>
-          </w:r>
-          <w:r>
-            <w:rPr>
-              <w:b/>
-            </w:rPr>
-            <w:instrText>page \* arabic</w:instrText>
-          </w:r>
-          <w:r>
-            <w:rPr>
-              <w:b/>
-            </w:rPr>
-            <w:fldChar w:fldCharType="separate"/>
-          </w:r>
-          <w:r>
-            <w:rPr>
-              <w:b/>
-              <w:noProof/>
-            </w:rPr>
-            <w:t>1</w:t>
-          </w:r>
-          <w:r>
-            <w:rPr>
-              <w:b/>
-            </w:rPr>
-            <w:fldChar w:fldCharType="end"/>
-          </w:r>
-          <w:r>
-            <w:rPr>
-              <w:b/>
-            </w:rPr>
-            <w:t xml:space="preserve"> of </w:t>
-          </w:r>
-          <w:r>
-            <w:rPr>
-              <w:b/>
-            </w:rPr>
-            <w:fldChar w:fldCharType="begin"/>
-          </w:r>
-          <w:r>
-            <w:rPr>
-              <w:b/>
-            </w:rPr>
-            <w:instrText xml:space="preserve">numpages </w:instrText>
-          </w:r>
-          <w:r>
-            <w:rPr>
-              <w:b/>
-            </w:rPr>
-            <w:fldChar w:fldCharType="separate"/>
-          </w:r>
-          <w:r>
-            <w:rPr>
-              <w:b/>
-              <w:noProof/>
-            </w:rPr>
-            <w:t>8</w:t>
-          </w:r>
-          <w:r>
-            <w:rPr>
-              <w:b/>
-            </w:rPr>
-            <w:fldChar w:fldCharType="end"/>
-          </w:r>
-        </w:p>
-      </w:tc>
-    </w:tr>
-  </w:tbl>
-  <w:p>
-    <w:pPr>
-      <w:pStyle w:val="Header"/>
-      <w:tabs>
-        <w:tab w:val="clear" w:pos="4513"/>
-        <w:tab w:val="clear" w:pos="9026"/>
-        <w:tab w:val="left" w:pos="3150"/>
-      </w:tabs>
-    </w:pPr>
-    <w:r>
-      <w:tab/>
-    </w:r>
-  </w:p>
-</w:hdr>
+<w:hdr xmlns:wpc="http://schemas.microsoft.com/office/word/2010/wordprocessingCanvas" xmlns:cx="http://schemas.microsoft.com/office/drawing/2014/chartex" xmlns:cx1="http://schemas.microsoft.com/office/drawing/2015/9/8/chartex" xmlns:cx2="http://schemas.microsoft.com/office/drawing/2015/10/21/chartex" xmlns:cx3="http://schemas.microsoft.com/office/drawing/2016/5/9/chartex" xmlns:cx4="http://schemas.microsoft.com/office/drawing/2016/5/10/chartex" xmlns:cx5="http://schemas.microsoft.com/office/drawing/2016/5/11/chartex" xmlns:cx6="http://schemas.microsoft.com/office/drawing/2016/5/12/chartex" xmlns:cx7="http://schemas.microsoft.com/office/drawing/2016/5/13/chartex" xmlns:cx8="http://schemas.microsoft.com/office/drawing/2016/5/14/chartex" xmlns:mc="http://schemas.openxmlformats.org/markup-compatibility/2006" xmlns:aink="http://schemas.microsoft.com/office/drawing/2016/ink" xmlns:am3d="http://schemas.microsoft.com/office/drawing/2017/model3d" xmlns:o="urn:schemas-microsoft-com:office:office" xmlns:oel="http://schemas.microsoft.com/office/2019/extlst" xmlns:r="http://schemas.openxmlformats.org/officeDocument/2006/relationships" xmlns:m="http://schemas.openxmlformats.org/officeDocument/2006/math" xmlns:v="urn:schemas-microsoft-com:vml" xmlns:wp14="http://schemas.microsoft.com/office/word/2010/wordprocessingDrawing" xmlns:wp="http://schemas.openxmlformats.org/drawingml/2006/wordprocessingDrawing" xmlns:w10="urn:schemas-microsoft-com:office:word" xmlns:w="http://schemas.openxmlformats.org/wordprocessingml/2006/main" xmlns:w14="http://schemas.microsoft.com/office/word/2010/wordml" xmlns:w15="http://schemas.microsoft.com/office/word/2012/wordml" xmlns:w16cei="http://schemas.microsoft.com/office/word/2026/wordml/cei" xmlns:w16cex="http://schemas.microsoft.com/office/word/2018/wordml/cex" xmlns:w16cid="http://schemas.microsoft.com/office/word/2016/wordml/cid" xmlns:w16="http://schemas.microsoft.com/office/word/2018/wordml" xmlns:w16du="http://schemas.microsoft.com/office/word/2023/wordml/word16du" xmlns:w16sdtdh="http://schemas.microsoft.com/office/word/2020/wordml/sdtdatahash" xmlns:w16sdtfl="http://schemas.microsoft.com/office/word/2024/wordml/sdtformatlock" xmlns:w16se="http://schemas.microsoft.com/office/word/2015/wordml/symex" xmlns:wpg="http://schemas.microsoft.com/office/word/2010/wordprocessingGroup" xmlns:wpi="http://schemas.microsoft.com/office/word/2010/wordprocessingInk" xmlns:wne="http://schemas.microsoft.com/office/word/2006/wordml" xmlns:wps="http://schemas.microsoft.com/office/word/2010/wordprocessingShape" mc:Ignorable="w14 w15 w16se w16cid w16 w16cex w16sdtdh w16sdtfl w16du wp14"/>
 </file>
 
 <file path=word/numbering.xml><?xml version="1.0" encoding="utf-8"?>

</xml_diff>

<commit_message>
feat: add Form_Section_Header marker for auto-numbered form section headings
Adds a third form-only marker, alongside FillLine/FieldGrid: an
alternative to Pandoc heading levels purpose-built for forms, since
forms have no TOC or numbering-list linkage to hook a '#' heading into.
Each marker renders as 'Section N - <Title>' with N auto-incrementing
per marker in document order, styled with the template's new 'Form
Section Header' paragraph style (added to TEMPLATE_Word_Base.docx).
Falls back to default styling with a warning if that style isn't
present, matching the codebase's warn-and-degrade convention.
</commit_message>
<xml_diff>
--- a/templates/TEMPLATE_Word_Base.docx
+++ b/templates/TEMPLATE_Word_Base.docx
@@ -43,7 +43,13 @@
 </file>
 
 <file path=word/footer1.xml><?xml version="1.0" encoding="utf-8"?>
-<w:ftr xmlns:wpc="http://schemas.microsoft.com/office/word/2010/wordprocessingCanvas" xmlns:cx="http://schemas.microsoft.com/office/drawing/2014/chartex" xmlns:cx1="http://schemas.microsoft.com/office/drawing/2015/9/8/chartex" xmlns:cx2="http://schemas.microsoft.com/office/drawing/2015/10/21/chartex" xmlns:cx3="http://schemas.microsoft.com/office/drawing/2016/5/9/chartex" xmlns:cx4="http://schemas.microsoft.com/office/drawing/2016/5/10/chartex" xmlns:cx5="http://schemas.microsoft.com/office/drawing/2016/5/11/chartex" xmlns:cx6="http://schemas.microsoft.com/office/drawing/2016/5/12/chartex" xmlns:cx7="http://schemas.microsoft.com/office/drawing/2016/5/13/chartex" xmlns:cx8="http://schemas.microsoft.com/office/drawing/2016/5/14/chartex" xmlns:mc="http://schemas.openxmlformats.org/markup-compatibility/2006" xmlns:aink="http://schemas.microsoft.com/office/drawing/2016/ink" xmlns:am3d="http://schemas.microsoft.com/office/drawing/2017/model3d" xmlns:o="urn:schemas-microsoft-com:office:office" xmlns:oel="http://schemas.microsoft.com/office/2019/extlst" xmlns:r="http://schemas.openxmlformats.org/officeDocument/2006/relationships" xmlns:m="http://schemas.openxmlformats.org/officeDocument/2006/math" xmlns:v="urn:schemas-microsoft-com:vml" xmlns:wp14="http://schemas.microsoft.com/office/word/2010/wordprocessingDrawing" xmlns:wp="http://schemas.openxmlformats.org/drawingml/2006/wordprocessingDrawing" xmlns:w10="urn:schemas-microsoft-com:office:word" xmlns:w="http://schemas.openxmlformats.org/wordprocessingml/2006/main" xmlns:w14="http://schemas.microsoft.com/office/word/2010/wordml" xmlns:w15="http://schemas.microsoft.com/office/word/2012/wordml" xmlns:w16cei="http://schemas.microsoft.com/office/word/2026/wordml/cei" xmlns:w16cex="http://schemas.microsoft.com/office/word/2018/wordml/cex" xmlns:w16cid="http://schemas.microsoft.com/office/word/2016/wordml/cid" xmlns:w16="http://schemas.microsoft.com/office/word/2018/wordml" xmlns:w16du="http://schemas.microsoft.com/office/word/2023/wordml/word16du" xmlns:w16sdtdh="http://schemas.microsoft.com/office/word/2020/wordml/sdtdatahash" xmlns:w16sdtfl="http://schemas.microsoft.com/office/word/2024/wordml/sdtformatlock" xmlns:w16se="http://schemas.microsoft.com/office/word/2015/wordml/symex" xmlns:wpg="http://schemas.microsoft.com/office/word/2010/wordprocessingGroup" xmlns:wpi="http://schemas.microsoft.com/office/word/2010/wordprocessingInk" xmlns:wne="http://schemas.microsoft.com/office/word/2006/wordml" xmlns:wps="http://schemas.microsoft.com/office/word/2010/wordprocessingShape" mc:Ignorable="w14 w15 w16se w16cid w16 w16cex w16sdtdh w16sdtfl w16du wp14"/>
+<w:ftr xmlns:wpc="http://schemas.microsoft.com/office/word/2010/wordprocessingCanvas" xmlns:cx="http://schemas.microsoft.com/office/drawing/2014/chartex" xmlns:cx1="http://schemas.microsoft.com/office/drawing/2015/9/8/chartex" xmlns:cx2="http://schemas.microsoft.com/office/drawing/2015/10/21/chartex" xmlns:cx3="http://schemas.microsoft.com/office/drawing/2016/5/9/chartex" xmlns:cx4="http://schemas.microsoft.com/office/drawing/2016/5/10/chartex" xmlns:cx5="http://schemas.microsoft.com/office/drawing/2016/5/11/chartex" xmlns:cx6="http://schemas.microsoft.com/office/drawing/2016/5/12/chartex" xmlns:cx7="http://schemas.microsoft.com/office/drawing/2016/5/13/chartex" xmlns:cx8="http://schemas.microsoft.com/office/drawing/2016/5/14/chartex" xmlns:mc="http://schemas.openxmlformats.org/markup-compatibility/2006" xmlns:aink="http://schemas.microsoft.com/office/drawing/2016/ink" xmlns:am3d="http://schemas.microsoft.com/office/drawing/2017/model3d" xmlns:o="urn:schemas-microsoft-com:office:office" xmlns:oel="http://schemas.microsoft.com/office/2019/extlst" xmlns:r="http://schemas.openxmlformats.org/officeDocument/2006/relationships" xmlns:m="http://schemas.openxmlformats.org/officeDocument/2006/math" xmlns:v="urn:schemas-microsoft-com:vml" xmlns:wp14="http://schemas.microsoft.com/office/word/2010/wordprocessingDrawing" xmlns:wp="http://schemas.openxmlformats.org/drawingml/2006/wordprocessingDrawing" xmlns:w10="urn:schemas-microsoft-com:office:word" xmlns:w="http://schemas.openxmlformats.org/wordprocessingml/2006/main" xmlns:w14="http://schemas.microsoft.com/office/word/2010/wordml" xmlns:w15="http://schemas.microsoft.com/office/word/2012/wordml" xmlns:w16cei="http://schemas.microsoft.com/office/word/2026/wordml/cei" xmlns:w16cex="http://schemas.microsoft.com/office/word/2018/wordml/cex" xmlns:w16cid="http://schemas.microsoft.com/office/word/2016/wordml/cid" xmlns:w16="http://schemas.microsoft.com/office/word/2018/wordml" xmlns:w16du="http://schemas.microsoft.com/office/word/2023/wordml/word16du" xmlns:w16sdtdh="http://schemas.microsoft.com/office/word/2020/wordml/sdtdatahash" xmlns:w16sdtfl="http://schemas.microsoft.com/office/word/2024/wordml/sdtformatlock" xmlns:w16se="http://schemas.microsoft.com/office/word/2015/wordml/symex" xmlns:wpg="http://schemas.microsoft.com/office/word/2010/wordprocessingGroup" xmlns:wpi="http://schemas.microsoft.com/office/word/2010/wordprocessingInk" xmlns:wne="http://schemas.microsoft.com/office/word/2006/wordml" xmlns:wps="http://schemas.microsoft.com/office/word/2010/wordprocessingShape" mc:Ignorable="w14 w15 w16se w16cid w16 w16cex w16sdtdh w16sdtfl w16du wp14">
+  <w:p>
+    <w:r>
+      <w:cr/>
+    </w:r>
+  </w:p>
+</w:ftr>
 </file>
 
 <file path=word/footnotes.xml><?xml version="1.0" encoding="utf-8"?>
@@ -66,7 +72,13 @@
 </file>
 
 <file path=word/header1.xml><?xml version="1.0" encoding="utf-8"?>
-<w:hdr xmlns:wpc="http://schemas.microsoft.com/office/word/2010/wordprocessingCanvas" xmlns:cx="http://schemas.microsoft.com/office/drawing/2014/chartex" xmlns:cx1="http://schemas.microsoft.com/office/drawing/2015/9/8/chartex" xmlns:cx2="http://schemas.microsoft.com/office/drawing/2015/10/21/chartex" xmlns:cx3="http://schemas.microsoft.com/office/drawing/2016/5/9/chartex" xmlns:cx4="http://schemas.microsoft.com/office/drawing/2016/5/10/chartex" xmlns:cx5="http://schemas.microsoft.com/office/drawing/2016/5/11/chartex" xmlns:cx6="http://schemas.microsoft.com/office/drawing/2016/5/12/chartex" xmlns:cx7="http://schemas.microsoft.com/office/drawing/2016/5/13/chartex" xmlns:cx8="http://schemas.microsoft.com/office/drawing/2016/5/14/chartex" xmlns:mc="http://schemas.openxmlformats.org/markup-compatibility/2006" xmlns:aink="http://schemas.microsoft.com/office/drawing/2016/ink" xmlns:am3d="http://schemas.microsoft.com/office/drawing/2017/model3d" xmlns:o="urn:schemas-microsoft-com:office:office" xmlns:oel="http://schemas.microsoft.com/office/2019/extlst" xmlns:r="http://schemas.openxmlformats.org/officeDocument/2006/relationships" xmlns:m="http://schemas.openxmlformats.org/officeDocument/2006/math" xmlns:v="urn:schemas-microsoft-com:vml" xmlns:wp14="http://schemas.microsoft.com/office/word/2010/wordprocessingDrawing" xmlns:wp="http://schemas.openxmlformats.org/drawingml/2006/wordprocessingDrawing" xmlns:w10="urn:schemas-microsoft-com:office:word" xmlns:w="http://schemas.openxmlformats.org/wordprocessingml/2006/main" xmlns:w14="http://schemas.microsoft.com/office/word/2010/wordml" xmlns:w15="http://schemas.microsoft.com/office/word/2012/wordml" xmlns:w16cei="http://schemas.microsoft.com/office/word/2026/wordml/cei" xmlns:w16cex="http://schemas.microsoft.com/office/word/2018/wordml/cex" xmlns:w16cid="http://schemas.microsoft.com/office/word/2016/wordml/cid" xmlns:w16="http://schemas.microsoft.com/office/word/2018/wordml" xmlns:w16du="http://schemas.microsoft.com/office/word/2023/wordml/word16du" xmlns:w16sdtdh="http://schemas.microsoft.com/office/word/2020/wordml/sdtdatahash" xmlns:w16sdtfl="http://schemas.microsoft.com/office/word/2024/wordml/sdtformatlock" xmlns:w16se="http://schemas.microsoft.com/office/word/2015/wordml/symex" xmlns:wpg="http://schemas.microsoft.com/office/word/2010/wordprocessingGroup" xmlns:wpi="http://schemas.microsoft.com/office/word/2010/wordprocessingInk" xmlns:wne="http://schemas.microsoft.com/office/word/2006/wordml" xmlns:wps="http://schemas.microsoft.com/office/word/2010/wordprocessingShape" mc:Ignorable="w14 w15 w16se w16cid w16 w16cex w16sdtdh w16sdtfl w16du wp14"/>
+<w:hdr xmlns:wpc="http://schemas.microsoft.com/office/word/2010/wordprocessingCanvas" xmlns:cx="http://schemas.microsoft.com/office/drawing/2014/chartex" xmlns:cx1="http://schemas.microsoft.com/office/drawing/2015/9/8/chartex" xmlns:cx2="http://schemas.microsoft.com/office/drawing/2015/10/21/chartex" xmlns:cx3="http://schemas.microsoft.com/office/drawing/2016/5/9/chartex" xmlns:cx4="http://schemas.microsoft.com/office/drawing/2016/5/10/chartex" xmlns:cx5="http://schemas.microsoft.com/office/drawing/2016/5/11/chartex" xmlns:cx6="http://schemas.microsoft.com/office/drawing/2016/5/12/chartex" xmlns:cx7="http://schemas.microsoft.com/office/drawing/2016/5/13/chartex" xmlns:cx8="http://schemas.microsoft.com/office/drawing/2016/5/14/chartex" xmlns:mc="http://schemas.openxmlformats.org/markup-compatibility/2006" xmlns:aink="http://schemas.microsoft.com/office/drawing/2016/ink" xmlns:am3d="http://schemas.microsoft.com/office/drawing/2017/model3d" xmlns:o="urn:schemas-microsoft-com:office:office" xmlns:oel="http://schemas.microsoft.com/office/2019/extlst" xmlns:r="http://schemas.openxmlformats.org/officeDocument/2006/relationships" xmlns:m="http://schemas.openxmlformats.org/officeDocument/2006/math" xmlns:v="urn:schemas-microsoft-com:vml" xmlns:wp14="http://schemas.microsoft.com/office/word/2010/wordprocessingDrawing" xmlns:wp="http://schemas.openxmlformats.org/drawingml/2006/wordprocessingDrawing" xmlns:w10="urn:schemas-microsoft-com:office:word" xmlns:w="http://schemas.openxmlformats.org/wordprocessingml/2006/main" xmlns:w14="http://schemas.microsoft.com/office/word/2010/wordml" xmlns:w15="http://schemas.microsoft.com/office/word/2012/wordml" xmlns:w16cei="http://schemas.microsoft.com/office/word/2026/wordml/cei" xmlns:w16cex="http://schemas.microsoft.com/office/word/2018/wordml/cex" xmlns:w16cid="http://schemas.microsoft.com/office/word/2016/wordml/cid" xmlns:w16="http://schemas.microsoft.com/office/word/2018/wordml" xmlns:w16du="http://schemas.microsoft.com/office/word/2023/wordml/word16du" xmlns:w16sdtdh="http://schemas.microsoft.com/office/word/2020/wordml/sdtdatahash" xmlns:w16sdtfl="http://schemas.microsoft.com/office/word/2024/wordml/sdtformatlock" xmlns:w16se="http://schemas.microsoft.com/office/word/2015/wordml/symex" xmlns:wpg="http://schemas.microsoft.com/office/word/2010/wordprocessingGroup" xmlns:wpi="http://schemas.microsoft.com/office/word/2010/wordprocessingInk" xmlns:wne="http://schemas.microsoft.com/office/word/2006/wordml" xmlns:wps="http://schemas.microsoft.com/office/word/2010/wordprocessingShape" mc:Ignorable="w14 w15 w16se w16cid w16 w16cex w16sdtdh w16sdtfl w16du wp14">
+  <w:p>
+    <w:r>
+      <w:cr/>
+    </w:r>
+  </w:p>
+</w:hdr>
 </file>
 
 <file path=word/numbering.xml><?xml version="1.0" encoding="utf-8"?>
@@ -7893,6 +7905,22 @@
     <w:name w:val="Image Caption"/>
     <w:basedOn w:val="Normal"/>
   </w:style>
+  <w:style w:type="paragraph" w:customStyle="1" w:styleId="FormSectionHeader">
+    <w:name w:val="Form Section Header"/>
+    <w:basedOn w:val="Heading1"/>
+    <w:next w:val="Normal"/>
+    <w:qFormat/>
+    <w:rsid w:val="00C413AE"/>
+    <w:pPr>
+      <w:pBdr>
+        <w:bottom w:val="single" w:sz="4" w:space="1" w:color="auto"/>
+      </w:pBdr>
+      <w:spacing w:before="120"/>
+    </w:pPr>
+    <w:rPr>
+      <w:sz w:val="32"/>
+    </w:rPr>
+  </w:style>
 </w:styles>
 </file>
 
@@ -8192,6 +8220,19 @@
 </file>
 
 <file path=customXml/item1.xml><?xml version="1.0" encoding="utf-8"?>
+<?mso-contentType ?>
+<FormTemplates xmlns="http://schemas.microsoft.com/sharepoint/v3/contenttype/forms">
+  <Display>DocumentLibraryForm</Display>
+  <Edit>DocumentLibraryForm</Edit>
+  <New>DocumentLibraryForm</New>
+</FormTemplates>
+</file>
+
+<file path=customXml/item2.xml><?xml version="1.0" encoding="utf-8"?>
+<b:Sources xmlns:b="http://schemas.openxmlformats.org/officeDocument/2006/bibliography" xmlns="http://schemas.openxmlformats.org/officeDocument/2006/bibliography" SelectedStyle="\APASixthEditionOfficeOnline.xsl" StyleName="APA" Version="6"/>
+</file>
+
+<file path=customXml/item3.xml><?xml version="1.0" encoding="utf-8"?>
 <ct:contentTypeSchema xmlns:ct="http://schemas.microsoft.com/office/2006/metadata/contentType" xmlns:ma="http://schemas.microsoft.com/office/2006/metadata/properties/metaAttributes" ct:_="" ma:_="" ma:contentTypeName="Document" ma:contentTypeID="0x01010097F8571949118944A44552DCE70F9EBD" ma:contentTypeVersion="14" ma:contentTypeDescription="Create a new document." ma:contentTypeScope="" ma:versionID="1baecbd0e49fa7b0dfe9f28182595f2e">
   <xsd:schema xmlns:xsd="http://www.w3.org/2001/XMLSchema" xmlns:xs="http://www.w3.org/2001/XMLSchema" xmlns:p="http://schemas.microsoft.com/office/2006/metadata/properties" xmlns:ns2="ff91e89a-fa89-409e-b2c2-0afa0b8362dc" xmlns:ns3="14fbb133-db97-4d09-8590-d31f72208e11" targetNamespace="http://schemas.microsoft.com/office/2006/metadata/properties" ma:root="true" ma:fieldsID="75805e7a8f6b447aa2bdfad3b9e935b1" ns2:_="" ns3:_="">
     <xsd:import namespace="ff91e89a-fa89-409e-b2c2-0afa0b8362dc"/>
@@ -8398,19 +8439,6 @@
 </ct:contentTypeSchema>
 </file>
 
-<file path=customXml/item2.xml><?xml version="1.0" encoding="utf-8"?>
-<b:Sources xmlns:b="http://schemas.openxmlformats.org/officeDocument/2006/bibliography" xmlns="http://schemas.openxmlformats.org/officeDocument/2006/bibliography" SelectedStyle="\APASixthEditionOfficeOnline.xsl" StyleName="APA" Version="6"/>
-</file>
-
-<file path=customXml/item3.xml><?xml version="1.0" encoding="utf-8"?>
-<?mso-contentType ?>
-<FormTemplates xmlns="http://schemas.microsoft.com/sharepoint/v3/contenttype/forms">
-  <Display>DocumentLibraryForm</Display>
-  <Edit>DocumentLibraryForm</Edit>
-  <New>DocumentLibraryForm</New>
-</FormTemplates>
-</file>
-
 <file path=customXml/item4.xml><?xml version="1.0" encoding="utf-8"?>
 <p:properties xmlns:p="http://schemas.microsoft.com/office/2006/metadata/properties" xmlns:xsi="http://www.w3.org/2001/XMLSchema-instance" xmlns:pc="http://schemas.microsoft.com/office/infopath/2007/PartnerControls">
   <documentManagement>
@@ -8424,6 +8452,22 @@
 </file>
 
 <file path=customXml/itemProps1.xml><?xml version="1.0" encoding="utf-8"?>
+<ds:datastoreItem xmlns:ds="http://schemas.openxmlformats.org/officeDocument/2006/customXml" ds:itemID="{F43CE1E5-002C-49C3-ABAF-F4181BBA83E9}">
+  <ds:schemaRefs>
+    <ds:schemaRef ds:uri="http://schemas.microsoft.com/sharepoint/v3/contenttype/forms"/>
+  </ds:schemaRefs>
+</ds:datastoreItem>
+</file>
+
+<file path=customXml/itemProps2.xml><?xml version="1.0" encoding="utf-8"?>
+<ds:datastoreItem xmlns:ds="http://schemas.openxmlformats.org/officeDocument/2006/customXml" ds:itemID="{79F96F0D-53C7-457F-BF3B-DB3D5A728589}">
+  <ds:schemaRefs>
+    <ds:schemaRef ds:uri="http://schemas.openxmlformats.org/officeDocument/2006/bibliography"/>
+  </ds:schemaRefs>
+</ds:datastoreItem>
+</file>
+
+<file path=customXml/itemProps3.xml><?xml version="1.0" encoding="utf-8"?>
 <ds:datastoreItem xmlns:ds="http://schemas.openxmlformats.org/officeDocument/2006/customXml" ds:itemID="{3E5D323C-384B-42D5-B47B-6F44F9FD8BE0}">
   <ds:schemaRefs>
     <ds:schemaRef ds:uri="http://schemas.microsoft.com/office/2006/metadata/contentType"/>
@@ -8442,22 +8486,6 @@
 </ds:datastoreItem>
 </file>
 
-<file path=customXml/itemProps2.xml><?xml version="1.0" encoding="utf-8"?>
-<ds:datastoreItem xmlns:ds="http://schemas.openxmlformats.org/officeDocument/2006/customXml" ds:itemID="{79F96F0D-53C7-457F-BF3B-DB3D5A728589}">
-  <ds:schemaRefs>
-    <ds:schemaRef ds:uri="http://schemas.openxmlformats.org/officeDocument/2006/bibliography"/>
-  </ds:schemaRefs>
-</ds:datastoreItem>
-</file>
-
-<file path=customXml/itemProps3.xml><?xml version="1.0" encoding="utf-8"?>
-<ds:datastoreItem xmlns:ds="http://schemas.openxmlformats.org/officeDocument/2006/customXml" ds:itemID="{F43CE1E5-002C-49C3-ABAF-F4181BBA83E9}">
-  <ds:schemaRefs>
-    <ds:schemaRef ds:uri="http://schemas.microsoft.com/sharepoint/v3/contenttype/forms"/>
-  </ds:schemaRefs>
-</ds:datastoreItem>
-</file>
-
 <file path=customXml/itemProps4.xml><?xml version="1.0" encoding="utf-8"?>
 <ds:datastoreItem xmlns:ds="http://schemas.openxmlformats.org/officeDocument/2006/customXml" ds:itemID="{D1B430AD-7F5E-4A6C-AC1E-18B5A5C8823C}">
   <ds:schemaRefs>

</xml_diff>

<commit_message>
chore: reduce TEMPLATE_Word_Base.docx page margins
Top margin 1.4in -> 1.0in, left/right margins 1.0in -> 0.75in (bottom
and header/footer distance unchanged), giving forms more usable page
width and height for FieldGrid/FillLine content.
</commit_message>
<xml_diff>
--- a/templates/TEMPLATE_Word_Base.docx
+++ b/templates/TEMPLATE_Word_Base.docx
@@ -15,7 +15,7 @@
       <w:headerReference w:type="default" r:id="rId11"/>
       <w:footerReference w:type="default" r:id="rId12"/>
       <w:pgSz w:w="11906" w:h="16838"/>
-      <w:pgMar w:top="2016" w:right="1440" w:bottom="1440" w:left="1440" w:header="708" w:footer="708" w:gutter="0"/>
+      <w:pgMar w:top="1440" w:right="1080" w:bottom="1440" w:left="1080" w:header="706" w:footer="706" w:gutter="0"/>
       <w:cols w:space="708"/>
       <w:docGrid w:linePitch="360"/>
     </w:sectPr>
@@ -7910,12 +7910,12 @@
     <w:basedOn w:val="Heading1"/>
     <w:next w:val="Normal"/>
     <w:qFormat/>
-    <w:rsid w:val="00C413AE"/>
+    <w:rsid w:val="00CA0052"/>
     <w:pPr>
       <w:pBdr>
         <w:bottom w:val="single" w:sz="4" w:space="1" w:color="auto"/>
       </w:pBdr>
-      <w:spacing w:before="120"/>
+      <w:spacing w:before="200" w:after="360"/>
     </w:pPr>
     <w:rPr>
       <w:sz w:val="32"/>
@@ -8220,6 +8220,10 @@
 </file>
 
 <file path=customXml/item1.xml><?xml version="1.0" encoding="utf-8"?>
+<b:Sources xmlns:b="http://schemas.openxmlformats.org/officeDocument/2006/bibliography" xmlns="http://schemas.openxmlformats.org/officeDocument/2006/bibliography" SelectedStyle="\APASixthEditionOfficeOnline.xsl" StyleName="APA" Version="6"/>
+</file>
+
+<file path=customXml/item2.xml><?xml version="1.0" encoding="utf-8"?>
 <?mso-contentType ?>
 <FormTemplates xmlns="http://schemas.microsoft.com/sharepoint/v3/contenttype/forms">
   <Display>DocumentLibraryForm</Display>
@@ -8228,11 +8232,19 @@
 </FormTemplates>
 </file>
 
-<file path=customXml/item2.xml><?xml version="1.0" encoding="utf-8"?>
-<b:Sources xmlns:b="http://schemas.openxmlformats.org/officeDocument/2006/bibliography" xmlns="http://schemas.openxmlformats.org/officeDocument/2006/bibliography" SelectedStyle="\APASixthEditionOfficeOnline.xsl" StyleName="APA" Version="6"/>
+<file path=customXml/item3.xml><?xml version="1.0" encoding="utf-8"?>
+<p:properties xmlns:p="http://schemas.microsoft.com/office/2006/metadata/properties" xmlns:xsi="http://www.w3.org/2001/XMLSchema-instance" xmlns:pc="http://schemas.microsoft.com/office/infopath/2007/PartnerControls">
+  <documentManagement>
+    <TaxCatchAll xmlns="14fbb133-db97-4d09-8590-d31f72208e11" xsi:nil="true"/>
+    <lcf76f155ced4ddcb4097134ff3c332f xmlns="ff91e89a-fa89-409e-b2c2-0afa0b8362dc">
+      <Terms xmlns="http://schemas.microsoft.com/office/infopath/2007/PartnerControls"/>
+    </lcf76f155ced4ddcb4097134ff3c332f>
+    <Index xmlns="ff91e89a-fa89-409e-b2c2-0afa0b8362dc" xsi:nil="true"/>
+  </documentManagement>
+</p:properties>
 </file>
 
-<file path=customXml/item3.xml><?xml version="1.0" encoding="utf-8"?>
+<file path=customXml/item4.xml><?xml version="1.0" encoding="utf-8"?>
 <ct:contentTypeSchema xmlns:ct="http://schemas.microsoft.com/office/2006/metadata/contentType" xmlns:ma="http://schemas.microsoft.com/office/2006/metadata/properties/metaAttributes" ct:_="" ma:_="" ma:contentTypeName="Document" ma:contentTypeID="0x01010097F8571949118944A44552DCE70F9EBD" ma:contentTypeVersion="14" ma:contentTypeDescription="Create a new document." ma:contentTypeScope="" ma:versionID="1baecbd0e49fa7b0dfe9f28182595f2e">
   <xsd:schema xmlns:xsd="http://www.w3.org/2001/XMLSchema" xmlns:xs="http://www.w3.org/2001/XMLSchema" xmlns:p="http://schemas.microsoft.com/office/2006/metadata/properties" xmlns:ns2="ff91e89a-fa89-409e-b2c2-0afa0b8362dc" xmlns:ns3="14fbb133-db97-4d09-8590-d31f72208e11" targetNamespace="http://schemas.microsoft.com/office/2006/metadata/properties" ma:root="true" ma:fieldsID="75805e7a8f6b447aa2bdfad3b9e935b1" ns2:_="" ns3:_="">
     <xsd:import namespace="ff91e89a-fa89-409e-b2c2-0afa0b8362dc"/>
@@ -8439,19 +8451,15 @@
 </ct:contentTypeSchema>
 </file>
 
-<file path=customXml/item4.xml><?xml version="1.0" encoding="utf-8"?>
-<p:properties xmlns:p="http://schemas.microsoft.com/office/2006/metadata/properties" xmlns:xsi="http://www.w3.org/2001/XMLSchema-instance" xmlns:pc="http://schemas.microsoft.com/office/infopath/2007/PartnerControls">
-  <documentManagement>
-    <TaxCatchAll xmlns="14fbb133-db97-4d09-8590-d31f72208e11" xsi:nil="true"/>
-    <lcf76f155ced4ddcb4097134ff3c332f xmlns="ff91e89a-fa89-409e-b2c2-0afa0b8362dc">
-      <Terms xmlns="http://schemas.microsoft.com/office/infopath/2007/PartnerControls"/>
-    </lcf76f155ced4ddcb4097134ff3c332f>
-    <Index xmlns="ff91e89a-fa89-409e-b2c2-0afa0b8362dc" xsi:nil="true"/>
-  </documentManagement>
-</p:properties>
+<file path=customXml/itemProps1.xml><?xml version="1.0" encoding="utf-8"?>
+<ds:datastoreItem xmlns:ds="http://schemas.openxmlformats.org/officeDocument/2006/customXml" ds:itemID="{79F96F0D-53C7-457F-BF3B-DB3D5A728589}">
+  <ds:schemaRefs>
+    <ds:schemaRef ds:uri="http://schemas.openxmlformats.org/officeDocument/2006/bibliography"/>
+  </ds:schemaRefs>
+</ds:datastoreItem>
 </file>
 
-<file path=customXml/itemProps1.xml><?xml version="1.0" encoding="utf-8"?>
+<file path=customXml/itemProps2.xml><?xml version="1.0" encoding="utf-8"?>
 <ds:datastoreItem xmlns:ds="http://schemas.openxmlformats.org/officeDocument/2006/customXml" ds:itemID="{F43CE1E5-002C-49C3-ABAF-F4181BBA83E9}">
   <ds:schemaRefs>
     <ds:schemaRef ds:uri="http://schemas.microsoft.com/sharepoint/v3/contenttype/forms"/>
@@ -8459,15 +8467,18 @@
 </ds:datastoreItem>
 </file>
 
-<file path=customXml/itemProps2.xml><?xml version="1.0" encoding="utf-8"?>
-<ds:datastoreItem xmlns:ds="http://schemas.openxmlformats.org/officeDocument/2006/customXml" ds:itemID="{79F96F0D-53C7-457F-BF3B-DB3D5A728589}">
+<file path=customXml/itemProps3.xml><?xml version="1.0" encoding="utf-8"?>
+<ds:datastoreItem xmlns:ds="http://schemas.openxmlformats.org/officeDocument/2006/customXml" ds:itemID="{D1B430AD-7F5E-4A6C-AC1E-18B5A5C8823C}">
   <ds:schemaRefs>
-    <ds:schemaRef ds:uri="http://schemas.openxmlformats.org/officeDocument/2006/bibliography"/>
+    <ds:schemaRef ds:uri="http://schemas.microsoft.com/office/2006/metadata/properties"/>
+    <ds:schemaRef ds:uri="http://schemas.microsoft.com/office/infopath/2007/PartnerControls"/>
+    <ds:schemaRef ds:uri="14fbb133-db97-4d09-8590-d31f72208e11"/>
+    <ds:schemaRef ds:uri="ff91e89a-fa89-409e-b2c2-0afa0b8362dc"/>
   </ds:schemaRefs>
 </ds:datastoreItem>
 </file>
 
-<file path=customXml/itemProps3.xml><?xml version="1.0" encoding="utf-8"?>
+<file path=customXml/itemProps4.xml><?xml version="1.0" encoding="utf-8"?>
 <ds:datastoreItem xmlns:ds="http://schemas.openxmlformats.org/officeDocument/2006/customXml" ds:itemID="{3E5D323C-384B-42D5-B47B-6F44F9FD8BE0}">
   <ds:schemaRefs>
     <ds:schemaRef ds:uri="http://schemas.microsoft.com/office/2006/metadata/contentType"/>
@@ -8484,15 +8495,4 @@
     <ds:schemaRef ds:uri="http://schemas.microsoft.com/internal/obd"/>
   </ds:schemaRefs>
 </ds:datastoreItem>
-</file>
-
-<file path=customXml/itemProps4.xml><?xml version="1.0" encoding="utf-8"?>
-<ds:datastoreItem xmlns:ds="http://schemas.openxmlformats.org/officeDocument/2006/customXml" ds:itemID="{D1B430AD-7F5E-4A6C-AC1E-18B5A5C8823C}">
-  <ds:schemaRefs>
-    <ds:schemaRef ds:uri="http://schemas.microsoft.com/office/2006/metadata/properties"/>
-    <ds:schemaRef ds:uri="http://schemas.microsoft.com/office/infopath/2007/PartnerControls"/>
-    <ds:schemaRef ds:uri="14fbb133-db97-4d09-8590-d31f72208e11"/>
-    <ds:schemaRef ds:uri="ff91e89a-fa89-409e-b2c2-0afa0b8362dc"/>
-  </ds:schemaRefs>
-</ds:datastoreItem>
 </file>
</xml_diff>

<commit_message>
fix: preserve schema order in header/footer tblPr, use named styles for footer/FieldGrid text
Raw tbl_pr.append() put w:tblBorders/w:tblCellMar after w:tblLayout and
w:tblLook, an invalid CT_TblPrBase order that Word silently drops -
the footer's top/bottom rule lines vanished on recompile. Insert them
at their schema-mandated position instead via a new
_insert_tbl_pr_child() helper.

Also apply the base template's 'Footer' style to footer table text
(instead of manually zeroing paragraph spacing) and 'Compact' to
FieldGrid cell text, so both defer to the template's own style
definitions rather than hardcoded Python formatting.

Co-Authored-By: Claude Sonnet 5 <noreply@anthropic.com>
</commit_message>
<xml_diff>
--- a/templates/TEMPLATE_Word_Base.docx
+++ b/templates/TEMPLATE_Word_Base.docx
@@ -20,7 +20,7 @@
       <w:headerReference w:type="first" r:id="rId15"/>
       <w:footerReference w:type="first" r:id="rId16"/>
       <w:pgSz w:w="11906" w:h="16838"/>
-      <w:pgMar w:top="2160" w:right="1080" w:bottom="1440" w:left="1080" w:header="720" w:footer="720" w:gutter="0"/>
+      <w:pgMar w:top="2160" w:right="1080" w:bottom="1800" w:left="1080" w:header="576" w:footer="576" w:gutter="0"/>
       <w:cols w:space="708"/>
       <w:docGrid w:linePitch="360"/>
     </w:sectPr>
@@ -4761,7 +4761,7 @@
   <w:abstractNum w:abstractNumId="50" w15:restartNumberingAfterBreak="0">
     <w:nsid w:val="5D1249F2"/>
     <w:multiLevelType w:val="multilevel"/>
-    <w:tmpl w:val="C5469D78"/>
+    <w:tmpl w:val="28767950"/>
     <w:lvl w:ilvl="0">
       <w:start w:val="1"/>
       <w:numFmt w:val="decimal"/>
@@ -6997,7 +6997,7 @@
   <w:style w:type="paragraph" w:default="1" w:styleId="Normal">
     <w:name w:val="Normal"/>
     <w:qFormat/>
-    <w:rsid w:val="00EE743F"/>
+    <w:rsid w:val="005A7702"/>
     <w:pPr>
       <w:overflowPunct w:val="0"/>
       <w:autoSpaceDE w:val="0"/>
@@ -7007,7 +7007,7 @@
       <w:textAlignment w:val="baseline"/>
     </w:pPr>
     <w:rPr>
-      <w:rFonts w:ascii="Times New Roman" w:eastAsia="Times New Roman" w:hAnsi="Times New Roman" w:cs="Times New Roman"/>
+      <w:rFonts w:ascii="Calibri" w:eastAsia="Times New Roman" w:hAnsi="Calibri" w:cs="Times New Roman"/>
       <w:kern w:val="0"/>
       <w:sz w:val="24"/>
       <w:szCs w:val="20"/>
@@ -7041,7 +7041,7 @@
     <w:next w:val="Normal"/>
     <w:link w:val="Heading2Char"/>
     <w:qFormat/>
-    <w:rsid w:val="00F80F50"/>
+    <w:rsid w:val="005A7702"/>
     <w:pPr>
       <w:keepNext/>
       <w:pageBreakBefore/>
@@ -7052,7 +7052,7 @@
       <w:outlineLvl w:val="1"/>
     </w:pPr>
     <w:rPr>
-      <w:rFonts w:asciiTheme="majorBidi" w:hAnsiTheme="majorBidi" w:cstheme="majorBidi"/>
+      <w:rFonts w:cstheme="majorBidi"/>
       <w:caps/>
       <w:sz w:val="40"/>
       <w:szCs w:val="24"/>
@@ -7252,9 +7252,9 @@
     <w:name w:val="Heading 2 Char"/>
     <w:basedOn w:val="DefaultParagraphFont"/>
     <w:link w:val="Heading2"/>
-    <w:rsid w:val="00F80F50"/>
+    <w:rsid w:val="005A7702"/>
     <w:rPr>
-      <w:rFonts w:asciiTheme="majorBidi" w:eastAsia="Times New Roman" w:hAnsiTheme="majorBidi" w:cstheme="majorBidi"/>
+      <w:rFonts w:ascii="Calibri" w:eastAsia="Times New Roman" w:hAnsi="Calibri" w:cstheme="majorBidi"/>
       <w:caps/>
       <w:kern w:val="0"/>
       <w:sz w:val="40"/>
@@ -7621,7 +7621,7 @@
     <w:name w:val="No Spacing"/>
     <w:uiPriority w:val="1"/>
     <w:qFormat/>
-    <w:rsid w:val="00602229"/>
+    <w:rsid w:val="005A7702"/>
     <w:pPr>
       <w:overflowPunct w:val="0"/>
       <w:autoSpaceDE w:val="0"/>
@@ -7631,7 +7631,7 @@
       <w:textAlignment w:val="baseline"/>
     </w:pPr>
     <w:rPr>
-      <w:rFonts w:ascii="Times New Roman" w:eastAsia="Times New Roman" w:hAnsi="Times New Roman" w:cs="Times New Roman"/>
+      <w:rFonts w:ascii="Calibri" w:eastAsia="Times New Roman" w:hAnsi="Calibri" w:cs="Times New Roman"/>
       <w:kern w:val="0"/>
       <w:sz w:val="24"/>
       <w:szCs w:val="20"/>
@@ -7964,7 +7964,10 @@
     <w:link w:val="FootnoteTextChar"/>
     <w:uiPriority w:val="99"/>
     <w:unhideWhenUsed/>
-    <w:rsid w:val="009D3265"/>
+    <w:rsid w:val="000C7AF5"/>
+    <w:pPr>
+      <w:spacing w:before="0" w:after="0"/>
+    </w:pPr>
     <w:rPr>
       <w:sz w:val="20"/>
     </w:rPr>
@@ -7974,9 +7977,9 @@
     <w:basedOn w:val="DefaultParagraphFont"/>
     <w:link w:val="FootnoteText"/>
     <w:uiPriority w:val="99"/>
-    <w:rsid w:val="009D3265"/>
+    <w:rsid w:val="000C7AF5"/>
     <w:rPr>
-      <w:rFonts w:ascii="Times New Roman" w:eastAsia="Times New Roman" w:hAnsi="Times New Roman" w:cs="Times New Roman"/>
+      <w:rFonts w:ascii="Calibri" w:eastAsia="Times New Roman" w:hAnsi="Calibri" w:cs="Times New Roman"/>
       <w:kern w:val="0"/>
       <w:sz w:val="20"/>
       <w:szCs w:val="20"/>
@@ -8092,6 +8095,17 @@
       <w:numPr>
         <w:numId w:val="67"/>
       </w:numPr>
+    </w:pPr>
+  </w:style>
+  <w:style w:type="paragraph" w:customStyle="1" w:styleId="Compact">
+    <w:name w:val="Compact"/>
+    <w:basedOn w:val="Normal"/>
+    <w:next w:val="Normal"/>
+    <w:qFormat/>
+    <w:rsid w:val="00893401"/>
+    <w:pPr>
+      <w:spacing w:before="0" w:after="0"/>
+      <w:ind w:left="360" w:hanging="360"/>
     </w:pPr>
   </w:style>
 </w:styles>
@@ -8393,6 +8407,19 @@
 </file>
 
 <file path=customXml/item1.xml><?xml version="1.0" encoding="utf-8"?>
+<?mso-contentType ?>
+<FormTemplates xmlns="http://schemas.microsoft.com/sharepoint/v3/contenttype/forms">
+  <Display>DocumentLibraryForm</Display>
+  <Edit>DocumentLibraryForm</Edit>
+  <New>DocumentLibraryForm</New>
+</FormTemplates>
+</file>
+
+<file path=customXml/item2.xml><?xml version="1.0" encoding="utf-8"?>
+<b:Sources xmlns:b="http://schemas.openxmlformats.org/officeDocument/2006/bibliography" xmlns="http://schemas.openxmlformats.org/officeDocument/2006/bibliography" SelectedStyle="\APASixthEditionOfficeOnline.xsl" StyleName="APA" Version="6"/>
+</file>
+
+<file path=customXml/item3.xml><?xml version="1.0" encoding="utf-8"?>
 <ct:contentTypeSchema xmlns:ct="http://schemas.microsoft.com/office/2006/metadata/contentType" xmlns:ma="http://schemas.microsoft.com/office/2006/metadata/properties/metaAttributes" ct:_="" ma:_="" ma:contentTypeName="Document" ma:contentTypeID="0x01010097F8571949118944A44552DCE70F9EBD" ma:contentTypeVersion="14" ma:contentTypeDescription="Create a new document." ma:contentTypeScope="" ma:versionID="1baecbd0e49fa7b0dfe9f28182595f2e">
   <xsd:schema xmlns:xsd="http://www.w3.org/2001/XMLSchema" xmlns:xs="http://www.w3.org/2001/XMLSchema" xmlns:p="http://schemas.microsoft.com/office/2006/metadata/properties" xmlns:ns2="ff91e89a-fa89-409e-b2c2-0afa0b8362dc" xmlns:ns3="14fbb133-db97-4d09-8590-d31f72208e11" targetNamespace="http://schemas.microsoft.com/office/2006/metadata/properties" ma:root="true" ma:fieldsID="75805e7a8f6b447aa2bdfad3b9e935b1" ns2:_="" ns3:_="">
     <xsd:import namespace="ff91e89a-fa89-409e-b2c2-0afa0b8362dc"/>
@@ -8599,7 +8626,7 @@
 </ct:contentTypeSchema>
 </file>
 
-<file path=customXml/item2.xml><?xml version="1.0" encoding="utf-8"?>
+<file path=customXml/item4.xml><?xml version="1.0" encoding="utf-8"?>
 <p:properties xmlns:p="http://schemas.microsoft.com/office/2006/metadata/properties" xmlns:xsi="http://www.w3.org/2001/XMLSchema-instance" xmlns:pc="http://schemas.microsoft.com/office/infopath/2007/PartnerControls">
   <documentManagement>
     <TaxCatchAll xmlns="14fbb133-db97-4d09-8590-d31f72208e11" xsi:nil="true"/>
@@ -8611,20 +8638,23 @@
 </p:properties>
 </file>
 
-<file path=customXml/item3.xml><?xml version="1.0" encoding="utf-8"?>
-<?mso-contentType ?>
-<FormTemplates xmlns="http://schemas.microsoft.com/sharepoint/v3/contenttype/forms">
-  <Display>DocumentLibraryForm</Display>
-  <Edit>DocumentLibraryForm</Edit>
-  <New>DocumentLibraryForm</New>
-</FormTemplates>
+<file path=customXml/itemProps1.xml><?xml version="1.0" encoding="utf-8"?>
+<ds:datastoreItem xmlns:ds="http://schemas.openxmlformats.org/officeDocument/2006/customXml" ds:itemID="{F43CE1E5-002C-49C3-ABAF-F4181BBA83E9}">
+  <ds:schemaRefs>
+    <ds:schemaRef ds:uri="http://schemas.microsoft.com/sharepoint/v3/contenttype/forms"/>
+  </ds:schemaRefs>
+</ds:datastoreItem>
 </file>
 
-<file path=customXml/item4.xml><?xml version="1.0" encoding="utf-8"?>
-<b:Sources xmlns:b="http://schemas.openxmlformats.org/officeDocument/2006/bibliography" xmlns="http://schemas.openxmlformats.org/officeDocument/2006/bibliography" SelectedStyle="\APASixthEditionOfficeOnline.xsl" StyleName="APA" Version="6"/>
+<file path=customXml/itemProps2.xml><?xml version="1.0" encoding="utf-8"?>
+<ds:datastoreItem xmlns:ds="http://schemas.openxmlformats.org/officeDocument/2006/customXml" ds:itemID="{79F96F0D-53C7-457F-BF3B-DB3D5A728589}">
+  <ds:schemaRefs>
+    <ds:schemaRef ds:uri="http://schemas.openxmlformats.org/officeDocument/2006/bibliography"/>
+  </ds:schemaRefs>
+</ds:datastoreItem>
 </file>
 
-<file path=customXml/itemProps1.xml><?xml version="1.0" encoding="utf-8"?>
+<file path=customXml/itemProps3.xml><?xml version="1.0" encoding="utf-8"?>
 <ds:datastoreItem xmlns:ds="http://schemas.openxmlformats.org/officeDocument/2006/customXml" ds:itemID="{3E5D323C-384B-42D5-B47B-6F44F9FD8BE0}">
   <ds:schemaRefs>
     <ds:schemaRef ds:uri="http://schemas.microsoft.com/office/2006/metadata/contentType"/>
@@ -8643,7 +8673,7 @@
 </ds:datastoreItem>
 </file>
 
-<file path=customXml/itemProps2.xml><?xml version="1.0" encoding="utf-8"?>
+<file path=customXml/itemProps4.xml><?xml version="1.0" encoding="utf-8"?>
 <ds:datastoreItem xmlns:ds="http://schemas.openxmlformats.org/officeDocument/2006/customXml" ds:itemID="{D1B430AD-7F5E-4A6C-AC1E-18B5A5C8823C}">
   <ds:schemaRefs>
     <ds:schemaRef ds:uri="http://schemas.microsoft.com/office/2006/metadata/properties"/>
@@ -8652,20 +8682,4 @@
     <ds:schemaRef ds:uri="ff91e89a-fa89-409e-b2c2-0afa0b8362dc"/>
   </ds:schemaRefs>
 </ds:datastoreItem>
-</file>
-
-<file path=customXml/itemProps3.xml><?xml version="1.0" encoding="utf-8"?>
-<ds:datastoreItem xmlns:ds="http://schemas.openxmlformats.org/officeDocument/2006/customXml" ds:itemID="{F43CE1E5-002C-49C3-ABAF-F4181BBA83E9}">
-  <ds:schemaRefs>
-    <ds:schemaRef ds:uri="http://schemas.microsoft.com/sharepoint/v3/contenttype/forms"/>
-  </ds:schemaRefs>
-</ds:datastoreItem>
-</file>
-
-<file path=customXml/itemProps4.xml><?xml version="1.0" encoding="utf-8"?>
-<ds:datastoreItem xmlns:ds="http://schemas.openxmlformats.org/officeDocument/2006/customXml" ds:itemID="{79F96F0D-53C7-457F-BF3B-DB3D5A728589}">
-  <ds:schemaRefs>
-    <ds:schemaRef ds:uri="http://schemas.openxmlformats.org/officeDocument/2006/bibliography"/>
-  </ds:schemaRefs>
-</ds:datastoreItem>
 </file>
</xml_diff>

<commit_message>
style: apply Header Text/Footer Text paragraph styles to header/footer table text
Adds a 'Footer Text' custom paragraph style (based on Normal, 0pt
spacing, 9pt) to the base template, replacing the manual per-run font
size that previously left the built-in 'Footer' style's inherited
6pt Normal spacing padding the table out. Applies the user-authored
'Header Text' style to every text-bearing paragraph in the header
table (logo cell is left alone - it has no text).

Co-Authored-By: Claude Sonnet 5 <noreply@anthropic.com>
</commit_message>
<xml_diff>
--- a/templates/TEMPLATE_Word_Base.docx
+++ b/templates/TEMPLATE_Word_Base.docx
@@ -4,7 +4,7 @@
   <w:body>
     <w:p>
       <w:pPr>
-        <w:pStyle w:val="DilonStepList"/>
+        <w:pStyle w:val="HeaderText"/>
         <w:rPr>
           <w:rStyle w:val="Emphasis"/>
           <w:i w:val="0"/>
@@ -20,7 +20,7 @@
       <w:headerReference w:type="first" r:id="rId15"/>
       <w:footerReference w:type="first" r:id="rId16"/>
       <w:pgSz w:w="11906" w:h="16838"/>
-      <w:pgMar w:top="2160" w:right="1080" w:bottom="1800" w:left="1080" w:header="576" w:footer="576" w:gutter="0"/>
+      <w:pgMar w:top="2016" w:right="1080" w:bottom="1800" w:left="1080" w:header="576" w:footer="576" w:gutter="0"/>
       <w:cols w:space="708"/>
       <w:docGrid w:linePitch="360"/>
     </w:sectPr>
@@ -4761,7 +4761,7 @@
   <w:abstractNum w:abstractNumId="50" w15:restartNumberingAfterBreak="0">
     <w:nsid w:val="5D1249F2"/>
     <w:multiLevelType w:val="multilevel"/>
-    <w:tmpl w:val="28767950"/>
+    <w:tmpl w:val="B7DCE9BC"/>
     <w:lvl w:ilvl="0">
       <w:start w:val="1"/>
       <w:numFmt w:val="decimal"/>
@@ -8075,12 +8075,12 @@
     <w:basedOn w:val="Heading1"/>
     <w:next w:val="Normal"/>
     <w:qFormat/>
-    <w:rsid w:val="006134D8"/>
+    <w:rsid w:val="00CE3860"/>
     <w:pPr>
       <w:pBdr>
         <w:bottom w:val="single" w:sz="4" w:space="1" w:color="auto"/>
       </w:pBdr>
-      <w:spacing w:before="200" w:after="200"/>
+      <w:spacing w:before="80" w:after="160"/>
     </w:pPr>
     <w:rPr>
       <w:sz w:val="32"/>
@@ -8102,10 +8102,33 @@
     <w:basedOn w:val="Normal"/>
     <w:next w:val="Normal"/>
     <w:qFormat/>
-    <w:rsid w:val="00893401"/>
+    <w:rsid w:val="006345A2"/>
+    <w:pPr>
+      <w:spacing w:before="0" w:after="40"/>
+      <w:ind w:left="360" w:hanging="360"/>
+    </w:pPr>
+  </w:style>
+  <w:style w:type="paragraph" w:customStyle="1" w:styleId="FooterText">
+    <w:name w:val="Footer Text"/>
+    <w:basedOn w:val="Normal"/>
+    <w:next w:val="Normal"/>
     <w:pPr>
       <w:spacing w:before="0" w:after="0"/>
-      <w:ind w:left="360" w:hanging="360"/>
+    </w:pPr>
+    <w:rPr>
+      <w:sz w:val="18"/>
+    </w:rPr>
+  </w:style>
+  <w:style w:type="paragraph" w:customStyle="1" w:styleId="HeaderText">
+    <w:name w:val="Header Text"/>
+    <w:basedOn w:val="Normal"/>
+    <w:qFormat/>
+    <w:rsid w:val="007D4727"/>
+    <w:pPr>
+      <w:numPr>
+        <w:numId w:val="67"/>
+      </w:numPr>
+      <w:spacing w:before="40" w:after="40"/>
     </w:pPr>
   </w:style>
 </w:styles>

</xml_diff>

<commit_message>
fix: stop forcing a page break before every Heading 2
Per document-formatting review feedback. Authors now insert page
breaks manually with the already-documented `---` horizontal-rule
convention.
</commit_message>
<xml_diff>
--- a/templates/TEMPLATE_Word_Base.docx
+++ b/templates/TEMPLATE_Word_Base.docx
@@ -1,10 +1,10 @@
 
 <file path=word/document.xml><?xml version="1.0" encoding="utf-8"?>
-<w:document xmlns:wpc="http://schemas.microsoft.com/office/word/2010/wordprocessingCanvas" xmlns:cx="http://schemas.microsoft.com/office/drawing/2014/chartex" xmlns:cx1="http://schemas.microsoft.com/office/drawing/2015/9/8/chartex" xmlns:cx2="http://schemas.microsoft.com/office/drawing/2015/10/21/chartex" xmlns:cx3="http://schemas.microsoft.com/office/drawing/2016/5/9/chartex" xmlns:cx4="http://schemas.microsoft.com/office/drawing/2016/5/10/chartex" xmlns:cx5="http://schemas.microsoft.com/office/drawing/2016/5/11/chartex" xmlns:cx6="http://schemas.microsoft.com/office/drawing/2016/5/12/chartex" xmlns:cx7="http://schemas.microsoft.com/office/drawing/2016/5/13/chartex" xmlns:cx8="http://schemas.microsoft.com/office/drawing/2016/5/14/chartex" xmlns:mc="http://schemas.openxmlformats.org/markup-compatibility/2006" xmlns:aink="http://schemas.microsoft.com/office/drawing/2016/ink" xmlns:am3d="http://schemas.microsoft.com/office/drawing/2017/model3d" xmlns:o="urn:schemas-microsoft-com:office:office" xmlns:oel="http://schemas.microsoft.com/office/2019/extlst" xmlns:r="http://schemas.openxmlformats.org/officeDocument/2006/relationships" xmlns:m="http://schemas.openxmlformats.org/officeDocument/2006/math" xmlns:v="urn:schemas-microsoft-com:vml" xmlns:wp14="http://schemas.microsoft.com/office/word/2010/wordprocessingDrawing" xmlns:wp="http://schemas.openxmlformats.org/drawingml/2006/wordprocessingDrawing" xmlns:w10="urn:schemas-microsoft-com:office:word" xmlns:w="http://schemas.openxmlformats.org/wordprocessingml/2006/main" xmlns:w14="http://schemas.microsoft.com/office/word/2010/wordml" xmlns:w15="http://schemas.microsoft.com/office/word/2012/wordml" xmlns:w16cei="http://schemas.microsoft.com/office/word/2026/wordml/cei" xmlns:w16cex="http://schemas.microsoft.com/office/word/2018/wordml/cex" xmlns:w16cid="http://schemas.microsoft.com/office/word/2016/wordml/cid" xmlns:w16="http://schemas.microsoft.com/office/word/2018/wordml" xmlns:w16du="http://schemas.microsoft.com/office/word/2023/wordml/word16du" xmlns:w16sdtdh="http://schemas.microsoft.com/office/word/2020/wordml/sdtdatahash" xmlns:w16sdtfl="http://schemas.microsoft.com/office/word/2024/wordml/sdtformatlock" xmlns:w16se="http://schemas.microsoft.com/office/word/2015/wordml/symex" xmlns:wpg="http://schemas.microsoft.com/office/word/2010/wordprocessingGroup" xmlns:wpi="http://schemas.microsoft.com/office/word/2010/wordprocessingInk" xmlns:wne="http://schemas.microsoft.com/office/word/2006/wordml" xmlns:wps="http://schemas.microsoft.com/office/word/2010/wordprocessingShape" mc:Ignorable="w14 w15 w16se w16cid w16 w16cex w16sdtdh w16sdtfl w16du wp14">
+<w:document xmlns:wpc="http://schemas.microsoft.com/office/word/2010/wordprocessingCanvas" xmlns:cx="http://schemas.microsoft.com/office/drawing/2014/chartex" xmlns:cx1="http://schemas.microsoft.com/office/drawing/2015/9/8/chartex" xmlns:cx2="http://schemas.microsoft.com/office/drawing/2015/10/21/chartex" xmlns:cx3="http://schemas.microsoft.com/office/drawing/2016/5/9/chartex" xmlns:cx4="http://schemas.microsoft.com/office/drawing/2016/5/10/chartex" xmlns:cx5="http://schemas.microsoft.com/office/drawing/2016/5/11/chartex" xmlns:cx6="http://schemas.microsoft.com/office/drawing/2016/5/12/chartex" xmlns:cx7="http://schemas.microsoft.com/office/drawing/2016/5/13/chartex" xmlns:cx8="http://schemas.microsoft.com/office/drawing/2016/5/14/chartex" xmlns:mc="http://schemas.openxmlformats.org/markup-compatibility/2006" xmlns:aink="http://schemas.microsoft.com/office/drawing/2016/ink" xmlns:am3d="http://schemas.microsoft.com/office/drawing/2017/model3d" xmlns:o="urn:schemas-microsoft-com:office:office" xmlns:oel="http://schemas.microsoft.com/office/2019/extlst" xmlns:r="http://schemas.openxmlformats.org/officeDocument/2006/relationships" xmlns:m="http://schemas.openxmlformats.org/officeDocument/2006/math" xmlns:v="urn:schemas-microsoft-com:vml" xmlns:wp14="http://schemas.microsoft.com/office/word/2010/wordprocessingDrawing" xmlns:wp="http://schemas.openxmlformats.org/drawingml/2006/wordprocessingDrawing" xmlns:w10="urn:schemas-microsoft-com:office:word" xmlns:w="http://schemas.openxmlformats.org/wordprocessingml/2006/main" xmlns:w14="http://schemas.microsoft.com/office/word/2010/wordml" xmlns:w15="http://schemas.microsoft.com/office/word/2012/wordml" xmlns:w16cex="http://schemas.microsoft.com/office/word/2018/wordml/cex" xmlns:w16cid="http://schemas.microsoft.com/office/word/2016/wordml/cid" xmlns:w16="http://schemas.microsoft.com/office/word/2018/wordml" xmlns:w16du="http://schemas.microsoft.com/office/word/2023/wordml/word16du" xmlns:w16sdtdh="http://schemas.microsoft.com/office/word/2020/wordml/sdtdatahash" xmlns:w16sdtfl="http://schemas.microsoft.com/office/word/2024/wordml/sdtformatlock" xmlns:w16se="http://schemas.microsoft.com/office/word/2015/wordml/symex" xmlns:wpg="http://schemas.microsoft.com/office/word/2010/wordprocessingGroup" xmlns:wpi="http://schemas.microsoft.com/office/word/2010/wordprocessingInk" xmlns:wne="http://schemas.microsoft.com/office/word/2006/wordml" xmlns:wps="http://schemas.microsoft.com/office/word/2010/wordprocessingShape" mc:Ignorable="w14 w15 w16se w16cid w16 w16cex w16sdtdh w16sdtfl w16du wp14">
   <w:body>
     <w:p>
       <w:pPr>
-        <w:pStyle w:val="HeaderText"/>
+        <w:pStyle w:val="DilonStepClarificationList"/>
         <w:rPr>
           <w:rStyle w:val="Emphasis"/>
           <w:i w:val="0"/>
@@ -29,7 +29,7 @@
 </file>
 
 <file path=word/endnotes.xml><?xml version="1.0" encoding="utf-8"?>
-<w:endnotes xmlns:wpc="http://schemas.microsoft.com/office/word/2010/wordprocessingCanvas" xmlns:cx="http://schemas.microsoft.com/office/drawing/2014/chartex" xmlns:cx1="http://schemas.microsoft.com/office/drawing/2015/9/8/chartex" xmlns:cx2="http://schemas.microsoft.com/office/drawing/2015/10/21/chartex" xmlns:cx3="http://schemas.microsoft.com/office/drawing/2016/5/9/chartex" xmlns:cx4="http://schemas.microsoft.com/office/drawing/2016/5/10/chartex" xmlns:cx5="http://schemas.microsoft.com/office/drawing/2016/5/11/chartex" xmlns:cx6="http://schemas.microsoft.com/office/drawing/2016/5/12/chartex" xmlns:cx7="http://schemas.microsoft.com/office/drawing/2016/5/13/chartex" xmlns:cx8="http://schemas.microsoft.com/office/drawing/2016/5/14/chartex" xmlns:mc="http://schemas.openxmlformats.org/markup-compatibility/2006" xmlns:aink="http://schemas.microsoft.com/office/drawing/2016/ink" xmlns:am3d="http://schemas.microsoft.com/office/drawing/2017/model3d" xmlns:o="urn:schemas-microsoft-com:office:office" xmlns:oel="http://schemas.microsoft.com/office/2019/extlst" xmlns:r="http://schemas.openxmlformats.org/officeDocument/2006/relationships" xmlns:m="http://schemas.openxmlformats.org/officeDocument/2006/math" xmlns:v="urn:schemas-microsoft-com:vml" xmlns:wp14="http://schemas.microsoft.com/office/word/2010/wordprocessingDrawing" xmlns:wp="http://schemas.openxmlformats.org/drawingml/2006/wordprocessingDrawing" xmlns:w10="urn:schemas-microsoft-com:office:word" xmlns:w="http://schemas.openxmlformats.org/wordprocessingml/2006/main" xmlns:w14="http://schemas.microsoft.com/office/word/2010/wordml" xmlns:w15="http://schemas.microsoft.com/office/word/2012/wordml" xmlns:w16cei="http://schemas.microsoft.com/office/word/2026/wordml/cei" xmlns:w16cex="http://schemas.microsoft.com/office/word/2018/wordml/cex" xmlns:w16cid="http://schemas.microsoft.com/office/word/2016/wordml/cid" xmlns:w16="http://schemas.microsoft.com/office/word/2018/wordml" xmlns:w16du="http://schemas.microsoft.com/office/word/2023/wordml/word16du" xmlns:w16sdtdh="http://schemas.microsoft.com/office/word/2020/wordml/sdtdatahash" xmlns:w16sdtfl="http://schemas.microsoft.com/office/word/2024/wordml/sdtformatlock" xmlns:w16se="http://schemas.microsoft.com/office/word/2015/wordml/symex" xmlns:wpg="http://schemas.microsoft.com/office/word/2010/wordprocessingGroup" xmlns:wpi="http://schemas.microsoft.com/office/word/2010/wordprocessingInk" xmlns:wne="http://schemas.microsoft.com/office/word/2006/wordml" xmlns:wps="http://schemas.microsoft.com/office/word/2010/wordprocessingShape" mc:Ignorable="w14 w15 w16se w16cid w16 w16cex w16sdtdh w16sdtfl w16du wp14">
+<w:endnotes xmlns:wpc="http://schemas.microsoft.com/office/word/2010/wordprocessingCanvas" xmlns:cx="http://schemas.microsoft.com/office/drawing/2014/chartex" xmlns:cx1="http://schemas.microsoft.com/office/drawing/2015/9/8/chartex" xmlns:cx2="http://schemas.microsoft.com/office/drawing/2015/10/21/chartex" xmlns:cx3="http://schemas.microsoft.com/office/drawing/2016/5/9/chartex" xmlns:cx4="http://schemas.microsoft.com/office/drawing/2016/5/10/chartex" xmlns:cx5="http://schemas.microsoft.com/office/drawing/2016/5/11/chartex" xmlns:cx6="http://schemas.microsoft.com/office/drawing/2016/5/12/chartex" xmlns:cx7="http://schemas.microsoft.com/office/drawing/2016/5/13/chartex" xmlns:cx8="http://schemas.microsoft.com/office/drawing/2016/5/14/chartex" xmlns:mc="http://schemas.openxmlformats.org/markup-compatibility/2006" xmlns:aink="http://schemas.microsoft.com/office/drawing/2016/ink" xmlns:am3d="http://schemas.microsoft.com/office/drawing/2017/model3d" xmlns:o="urn:schemas-microsoft-com:office:office" xmlns:oel="http://schemas.microsoft.com/office/2019/extlst" xmlns:r="http://schemas.openxmlformats.org/officeDocument/2006/relationships" xmlns:m="http://schemas.openxmlformats.org/officeDocument/2006/math" xmlns:v="urn:schemas-microsoft-com:vml" xmlns:wp14="http://schemas.microsoft.com/office/word/2010/wordprocessingDrawing" xmlns:wp="http://schemas.openxmlformats.org/drawingml/2006/wordprocessingDrawing" xmlns:w10="urn:schemas-microsoft-com:office:word" xmlns:w="http://schemas.openxmlformats.org/wordprocessingml/2006/main" xmlns:w14="http://schemas.microsoft.com/office/word/2010/wordml" xmlns:w15="http://schemas.microsoft.com/office/word/2012/wordml" xmlns:w16cex="http://schemas.microsoft.com/office/word/2018/wordml/cex" xmlns:w16cid="http://schemas.microsoft.com/office/word/2016/wordml/cid" xmlns:w16="http://schemas.microsoft.com/office/word/2018/wordml" xmlns:w16du="http://schemas.microsoft.com/office/word/2023/wordml/word16du" xmlns:w16sdtdh="http://schemas.microsoft.com/office/word/2020/wordml/sdtdatahash" xmlns:w16sdtfl="http://schemas.microsoft.com/office/word/2024/wordml/sdtformatlock" xmlns:w16se="http://schemas.microsoft.com/office/word/2015/wordml/symex" xmlns:wpg="http://schemas.microsoft.com/office/word/2010/wordprocessingGroup" xmlns:wpi="http://schemas.microsoft.com/office/word/2010/wordprocessingInk" xmlns:wne="http://schemas.microsoft.com/office/word/2006/wordml" xmlns:wps="http://schemas.microsoft.com/office/word/2010/wordprocessingShape" mc:Ignorable="w14 w15 w16se w16cid w16 w16cex w16sdtdh w16sdtfl w16du wp14">
   <w:endnote w:type="separator" w:id="-1">
     <w:p>
       <w:r>
@@ -48,7 +48,7 @@
 </file>
 
 <file path=word/footer1.xml><?xml version="1.0" encoding="utf-8"?>
-<w:ftr xmlns:wpc="http://schemas.microsoft.com/office/word/2010/wordprocessingCanvas" xmlns:cx="http://schemas.microsoft.com/office/drawing/2014/chartex" xmlns:cx1="http://schemas.microsoft.com/office/drawing/2015/9/8/chartex" xmlns:cx2="http://schemas.microsoft.com/office/drawing/2015/10/21/chartex" xmlns:cx3="http://schemas.microsoft.com/office/drawing/2016/5/9/chartex" xmlns:cx4="http://schemas.microsoft.com/office/drawing/2016/5/10/chartex" xmlns:cx5="http://schemas.microsoft.com/office/drawing/2016/5/11/chartex" xmlns:cx6="http://schemas.microsoft.com/office/drawing/2016/5/12/chartex" xmlns:cx7="http://schemas.microsoft.com/office/drawing/2016/5/13/chartex" xmlns:cx8="http://schemas.microsoft.com/office/drawing/2016/5/14/chartex" xmlns:mc="http://schemas.openxmlformats.org/markup-compatibility/2006" xmlns:aink="http://schemas.microsoft.com/office/drawing/2016/ink" xmlns:am3d="http://schemas.microsoft.com/office/drawing/2017/model3d" xmlns:o="urn:schemas-microsoft-com:office:office" xmlns:oel="http://schemas.microsoft.com/office/2019/extlst" xmlns:r="http://schemas.openxmlformats.org/officeDocument/2006/relationships" xmlns:m="http://schemas.openxmlformats.org/officeDocument/2006/math" xmlns:v="urn:schemas-microsoft-com:vml" xmlns:wp14="http://schemas.microsoft.com/office/word/2010/wordprocessingDrawing" xmlns:wp="http://schemas.openxmlformats.org/drawingml/2006/wordprocessingDrawing" xmlns:w10="urn:schemas-microsoft-com:office:word" xmlns:w="http://schemas.openxmlformats.org/wordprocessingml/2006/main" xmlns:w14="http://schemas.microsoft.com/office/word/2010/wordml" xmlns:w15="http://schemas.microsoft.com/office/word/2012/wordml" xmlns:w16cei="http://schemas.microsoft.com/office/word/2026/wordml/cei" xmlns:w16cex="http://schemas.microsoft.com/office/word/2018/wordml/cex" xmlns:w16cid="http://schemas.microsoft.com/office/word/2016/wordml/cid" xmlns:w16="http://schemas.microsoft.com/office/word/2018/wordml" xmlns:w16du="http://schemas.microsoft.com/office/word/2023/wordml/word16du" xmlns:w16sdtdh="http://schemas.microsoft.com/office/word/2020/wordml/sdtdatahash" xmlns:w16sdtfl="http://schemas.microsoft.com/office/word/2024/wordml/sdtformatlock" xmlns:w16se="http://schemas.microsoft.com/office/word/2015/wordml/symex" xmlns:wpg="http://schemas.microsoft.com/office/word/2010/wordprocessingGroup" xmlns:wpi="http://schemas.microsoft.com/office/word/2010/wordprocessingInk" xmlns:wne="http://schemas.microsoft.com/office/word/2006/wordml" xmlns:wps="http://schemas.microsoft.com/office/word/2010/wordprocessingShape" mc:Ignorable="w14 w15 w16se w16cid w16 w16cex w16sdtdh w16sdtfl w16du wp14">
+<w:ftr xmlns:wpc="http://schemas.microsoft.com/office/word/2010/wordprocessingCanvas" xmlns:cx="http://schemas.microsoft.com/office/drawing/2014/chartex" xmlns:cx1="http://schemas.microsoft.com/office/drawing/2015/9/8/chartex" xmlns:cx2="http://schemas.microsoft.com/office/drawing/2015/10/21/chartex" xmlns:cx3="http://schemas.microsoft.com/office/drawing/2016/5/9/chartex" xmlns:cx4="http://schemas.microsoft.com/office/drawing/2016/5/10/chartex" xmlns:cx5="http://schemas.microsoft.com/office/drawing/2016/5/11/chartex" xmlns:cx6="http://schemas.microsoft.com/office/drawing/2016/5/12/chartex" xmlns:cx7="http://schemas.microsoft.com/office/drawing/2016/5/13/chartex" xmlns:cx8="http://schemas.microsoft.com/office/drawing/2016/5/14/chartex" xmlns:mc="http://schemas.openxmlformats.org/markup-compatibility/2006" xmlns:aink="http://schemas.microsoft.com/office/drawing/2016/ink" xmlns:am3d="http://schemas.microsoft.com/office/drawing/2017/model3d" xmlns:o="urn:schemas-microsoft-com:office:office" xmlns:oel="http://schemas.microsoft.com/office/2019/extlst" xmlns:r="http://schemas.openxmlformats.org/officeDocument/2006/relationships" xmlns:m="http://schemas.openxmlformats.org/officeDocument/2006/math" xmlns:v="urn:schemas-microsoft-com:vml" xmlns:wp14="http://schemas.microsoft.com/office/word/2010/wordprocessingDrawing" xmlns:wp="http://schemas.openxmlformats.org/drawingml/2006/wordprocessingDrawing" xmlns:w10="urn:schemas-microsoft-com:office:word" xmlns:w="http://schemas.openxmlformats.org/wordprocessingml/2006/main" xmlns:w14="http://schemas.microsoft.com/office/word/2010/wordml" xmlns:w15="http://schemas.microsoft.com/office/word/2012/wordml" xmlns:w16cex="http://schemas.microsoft.com/office/word/2018/wordml/cex" xmlns:w16cid="http://schemas.microsoft.com/office/word/2016/wordml/cid" xmlns:w16="http://schemas.microsoft.com/office/word/2018/wordml" xmlns:w16du="http://schemas.microsoft.com/office/word/2023/wordml/word16du" xmlns:w16sdtdh="http://schemas.microsoft.com/office/word/2020/wordml/sdtdatahash" xmlns:w16sdtfl="http://schemas.microsoft.com/office/word/2024/wordml/sdtformatlock" xmlns:w16se="http://schemas.microsoft.com/office/word/2015/wordml/symex" xmlns:wpg="http://schemas.microsoft.com/office/word/2010/wordprocessingGroup" xmlns:wpi="http://schemas.microsoft.com/office/word/2010/wordprocessingInk" xmlns:wne="http://schemas.microsoft.com/office/word/2006/wordml" xmlns:wps="http://schemas.microsoft.com/office/word/2010/wordprocessingShape" mc:Ignorable="w14 w15 w16se w16cid w16 w16cex w16sdtdh w16sdtfl w16du wp14">
   <w:p>
     <w:pPr>
       <w:pStyle w:val="Footer"/>
@@ -58,7 +58,7 @@
 </file>
 
 <file path=word/footer2.xml><?xml version="1.0" encoding="utf-8"?>
-<w:ftr xmlns:wpc="http://schemas.microsoft.com/office/word/2010/wordprocessingCanvas" xmlns:cx="http://schemas.microsoft.com/office/drawing/2014/chartex" xmlns:cx1="http://schemas.microsoft.com/office/drawing/2015/9/8/chartex" xmlns:cx2="http://schemas.microsoft.com/office/drawing/2015/10/21/chartex" xmlns:cx3="http://schemas.microsoft.com/office/drawing/2016/5/9/chartex" xmlns:cx4="http://schemas.microsoft.com/office/drawing/2016/5/10/chartex" xmlns:cx5="http://schemas.microsoft.com/office/drawing/2016/5/11/chartex" xmlns:cx6="http://schemas.microsoft.com/office/drawing/2016/5/12/chartex" xmlns:cx7="http://schemas.microsoft.com/office/drawing/2016/5/13/chartex" xmlns:cx8="http://schemas.microsoft.com/office/drawing/2016/5/14/chartex" xmlns:mc="http://schemas.openxmlformats.org/markup-compatibility/2006" xmlns:aink="http://schemas.microsoft.com/office/drawing/2016/ink" xmlns:am3d="http://schemas.microsoft.com/office/drawing/2017/model3d" xmlns:o="urn:schemas-microsoft-com:office:office" xmlns:oel="http://schemas.microsoft.com/office/2019/extlst" xmlns:r="http://schemas.openxmlformats.org/officeDocument/2006/relationships" xmlns:m="http://schemas.openxmlformats.org/officeDocument/2006/math" xmlns:v="urn:schemas-microsoft-com:vml" xmlns:wp14="http://schemas.microsoft.com/office/word/2010/wordprocessingDrawing" xmlns:wp="http://schemas.openxmlformats.org/drawingml/2006/wordprocessingDrawing" xmlns:w10="urn:schemas-microsoft-com:office:word" xmlns:w="http://schemas.openxmlformats.org/wordprocessingml/2006/main" xmlns:w14="http://schemas.microsoft.com/office/word/2010/wordml" xmlns:w15="http://schemas.microsoft.com/office/word/2012/wordml" xmlns:w16cei="http://schemas.microsoft.com/office/word/2026/wordml/cei" xmlns:w16cex="http://schemas.microsoft.com/office/word/2018/wordml/cex" xmlns:w16cid="http://schemas.microsoft.com/office/word/2016/wordml/cid" xmlns:w16="http://schemas.microsoft.com/office/word/2018/wordml" xmlns:w16du="http://schemas.microsoft.com/office/word/2023/wordml/word16du" xmlns:w16sdtdh="http://schemas.microsoft.com/office/word/2020/wordml/sdtdatahash" xmlns:w16sdtfl="http://schemas.microsoft.com/office/word/2024/wordml/sdtformatlock" xmlns:w16se="http://schemas.microsoft.com/office/word/2015/wordml/symex" xmlns:wpg="http://schemas.microsoft.com/office/word/2010/wordprocessingGroup" xmlns:wpi="http://schemas.microsoft.com/office/word/2010/wordprocessingInk" xmlns:wne="http://schemas.microsoft.com/office/word/2006/wordml" xmlns:wps="http://schemas.microsoft.com/office/word/2010/wordprocessingShape" mc:Ignorable="w14 w15 w16se w16cid w16 w16cex w16sdtdh w16sdtfl w16du wp14">
+<w:ftr xmlns:wpc="http://schemas.microsoft.com/office/word/2010/wordprocessingCanvas" xmlns:cx="http://schemas.microsoft.com/office/drawing/2014/chartex" xmlns:cx1="http://schemas.microsoft.com/office/drawing/2015/9/8/chartex" xmlns:cx2="http://schemas.microsoft.com/office/drawing/2015/10/21/chartex" xmlns:cx3="http://schemas.microsoft.com/office/drawing/2016/5/9/chartex" xmlns:cx4="http://schemas.microsoft.com/office/drawing/2016/5/10/chartex" xmlns:cx5="http://schemas.microsoft.com/office/drawing/2016/5/11/chartex" xmlns:cx6="http://schemas.microsoft.com/office/drawing/2016/5/12/chartex" xmlns:cx7="http://schemas.microsoft.com/office/drawing/2016/5/13/chartex" xmlns:cx8="http://schemas.microsoft.com/office/drawing/2016/5/14/chartex" xmlns:mc="http://schemas.openxmlformats.org/markup-compatibility/2006" xmlns:aink="http://schemas.microsoft.com/office/drawing/2016/ink" xmlns:am3d="http://schemas.microsoft.com/office/drawing/2017/model3d" xmlns:o="urn:schemas-microsoft-com:office:office" xmlns:oel="http://schemas.microsoft.com/office/2019/extlst" xmlns:r="http://schemas.openxmlformats.org/officeDocument/2006/relationships" xmlns:m="http://schemas.openxmlformats.org/officeDocument/2006/math" xmlns:v="urn:schemas-microsoft-com:vml" xmlns:wp14="http://schemas.microsoft.com/office/word/2010/wordprocessingDrawing" xmlns:wp="http://schemas.openxmlformats.org/drawingml/2006/wordprocessingDrawing" xmlns:w10="urn:schemas-microsoft-com:office:word" xmlns:w="http://schemas.openxmlformats.org/wordprocessingml/2006/main" xmlns:w14="http://schemas.microsoft.com/office/word/2010/wordml" xmlns:w15="http://schemas.microsoft.com/office/word/2012/wordml" xmlns:w16cex="http://schemas.microsoft.com/office/word/2018/wordml/cex" xmlns:w16cid="http://schemas.microsoft.com/office/word/2016/wordml/cid" xmlns:w16="http://schemas.microsoft.com/office/word/2018/wordml" xmlns:w16du="http://schemas.microsoft.com/office/word/2023/wordml/word16du" xmlns:w16sdtdh="http://schemas.microsoft.com/office/word/2020/wordml/sdtdatahash" xmlns:w16sdtfl="http://schemas.microsoft.com/office/word/2024/wordml/sdtformatlock" xmlns:w16se="http://schemas.microsoft.com/office/word/2015/wordml/symex" xmlns:wpg="http://schemas.microsoft.com/office/word/2010/wordprocessingGroup" xmlns:wpi="http://schemas.microsoft.com/office/word/2010/wordprocessingInk" xmlns:wne="http://schemas.microsoft.com/office/word/2006/wordml" xmlns:wps="http://schemas.microsoft.com/office/word/2010/wordprocessingShape" mc:Ignorable="w14 w15 w16se w16cid w16 w16cex w16sdtdh w16sdtfl w16du wp14">
   <w:p>
     <w:r>
       <w:cr/>
@@ -68,7 +68,7 @@
 </file>
 
 <file path=word/footer3.xml><?xml version="1.0" encoding="utf-8"?>
-<w:ftr xmlns:wpc="http://schemas.microsoft.com/office/word/2010/wordprocessingCanvas" xmlns:cx="http://schemas.microsoft.com/office/drawing/2014/chartex" xmlns:cx1="http://schemas.microsoft.com/office/drawing/2015/9/8/chartex" xmlns:cx2="http://schemas.microsoft.com/office/drawing/2015/10/21/chartex" xmlns:cx3="http://schemas.microsoft.com/office/drawing/2016/5/9/chartex" xmlns:cx4="http://schemas.microsoft.com/office/drawing/2016/5/10/chartex" xmlns:cx5="http://schemas.microsoft.com/office/drawing/2016/5/11/chartex" xmlns:cx6="http://schemas.microsoft.com/office/drawing/2016/5/12/chartex" xmlns:cx7="http://schemas.microsoft.com/office/drawing/2016/5/13/chartex" xmlns:cx8="http://schemas.microsoft.com/office/drawing/2016/5/14/chartex" xmlns:mc="http://schemas.openxmlformats.org/markup-compatibility/2006" xmlns:aink="http://schemas.microsoft.com/office/drawing/2016/ink" xmlns:am3d="http://schemas.microsoft.com/office/drawing/2017/model3d" xmlns:o="urn:schemas-microsoft-com:office:office" xmlns:oel="http://schemas.microsoft.com/office/2019/extlst" xmlns:r="http://schemas.openxmlformats.org/officeDocument/2006/relationships" xmlns:m="http://schemas.openxmlformats.org/officeDocument/2006/math" xmlns:v="urn:schemas-microsoft-com:vml" xmlns:wp14="http://schemas.microsoft.com/office/word/2010/wordprocessingDrawing" xmlns:wp="http://schemas.openxmlformats.org/drawingml/2006/wordprocessingDrawing" xmlns:w10="urn:schemas-microsoft-com:office:word" xmlns:w="http://schemas.openxmlformats.org/wordprocessingml/2006/main" xmlns:w14="http://schemas.microsoft.com/office/word/2010/wordml" xmlns:w15="http://schemas.microsoft.com/office/word/2012/wordml" xmlns:w16cei="http://schemas.microsoft.com/office/word/2026/wordml/cei" xmlns:w16cex="http://schemas.microsoft.com/office/word/2018/wordml/cex" xmlns:w16cid="http://schemas.microsoft.com/office/word/2016/wordml/cid" xmlns:w16="http://schemas.microsoft.com/office/word/2018/wordml" xmlns:w16du="http://schemas.microsoft.com/office/word/2023/wordml/word16du" xmlns:w16sdtdh="http://schemas.microsoft.com/office/word/2020/wordml/sdtdatahash" xmlns:w16sdtfl="http://schemas.microsoft.com/office/word/2024/wordml/sdtformatlock" xmlns:w16se="http://schemas.microsoft.com/office/word/2015/wordml/symex" xmlns:wpg="http://schemas.microsoft.com/office/word/2010/wordprocessingGroup" xmlns:wpi="http://schemas.microsoft.com/office/word/2010/wordprocessingInk" xmlns:wne="http://schemas.microsoft.com/office/word/2006/wordml" xmlns:wps="http://schemas.microsoft.com/office/word/2010/wordprocessingShape" mc:Ignorable="w14 w15 w16se w16cid w16 w16cex w16sdtdh w16sdtfl w16du wp14">
+<w:ftr xmlns:wpc="http://schemas.microsoft.com/office/word/2010/wordprocessingCanvas" xmlns:cx="http://schemas.microsoft.com/office/drawing/2014/chartex" xmlns:cx1="http://schemas.microsoft.com/office/drawing/2015/9/8/chartex" xmlns:cx2="http://schemas.microsoft.com/office/drawing/2015/10/21/chartex" xmlns:cx3="http://schemas.microsoft.com/office/drawing/2016/5/9/chartex" xmlns:cx4="http://schemas.microsoft.com/office/drawing/2016/5/10/chartex" xmlns:cx5="http://schemas.microsoft.com/office/drawing/2016/5/11/chartex" xmlns:cx6="http://schemas.microsoft.com/office/drawing/2016/5/12/chartex" xmlns:cx7="http://schemas.microsoft.com/office/drawing/2016/5/13/chartex" xmlns:cx8="http://schemas.microsoft.com/office/drawing/2016/5/14/chartex" xmlns:mc="http://schemas.openxmlformats.org/markup-compatibility/2006" xmlns:aink="http://schemas.microsoft.com/office/drawing/2016/ink" xmlns:am3d="http://schemas.microsoft.com/office/drawing/2017/model3d" xmlns:o="urn:schemas-microsoft-com:office:office" xmlns:oel="http://schemas.microsoft.com/office/2019/extlst" xmlns:r="http://schemas.openxmlformats.org/officeDocument/2006/relationships" xmlns:m="http://schemas.openxmlformats.org/officeDocument/2006/math" xmlns:v="urn:schemas-microsoft-com:vml" xmlns:wp14="http://schemas.microsoft.com/office/word/2010/wordprocessingDrawing" xmlns:wp="http://schemas.openxmlformats.org/drawingml/2006/wordprocessingDrawing" xmlns:w10="urn:schemas-microsoft-com:office:word" xmlns:w="http://schemas.openxmlformats.org/wordprocessingml/2006/main" xmlns:w14="http://schemas.microsoft.com/office/word/2010/wordml" xmlns:w15="http://schemas.microsoft.com/office/word/2012/wordml" xmlns:w16cex="http://schemas.microsoft.com/office/word/2018/wordml/cex" xmlns:w16cid="http://schemas.microsoft.com/office/word/2016/wordml/cid" xmlns:w16="http://schemas.microsoft.com/office/word/2018/wordml" xmlns:w16du="http://schemas.microsoft.com/office/word/2023/wordml/word16du" xmlns:w16sdtdh="http://schemas.microsoft.com/office/word/2020/wordml/sdtdatahash" xmlns:w16sdtfl="http://schemas.microsoft.com/office/word/2024/wordml/sdtformatlock" xmlns:w16se="http://schemas.microsoft.com/office/word/2015/wordml/symex" xmlns:wpg="http://schemas.microsoft.com/office/word/2010/wordprocessingGroup" xmlns:wpi="http://schemas.microsoft.com/office/word/2010/wordprocessingInk" xmlns:wne="http://schemas.microsoft.com/office/word/2006/wordml" xmlns:wps="http://schemas.microsoft.com/office/word/2010/wordprocessingShape" mc:Ignorable="w14 w15 w16se w16cid w16 w16cex w16sdtdh w16sdtfl w16du wp14">
   <w:p>
     <w:pPr>
       <w:pStyle w:val="Footer"/>
@@ -78,7 +78,7 @@
 </file>
 
 <file path=word/footnotes.xml><?xml version="1.0" encoding="utf-8"?>
-<w:footnotes xmlns:wpc="http://schemas.microsoft.com/office/word/2010/wordprocessingCanvas" xmlns:cx="http://schemas.microsoft.com/office/drawing/2014/chartex" xmlns:cx1="http://schemas.microsoft.com/office/drawing/2015/9/8/chartex" xmlns:cx2="http://schemas.microsoft.com/office/drawing/2015/10/21/chartex" xmlns:cx3="http://schemas.microsoft.com/office/drawing/2016/5/9/chartex" xmlns:cx4="http://schemas.microsoft.com/office/drawing/2016/5/10/chartex" xmlns:cx5="http://schemas.microsoft.com/office/drawing/2016/5/11/chartex" xmlns:cx6="http://schemas.microsoft.com/office/drawing/2016/5/12/chartex" xmlns:cx7="http://schemas.microsoft.com/office/drawing/2016/5/13/chartex" xmlns:cx8="http://schemas.microsoft.com/office/drawing/2016/5/14/chartex" xmlns:mc="http://schemas.openxmlformats.org/markup-compatibility/2006" xmlns:aink="http://schemas.microsoft.com/office/drawing/2016/ink" xmlns:am3d="http://schemas.microsoft.com/office/drawing/2017/model3d" xmlns:o="urn:schemas-microsoft-com:office:office" xmlns:oel="http://schemas.microsoft.com/office/2019/extlst" xmlns:r="http://schemas.openxmlformats.org/officeDocument/2006/relationships" xmlns:m="http://schemas.openxmlformats.org/officeDocument/2006/math" xmlns:v="urn:schemas-microsoft-com:vml" xmlns:wp14="http://schemas.microsoft.com/office/word/2010/wordprocessingDrawing" xmlns:wp="http://schemas.openxmlformats.org/drawingml/2006/wordprocessingDrawing" xmlns:w10="urn:schemas-microsoft-com:office:word" xmlns:w="http://schemas.openxmlformats.org/wordprocessingml/2006/main" xmlns:w14="http://schemas.microsoft.com/office/word/2010/wordml" xmlns:w15="http://schemas.microsoft.com/office/word/2012/wordml" xmlns:w16cei="http://schemas.microsoft.com/office/word/2026/wordml/cei" xmlns:w16cex="http://schemas.microsoft.com/office/word/2018/wordml/cex" xmlns:w16cid="http://schemas.microsoft.com/office/word/2016/wordml/cid" xmlns:w16="http://schemas.microsoft.com/office/word/2018/wordml" xmlns:w16du="http://schemas.microsoft.com/office/word/2023/wordml/word16du" xmlns:w16sdtdh="http://schemas.microsoft.com/office/word/2020/wordml/sdtdatahash" xmlns:w16sdtfl="http://schemas.microsoft.com/office/word/2024/wordml/sdtformatlock" xmlns:w16se="http://schemas.microsoft.com/office/word/2015/wordml/symex" xmlns:wpg="http://schemas.microsoft.com/office/word/2010/wordprocessingGroup" xmlns:wpi="http://schemas.microsoft.com/office/word/2010/wordprocessingInk" xmlns:wne="http://schemas.microsoft.com/office/word/2006/wordml" xmlns:wps="http://schemas.microsoft.com/office/word/2010/wordprocessingShape" mc:Ignorable="w14 w15 w16se w16cid w16 w16cex w16sdtdh w16sdtfl w16du wp14">
+<w:footnotes xmlns:wpc="http://schemas.microsoft.com/office/word/2010/wordprocessingCanvas" xmlns:cx="http://schemas.microsoft.com/office/drawing/2014/chartex" xmlns:cx1="http://schemas.microsoft.com/office/drawing/2015/9/8/chartex" xmlns:cx2="http://schemas.microsoft.com/office/drawing/2015/10/21/chartex" xmlns:cx3="http://schemas.microsoft.com/office/drawing/2016/5/9/chartex" xmlns:cx4="http://schemas.microsoft.com/office/drawing/2016/5/10/chartex" xmlns:cx5="http://schemas.microsoft.com/office/drawing/2016/5/11/chartex" xmlns:cx6="http://schemas.microsoft.com/office/drawing/2016/5/12/chartex" xmlns:cx7="http://schemas.microsoft.com/office/drawing/2016/5/13/chartex" xmlns:cx8="http://schemas.microsoft.com/office/drawing/2016/5/14/chartex" xmlns:mc="http://schemas.openxmlformats.org/markup-compatibility/2006" xmlns:aink="http://schemas.microsoft.com/office/drawing/2016/ink" xmlns:am3d="http://schemas.microsoft.com/office/drawing/2017/model3d" xmlns:o="urn:schemas-microsoft-com:office:office" xmlns:oel="http://schemas.microsoft.com/office/2019/extlst" xmlns:r="http://schemas.openxmlformats.org/officeDocument/2006/relationships" xmlns:m="http://schemas.openxmlformats.org/officeDocument/2006/math" xmlns:v="urn:schemas-microsoft-com:vml" xmlns:wp14="http://schemas.microsoft.com/office/word/2010/wordprocessingDrawing" xmlns:wp="http://schemas.openxmlformats.org/drawingml/2006/wordprocessingDrawing" xmlns:w10="urn:schemas-microsoft-com:office:word" xmlns:w="http://schemas.openxmlformats.org/wordprocessingml/2006/main" xmlns:w14="http://schemas.microsoft.com/office/word/2010/wordml" xmlns:w15="http://schemas.microsoft.com/office/word/2012/wordml" xmlns:w16cex="http://schemas.microsoft.com/office/word/2018/wordml/cex" xmlns:w16cid="http://schemas.microsoft.com/office/word/2016/wordml/cid" xmlns:w16="http://schemas.microsoft.com/office/word/2018/wordml" xmlns:w16du="http://schemas.microsoft.com/office/word/2023/wordml/word16du" xmlns:w16sdtdh="http://schemas.microsoft.com/office/word/2020/wordml/sdtdatahash" xmlns:w16sdtfl="http://schemas.microsoft.com/office/word/2024/wordml/sdtformatlock" xmlns:w16se="http://schemas.microsoft.com/office/word/2015/wordml/symex" xmlns:wpg="http://schemas.microsoft.com/office/word/2010/wordprocessingGroup" xmlns:wpi="http://schemas.microsoft.com/office/word/2010/wordprocessingInk" xmlns:wne="http://schemas.microsoft.com/office/word/2006/wordml" xmlns:wps="http://schemas.microsoft.com/office/word/2010/wordprocessingShape" mc:Ignorable="w14 w15 w16se w16cid w16 w16cex w16sdtdh w16sdtfl w16du wp14">
   <w:footnote w:type="separator" w:id="-1">
     <w:p>
       <w:r>
@@ -97,7 +97,7 @@
 </file>
 
 <file path=word/header1.xml><?xml version="1.0" encoding="utf-8"?>
-<w:hdr xmlns:wpc="http://schemas.microsoft.com/office/word/2010/wordprocessingCanvas" xmlns:cx="http://schemas.microsoft.com/office/drawing/2014/chartex" xmlns:cx1="http://schemas.microsoft.com/office/drawing/2015/9/8/chartex" xmlns:cx2="http://schemas.microsoft.com/office/drawing/2015/10/21/chartex" xmlns:cx3="http://schemas.microsoft.com/office/drawing/2016/5/9/chartex" xmlns:cx4="http://schemas.microsoft.com/office/drawing/2016/5/10/chartex" xmlns:cx5="http://schemas.microsoft.com/office/drawing/2016/5/11/chartex" xmlns:cx6="http://schemas.microsoft.com/office/drawing/2016/5/12/chartex" xmlns:cx7="http://schemas.microsoft.com/office/drawing/2016/5/13/chartex" xmlns:cx8="http://schemas.microsoft.com/office/drawing/2016/5/14/chartex" xmlns:mc="http://schemas.openxmlformats.org/markup-compatibility/2006" xmlns:aink="http://schemas.microsoft.com/office/drawing/2016/ink" xmlns:am3d="http://schemas.microsoft.com/office/drawing/2017/model3d" xmlns:o="urn:schemas-microsoft-com:office:office" xmlns:oel="http://schemas.microsoft.com/office/2019/extlst" xmlns:r="http://schemas.openxmlformats.org/officeDocument/2006/relationships" xmlns:m="http://schemas.openxmlformats.org/officeDocument/2006/math" xmlns:v="urn:schemas-microsoft-com:vml" xmlns:wp14="http://schemas.microsoft.com/office/word/2010/wordprocessingDrawing" xmlns:wp="http://schemas.openxmlformats.org/drawingml/2006/wordprocessingDrawing" xmlns:w10="urn:schemas-microsoft-com:office:word" xmlns:w="http://schemas.openxmlformats.org/wordprocessingml/2006/main" xmlns:w14="http://schemas.microsoft.com/office/word/2010/wordml" xmlns:w15="http://schemas.microsoft.com/office/word/2012/wordml" xmlns:w16cei="http://schemas.microsoft.com/office/word/2026/wordml/cei" xmlns:w16cex="http://schemas.microsoft.com/office/word/2018/wordml/cex" xmlns:w16cid="http://schemas.microsoft.com/office/word/2016/wordml/cid" xmlns:w16="http://schemas.microsoft.com/office/word/2018/wordml" xmlns:w16du="http://schemas.microsoft.com/office/word/2023/wordml/word16du" xmlns:w16sdtdh="http://schemas.microsoft.com/office/word/2020/wordml/sdtdatahash" xmlns:w16sdtfl="http://schemas.microsoft.com/office/word/2024/wordml/sdtformatlock" xmlns:w16se="http://schemas.microsoft.com/office/word/2015/wordml/symex" xmlns:wpg="http://schemas.microsoft.com/office/word/2010/wordprocessingGroup" xmlns:wpi="http://schemas.microsoft.com/office/word/2010/wordprocessingInk" xmlns:wne="http://schemas.microsoft.com/office/word/2006/wordml" xmlns:wps="http://schemas.microsoft.com/office/word/2010/wordprocessingShape" mc:Ignorable="w14 w15 w16se w16cid w16 w16cex w16sdtdh w16sdtfl w16du wp14">
+<w:hdr xmlns:wpc="http://schemas.microsoft.com/office/word/2010/wordprocessingCanvas" xmlns:cx="http://schemas.microsoft.com/office/drawing/2014/chartex" xmlns:cx1="http://schemas.microsoft.com/office/drawing/2015/9/8/chartex" xmlns:cx2="http://schemas.microsoft.com/office/drawing/2015/10/21/chartex" xmlns:cx3="http://schemas.microsoft.com/office/drawing/2016/5/9/chartex" xmlns:cx4="http://schemas.microsoft.com/office/drawing/2016/5/10/chartex" xmlns:cx5="http://schemas.microsoft.com/office/drawing/2016/5/11/chartex" xmlns:cx6="http://schemas.microsoft.com/office/drawing/2016/5/12/chartex" xmlns:cx7="http://schemas.microsoft.com/office/drawing/2016/5/13/chartex" xmlns:cx8="http://schemas.microsoft.com/office/drawing/2016/5/14/chartex" xmlns:mc="http://schemas.openxmlformats.org/markup-compatibility/2006" xmlns:aink="http://schemas.microsoft.com/office/drawing/2016/ink" xmlns:am3d="http://schemas.microsoft.com/office/drawing/2017/model3d" xmlns:o="urn:schemas-microsoft-com:office:office" xmlns:oel="http://schemas.microsoft.com/office/2019/extlst" xmlns:r="http://schemas.openxmlformats.org/officeDocument/2006/relationships" xmlns:m="http://schemas.openxmlformats.org/officeDocument/2006/math" xmlns:v="urn:schemas-microsoft-com:vml" xmlns:wp14="http://schemas.microsoft.com/office/word/2010/wordprocessingDrawing" xmlns:wp="http://schemas.openxmlformats.org/drawingml/2006/wordprocessingDrawing" xmlns:w10="urn:schemas-microsoft-com:office:word" xmlns:w="http://schemas.openxmlformats.org/wordprocessingml/2006/main" xmlns:w14="http://schemas.microsoft.com/office/word/2010/wordml" xmlns:w15="http://schemas.microsoft.com/office/word/2012/wordml" xmlns:w16cex="http://schemas.microsoft.com/office/word/2018/wordml/cex" xmlns:w16cid="http://schemas.microsoft.com/office/word/2016/wordml/cid" xmlns:w16="http://schemas.microsoft.com/office/word/2018/wordml" xmlns:w16du="http://schemas.microsoft.com/office/word/2023/wordml/word16du" xmlns:w16sdtdh="http://schemas.microsoft.com/office/word/2020/wordml/sdtdatahash" xmlns:w16sdtfl="http://schemas.microsoft.com/office/word/2024/wordml/sdtformatlock" xmlns:w16se="http://schemas.microsoft.com/office/word/2015/wordml/symex" xmlns:wpg="http://schemas.microsoft.com/office/word/2010/wordprocessingGroup" xmlns:wpi="http://schemas.microsoft.com/office/word/2010/wordprocessingInk" xmlns:wne="http://schemas.microsoft.com/office/word/2006/wordml" xmlns:wps="http://schemas.microsoft.com/office/word/2010/wordprocessingShape" mc:Ignorable="w14 w15 w16se w16cid w16 w16cex w16sdtdh w16sdtfl w16du wp14">
   <w:p>
     <w:pPr>
       <w:pStyle w:val="Header"/>
@@ -107,7 +107,7 @@
 </file>
 
 <file path=word/header2.xml><?xml version="1.0" encoding="utf-8"?>
-<w:hdr xmlns:wpc="http://schemas.microsoft.com/office/word/2010/wordprocessingCanvas" xmlns:cx="http://schemas.microsoft.com/office/drawing/2014/chartex" xmlns:cx1="http://schemas.microsoft.com/office/drawing/2015/9/8/chartex" xmlns:cx2="http://schemas.microsoft.com/office/drawing/2015/10/21/chartex" xmlns:cx3="http://schemas.microsoft.com/office/drawing/2016/5/9/chartex" xmlns:cx4="http://schemas.microsoft.com/office/drawing/2016/5/10/chartex" xmlns:cx5="http://schemas.microsoft.com/office/drawing/2016/5/11/chartex" xmlns:cx6="http://schemas.microsoft.com/office/drawing/2016/5/12/chartex" xmlns:cx7="http://schemas.microsoft.com/office/drawing/2016/5/13/chartex" xmlns:cx8="http://schemas.microsoft.com/office/drawing/2016/5/14/chartex" xmlns:mc="http://schemas.openxmlformats.org/markup-compatibility/2006" xmlns:aink="http://schemas.microsoft.com/office/drawing/2016/ink" xmlns:am3d="http://schemas.microsoft.com/office/drawing/2017/model3d" xmlns:o="urn:schemas-microsoft-com:office:office" xmlns:oel="http://schemas.microsoft.com/office/2019/extlst" xmlns:r="http://schemas.openxmlformats.org/officeDocument/2006/relationships" xmlns:m="http://schemas.openxmlformats.org/officeDocument/2006/math" xmlns:v="urn:schemas-microsoft-com:vml" xmlns:wp14="http://schemas.microsoft.com/office/word/2010/wordprocessingDrawing" xmlns:wp="http://schemas.openxmlformats.org/drawingml/2006/wordprocessingDrawing" xmlns:w10="urn:schemas-microsoft-com:office:word" xmlns:w="http://schemas.openxmlformats.org/wordprocessingml/2006/main" xmlns:w14="http://schemas.microsoft.com/office/word/2010/wordml" xmlns:w15="http://schemas.microsoft.com/office/word/2012/wordml" xmlns:w16cei="http://schemas.microsoft.com/office/word/2026/wordml/cei" xmlns:w16cex="http://schemas.microsoft.com/office/word/2018/wordml/cex" xmlns:w16cid="http://schemas.microsoft.com/office/word/2016/wordml/cid" xmlns:w16="http://schemas.microsoft.com/office/word/2018/wordml" xmlns:w16du="http://schemas.microsoft.com/office/word/2023/wordml/word16du" xmlns:w16sdtdh="http://schemas.microsoft.com/office/word/2020/wordml/sdtdatahash" xmlns:w16sdtfl="http://schemas.microsoft.com/office/word/2024/wordml/sdtformatlock" xmlns:w16se="http://schemas.microsoft.com/office/word/2015/wordml/symex" xmlns:wpg="http://schemas.microsoft.com/office/word/2010/wordprocessingGroup" xmlns:wpi="http://schemas.microsoft.com/office/word/2010/wordprocessingInk" xmlns:wne="http://schemas.microsoft.com/office/word/2006/wordml" xmlns:wps="http://schemas.microsoft.com/office/word/2010/wordprocessingShape" mc:Ignorable="w14 w15 w16se w16cid w16 w16cex w16sdtdh w16sdtfl w16du wp14">
+<w:hdr xmlns:wpc="http://schemas.microsoft.com/office/word/2010/wordprocessingCanvas" xmlns:cx="http://schemas.microsoft.com/office/drawing/2014/chartex" xmlns:cx1="http://schemas.microsoft.com/office/drawing/2015/9/8/chartex" xmlns:cx2="http://schemas.microsoft.com/office/drawing/2015/10/21/chartex" xmlns:cx3="http://schemas.microsoft.com/office/drawing/2016/5/9/chartex" xmlns:cx4="http://schemas.microsoft.com/office/drawing/2016/5/10/chartex" xmlns:cx5="http://schemas.microsoft.com/office/drawing/2016/5/11/chartex" xmlns:cx6="http://schemas.microsoft.com/office/drawing/2016/5/12/chartex" xmlns:cx7="http://schemas.microsoft.com/office/drawing/2016/5/13/chartex" xmlns:cx8="http://schemas.microsoft.com/office/drawing/2016/5/14/chartex" xmlns:mc="http://schemas.openxmlformats.org/markup-compatibility/2006" xmlns:aink="http://schemas.microsoft.com/office/drawing/2016/ink" xmlns:am3d="http://schemas.microsoft.com/office/drawing/2017/model3d" xmlns:o="urn:schemas-microsoft-com:office:office" xmlns:oel="http://schemas.microsoft.com/office/2019/extlst" xmlns:r="http://schemas.openxmlformats.org/officeDocument/2006/relationships" xmlns:m="http://schemas.openxmlformats.org/officeDocument/2006/math" xmlns:v="urn:schemas-microsoft-com:vml" xmlns:wp14="http://schemas.microsoft.com/office/word/2010/wordprocessingDrawing" xmlns:wp="http://schemas.openxmlformats.org/drawingml/2006/wordprocessingDrawing" xmlns:w10="urn:schemas-microsoft-com:office:word" xmlns:w="http://schemas.openxmlformats.org/wordprocessingml/2006/main" xmlns:w14="http://schemas.microsoft.com/office/word/2010/wordml" xmlns:w15="http://schemas.microsoft.com/office/word/2012/wordml" xmlns:w16cex="http://schemas.microsoft.com/office/word/2018/wordml/cex" xmlns:w16cid="http://schemas.microsoft.com/office/word/2016/wordml/cid" xmlns:w16="http://schemas.microsoft.com/office/word/2018/wordml" xmlns:w16du="http://schemas.microsoft.com/office/word/2023/wordml/word16du" xmlns:w16sdtdh="http://schemas.microsoft.com/office/word/2020/wordml/sdtdatahash" xmlns:w16sdtfl="http://schemas.microsoft.com/office/word/2024/wordml/sdtformatlock" xmlns:w16se="http://schemas.microsoft.com/office/word/2015/wordml/symex" xmlns:wpg="http://schemas.microsoft.com/office/word/2010/wordprocessingGroup" xmlns:wpi="http://schemas.microsoft.com/office/word/2010/wordprocessingInk" xmlns:wne="http://schemas.microsoft.com/office/word/2006/wordml" xmlns:wps="http://schemas.microsoft.com/office/word/2010/wordprocessingShape" mc:Ignorable="w14 w15 w16se w16cid w16 w16cex w16sdtdh w16sdtfl w16du wp14">
   <w:p>
     <w:r>
       <w:cr/>
@@ -117,7 +117,7 @@
 </file>
 
 <file path=word/header3.xml><?xml version="1.0" encoding="utf-8"?>
-<w:hdr xmlns:wpc="http://schemas.microsoft.com/office/word/2010/wordprocessingCanvas" xmlns:cx="http://schemas.microsoft.com/office/drawing/2014/chartex" xmlns:cx1="http://schemas.microsoft.com/office/drawing/2015/9/8/chartex" xmlns:cx2="http://schemas.microsoft.com/office/drawing/2015/10/21/chartex" xmlns:cx3="http://schemas.microsoft.com/office/drawing/2016/5/9/chartex" xmlns:cx4="http://schemas.microsoft.com/office/drawing/2016/5/10/chartex" xmlns:cx5="http://schemas.microsoft.com/office/drawing/2016/5/11/chartex" xmlns:cx6="http://schemas.microsoft.com/office/drawing/2016/5/12/chartex" xmlns:cx7="http://schemas.microsoft.com/office/drawing/2016/5/13/chartex" xmlns:cx8="http://schemas.microsoft.com/office/drawing/2016/5/14/chartex" xmlns:mc="http://schemas.openxmlformats.org/markup-compatibility/2006" xmlns:aink="http://schemas.microsoft.com/office/drawing/2016/ink" xmlns:am3d="http://schemas.microsoft.com/office/drawing/2017/model3d" xmlns:o="urn:schemas-microsoft-com:office:office" xmlns:oel="http://schemas.microsoft.com/office/2019/extlst" xmlns:r="http://schemas.openxmlformats.org/officeDocument/2006/relationships" xmlns:m="http://schemas.openxmlformats.org/officeDocument/2006/math" xmlns:v="urn:schemas-microsoft-com:vml" xmlns:wp14="http://schemas.microsoft.com/office/word/2010/wordprocessingDrawing" xmlns:wp="http://schemas.openxmlformats.org/drawingml/2006/wordprocessingDrawing" xmlns:w10="urn:schemas-microsoft-com:office:word" xmlns:w="http://schemas.openxmlformats.org/wordprocessingml/2006/main" xmlns:w14="http://schemas.microsoft.com/office/word/2010/wordml" xmlns:w15="http://schemas.microsoft.com/office/word/2012/wordml" xmlns:w16cei="http://schemas.microsoft.com/office/word/2026/wordml/cei" xmlns:w16cex="http://schemas.microsoft.com/office/word/2018/wordml/cex" xmlns:w16cid="http://schemas.microsoft.com/office/word/2016/wordml/cid" xmlns:w16="http://schemas.microsoft.com/office/word/2018/wordml" xmlns:w16du="http://schemas.microsoft.com/office/word/2023/wordml/word16du" xmlns:w16sdtdh="http://schemas.microsoft.com/office/word/2020/wordml/sdtdatahash" xmlns:w16sdtfl="http://schemas.microsoft.com/office/word/2024/wordml/sdtformatlock" xmlns:w16se="http://schemas.microsoft.com/office/word/2015/wordml/symex" xmlns:wpg="http://schemas.microsoft.com/office/word/2010/wordprocessingGroup" xmlns:wpi="http://schemas.microsoft.com/office/word/2010/wordprocessingInk" xmlns:wne="http://schemas.microsoft.com/office/word/2006/wordml" xmlns:wps="http://schemas.microsoft.com/office/word/2010/wordprocessingShape" mc:Ignorable="w14 w15 w16se w16cid w16 w16cex w16sdtdh w16sdtfl w16du wp14">
+<w:hdr xmlns:wpc="http://schemas.microsoft.com/office/word/2010/wordprocessingCanvas" xmlns:cx="http://schemas.microsoft.com/office/drawing/2014/chartex" xmlns:cx1="http://schemas.microsoft.com/office/drawing/2015/9/8/chartex" xmlns:cx2="http://schemas.microsoft.com/office/drawing/2015/10/21/chartex" xmlns:cx3="http://schemas.microsoft.com/office/drawing/2016/5/9/chartex" xmlns:cx4="http://schemas.microsoft.com/office/drawing/2016/5/10/chartex" xmlns:cx5="http://schemas.microsoft.com/office/drawing/2016/5/11/chartex" xmlns:cx6="http://schemas.microsoft.com/office/drawing/2016/5/12/chartex" xmlns:cx7="http://schemas.microsoft.com/office/drawing/2016/5/13/chartex" xmlns:cx8="http://schemas.microsoft.com/office/drawing/2016/5/14/chartex" xmlns:mc="http://schemas.openxmlformats.org/markup-compatibility/2006" xmlns:aink="http://schemas.microsoft.com/office/drawing/2016/ink" xmlns:am3d="http://schemas.microsoft.com/office/drawing/2017/model3d" xmlns:o="urn:schemas-microsoft-com:office:office" xmlns:oel="http://schemas.microsoft.com/office/2019/extlst" xmlns:r="http://schemas.openxmlformats.org/officeDocument/2006/relationships" xmlns:m="http://schemas.openxmlformats.org/officeDocument/2006/math" xmlns:v="urn:schemas-microsoft-com:vml" xmlns:wp14="http://schemas.microsoft.com/office/word/2010/wordprocessingDrawing" xmlns:wp="http://schemas.openxmlformats.org/drawingml/2006/wordprocessingDrawing" xmlns:w10="urn:schemas-microsoft-com:office:word" xmlns:w="http://schemas.openxmlformats.org/wordprocessingml/2006/main" xmlns:w14="http://schemas.microsoft.com/office/word/2010/wordml" xmlns:w15="http://schemas.microsoft.com/office/word/2012/wordml" xmlns:w16cex="http://schemas.microsoft.com/office/word/2018/wordml/cex" xmlns:w16cid="http://schemas.microsoft.com/office/word/2016/wordml/cid" xmlns:w16="http://schemas.microsoft.com/office/word/2018/wordml" xmlns:w16du="http://schemas.microsoft.com/office/word/2023/wordml/word16du" xmlns:w16sdtdh="http://schemas.microsoft.com/office/word/2020/wordml/sdtdatahash" xmlns:w16sdtfl="http://schemas.microsoft.com/office/word/2024/wordml/sdtformatlock" xmlns:w16se="http://schemas.microsoft.com/office/word/2015/wordml/symex" xmlns:wpg="http://schemas.microsoft.com/office/word/2010/wordprocessingGroup" xmlns:wpi="http://schemas.microsoft.com/office/word/2010/wordprocessingInk" xmlns:wne="http://schemas.microsoft.com/office/word/2006/wordml" xmlns:wps="http://schemas.microsoft.com/office/word/2010/wordprocessingShape" mc:Ignorable="w14 w15 w16se w16cid w16 w16cex w16sdtdh w16sdtfl w16du wp14">
   <w:p>
     <w:pPr>
       <w:pStyle w:val="Header"/>
@@ -127,7 +127,7 @@
 </file>
 
 <file path=word/numbering.xml><?xml version="1.0" encoding="utf-8"?>
-<w:numbering xmlns:wpc="http://schemas.microsoft.com/office/word/2010/wordprocessingCanvas" xmlns:cx="http://schemas.microsoft.com/office/drawing/2014/chartex" xmlns:cx1="http://schemas.microsoft.com/office/drawing/2015/9/8/chartex" xmlns:cx2="http://schemas.microsoft.com/office/drawing/2015/10/21/chartex" xmlns:cx3="http://schemas.microsoft.com/office/drawing/2016/5/9/chartex" xmlns:cx4="http://schemas.microsoft.com/office/drawing/2016/5/10/chartex" xmlns:cx5="http://schemas.microsoft.com/office/drawing/2016/5/11/chartex" xmlns:cx6="http://schemas.microsoft.com/office/drawing/2016/5/12/chartex" xmlns:cx7="http://schemas.microsoft.com/office/drawing/2016/5/13/chartex" xmlns:cx8="http://schemas.microsoft.com/office/drawing/2016/5/14/chartex" xmlns:mc="http://schemas.openxmlformats.org/markup-compatibility/2006" xmlns:aink="http://schemas.microsoft.com/office/drawing/2016/ink" xmlns:am3d="http://schemas.microsoft.com/office/drawing/2017/model3d" xmlns:o="urn:schemas-microsoft-com:office:office" xmlns:oel="http://schemas.microsoft.com/office/2019/extlst" xmlns:r="http://schemas.openxmlformats.org/officeDocument/2006/relationships" xmlns:m="http://schemas.openxmlformats.org/officeDocument/2006/math" xmlns:v="urn:schemas-microsoft-com:vml" xmlns:wp14="http://schemas.microsoft.com/office/word/2010/wordprocessingDrawing" xmlns:wp="http://schemas.openxmlformats.org/drawingml/2006/wordprocessingDrawing" xmlns:w10="urn:schemas-microsoft-com:office:word" xmlns:w="http://schemas.openxmlformats.org/wordprocessingml/2006/main" xmlns:w14="http://schemas.microsoft.com/office/word/2010/wordml" xmlns:w15="http://schemas.microsoft.com/office/word/2012/wordml" xmlns:w16cei="http://schemas.microsoft.com/office/word/2026/wordml/cei" xmlns:w16cex="http://schemas.microsoft.com/office/word/2018/wordml/cex" xmlns:w16cid="http://schemas.microsoft.com/office/word/2016/wordml/cid" xmlns:w16="http://schemas.microsoft.com/office/word/2018/wordml" xmlns:w16du="http://schemas.microsoft.com/office/word/2023/wordml/word16du" xmlns:w16sdtdh="http://schemas.microsoft.com/office/word/2020/wordml/sdtdatahash" xmlns:w16sdtfl="http://schemas.microsoft.com/office/word/2024/wordml/sdtformatlock" xmlns:w16se="http://schemas.microsoft.com/office/word/2015/wordml/symex" xmlns:wpg="http://schemas.microsoft.com/office/word/2010/wordprocessingGroup" xmlns:wpi="http://schemas.microsoft.com/office/word/2010/wordprocessingInk" xmlns:wne="http://schemas.microsoft.com/office/word/2006/wordml" xmlns:wps="http://schemas.microsoft.com/office/word/2010/wordprocessingShape" mc:Ignorable="w14 w15 w16se w16cid w16 w16cex w16sdtdh w16sdtfl w16du wp14">
+<w:numbering xmlns:wpc="http://schemas.microsoft.com/office/word/2010/wordprocessingCanvas" xmlns:cx="http://schemas.microsoft.com/office/drawing/2014/chartex" xmlns:cx1="http://schemas.microsoft.com/office/drawing/2015/9/8/chartex" xmlns:cx2="http://schemas.microsoft.com/office/drawing/2015/10/21/chartex" xmlns:cx3="http://schemas.microsoft.com/office/drawing/2016/5/9/chartex" xmlns:cx4="http://schemas.microsoft.com/office/drawing/2016/5/10/chartex" xmlns:cx5="http://schemas.microsoft.com/office/drawing/2016/5/11/chartex" xmlns:cx6="http://schemas.microsoft.com/office/drawing/2016/5/12/chartex" xmlns:cx7="http://schemas.microsoft.com/office/drawing/2016/5/13/chartex" xmlns:cx8="http://schemas.microsoft.com/office/drawing/2016/5/14/chartex" xmlns:mc="http://schemas.openxmlformats.org/markup-compatibility/2006" xmlns:aink="http://schemas.microsoft.com/office/drawing/2016/ink" xmlns:am3d="http://schemas.microsoft.com/office/drawing/2017/model3d" xmlns:o="urn:schemas-microsoft-com:office:office" xmlns:oel="http://schemas.microsoft.com/office/2019/extlst" xmlns:r="http://schemas.openxmlformats.org/officeDocument/2006/relationships" xmlns:m="http://schemas.openxmlformats.org/officeDocument/2006/math" xmlns:v="urn:schemas-microsoft-com:vml" xmlns:wp14="http://schemas.microsoft.com/office/word/2010/wordprocessingDrawing" xmlns:wp="http://schemas.openxmlformats.org/drawingml/2006/wordprocessingDrawing" xmlns:w10="urn:schemas-microsoft-com:office:word" xmlns:w="http://schemas.openxmlformats.org/wordprocessingml/2006/main" xmlns:w14="http://schemas.microsoft.com/office/word/2010/wordml" xmlns:w15="http://schemas.microsoft.com/office/word/2012/wordml" xmlns:w16cex="http://schemas.microsoft.com/office/word/2018/wordml/cex" xmlns:w16cid="http://schemas.microsoft.com/office/word/2016/wordml/cid" xmlns:w16="http://schemas.microsoft.com/office/word/2018/wordml" xmlns:w16du="http://schemas.microsoft.com/office/word/2023/wordml/word16du" xmlns:w16sdtdh="http://schemas.microsoft.com/office/word/2020/wordml/sdtdatahash" xmlns:w16sdtfl="http://schemas.microsoft.com/office/word/2024/wordml/sdtformatlock" xmlns:w16se="http://schemas.microsoft.com/office/word/2015/wordml/symex" xmlns:wpg="http://schemas.microsoft.com/office/word/2010/wordprocessingGroup" xmlns:wpi="http://schemas.microsoft.com/office/word/2010/wordprocessingInk" xmlns:wne="http://schemas.microsoft.com/office/word/2006/wordml" xmlns:wps="http://schemas.microsoft.com/office/word/2010/wordprocessingShape" mc:Ignorable="w14 w15 w16se w16cid w16 w16cex w16sdtdh w16sdtfl w16du wp14">
   <w:abstractNum w:abstractNumId="0" w15:restartNumberingAfterBreak="0">
     <w:nsid w:val="FFFFFFFB"/>
     <w:multiLevelType w:val="multilevel"/>
@@ -1340,6 +1340,120 @@
     </w:lvl>
   </w:abstractNum>
   <w:abstractNum w:abstractNumId="14" w15:restartNumberingAfterBreak="0">
+    <w:nsid w:val="0C95591C"/>
+    <w:multiLevelType w:val="multilevel"/>
+    <w:tmpl w:val="6388F4CA"/>
+    <w:lvl w:ilvl="0">
+      <w:start w:val="1"/>
+      <w:numFmt w:val="lowerLetter"/>
+      <w:pStyle w:val="DilonStepClarificationList"/>
+      <w:lvlText w:val="%1."/>
+      <w:lvlJc w:val="left"/>
+      <w:pPr>
+        <w:ind w:left="360" w:hanging="360"/>
+      </w:pPr>
+      <w:rPr>
+        <w:rFonts w:hint="default"/>
+      </w:rPr>
+    </w:lvl>
+    <w:lvl w:ilvl="1">
+      <w:start w:val="1"/>
+      <w:numFmt w:val="decimal"/>
+      <w:lvlText w:val="%1.%2."/>
+      <w:lvlJc w:val="left"/>
+      <w:pPr>
+        <w:ind w:left="720" w:hanging="360"/>
+      </w:pPr>
+      <w:rPr>
+        <w:rFonts w:hint="default"/>
+      </w:rPr>
+    </w:lvl>
+    <w:lvl w:ilvl="2">
+      <w:start w:val="1"/>
+      <w:numFmt w:val="lowerRoman"/>
+      <w:lvlText w:val="%3)"/>
+      <w:lvlJc w:val="left"/>
+      <w:pPr>
+        <w:ind w:left="1080" w:hanging="360"/>
+      </w:pPr>
+      <w:rPr>
+        <w:rFonts w:hint="default"/>
+      </w:rPr>
+    </w:lvl>
+    <w:lvl w:ilvl="3">
+      <w:start w:val="1"/>
+      <w:numFmt w:val="decimal"/>
+      <w:lvlText w:val="(%4)"/>
+      <w:lvlJc w:val="left"/>
+      <w:pPr>
+        <w:ind w:left="1440" w:hanging="360"/>
+      </w:pPr>
+      <w:rPr>
+        <w:rFonts w:hint="default"/>
+      </w:rPr>
+    </w:lvl>
+    <w:lvl w:ilvl="4">
+      <w:start w:val="1"/>
+      <w:numFmt w:val="lowerLetter"/>
+      <w:lvlText w:val="(%5)"/>
+      <w:lvlJc w:val="left"/>
+      <w:pPr>
+        <w:ind w:left="1800" w:hanging="360"/>
+      </w:pPr>
+      <w:rPr>
+        <w:rFonts w:hint="default"/>
+      </w:rPr>
+    </w:lvl>
+    <w:lvl w:ilvl="5">
+      <w:start w:val="1"/>
+      <w:numFmt w:val="lowerRoman"/>
+      <w:lvlText w:val="(%6)"/>
+      <w:lvlJc w:val="left"/>
+      <w:pPr>
+        <w:ind w:left="2160" w:hanging="360"/>
+      </w:pPr>
+      <w:rPr>
+        <w:rFonts w:hint="default"/>
+      </w:rPr>
+    </w:lvl>
+    <w:lvl w:ilvl="6">
+      <w:start w:val="1"/>
+      <w:numFmt w:val="decimal"/>
+      <w:lvlText w:val="%7."/>
+      <w:lvlJc w:val="left"/>
+      <w:pPr>
+        <w:ind w:left="2520" w:hanging="360"/>
+      </w:pPr>
+      <w:rPr>
+        <w:rFonts w:hint="default"/>
+      </w:rPr>
+    </w:lvl>
+    <w:lvl w:ilvl="7">
+      <w:start w:val="1"/>
+      <w:numFmt w:val="lowerLetter"/>
+      <w:lvlText w:val="%8."/>
+      <w:lvlJc w:val="left"/>
+      <w:pPr>
+        <w:ind w:left="2880" w:hanging="360"/>
+      </w:pPr>
+      <w:rPr>
+        <w:rFonts w:hint="default"/>
+      </w:rPr>
+    </w:lvl>
+    <w:lvl w:ilvl="8">
+      <w:start w:val="1"/>
+      <w:numFmt w:val="lowerRoman"/>
+      <w:lvlText w:val="%9."/>
+      <w:lvlJc w:val="left"/>
+      <w:pPr>
+        <w:ind w:left="3240" w:hanging="360"/>
+      </w:pPr>
+      <w:rPr>
+        <w:rFonts w:hint="default"/>
+      </w:rPr>
+    </w:lvl>
+  </w:abstractNum>
+  <w:abstractNum w:abstractNumId="15" w15:restartNumberingAfterBreak="0">
     <w:nsid w:val="0DD727F4"/>
     <w:multiLevelType w:val="hybridMultilevel"/>
     <w:tmpl w:val="CB726154"/>
@@ -1428,7 +1542,7 @@
       </w:pPr>
     </w:lvl>
   </w:abstractNum>
-  <w:abstractNum w:abstractNumId="15" w15:restartNumberingAfterBreak="0">
+  <w:abstractNum w:abstractNumId="16" w15:restartNumberingAfterBreak="0">
     <w:nsid w:val="13346CCE"/>
     <w:multiLevelType w:val="hybridMultilevel"/>
     <w:tmpl w:val="C8EEE47E"/>
@@ -1541,7 +1655,7 @@
       </w:rPr>
     </w:lvl>
   </w:abstractNum>
-  <w:abstractNum w:abstractNumId="16" w15:restartNumberingAfterBreak="0">
+  <w:abstractNum w:abstractNumId="17" w15:restartNumberingAfterBreak="0">
     <w:nsid w:val="16A97876"/>
     <w:multiLevelType w:val="multilevel"/>
     <w:tmpl w:val="0D3E6D66"/>
@@ -1654,7 +1768,7 @@
       </w:pPr>
     </w:lvl>
   </w:abstractNum>
-  <w:abstractNum w:abstractNumId="17" w15:restartNumberingAfterBreak="0">
+  <w:abstractNum w:abstractNumId="18" w15:restartNumberingAfterBreak="0">
     <w:nsid w:val="177E6724"/>
     <w:multiLevelType w:val="singleLevel"/>
     <w:tmpl w:val="2F728CD6"/>
@@ -1672,7 +1786,7 @@
       </w:rPr>
     </w:lvl>
   </w:abstractNum>
-  <w:abstractNum w:abstractNumId="18" w15:restartNumberingAfterBreak="0">
+  <w:abstractNum w:abstractNumId="19" w15:restartNumberingAfterBreak="0">
     <w:nsid w:val="1D7F4B8F"/>
     <w:multiLevelType w:val="hybridMultilevel"/>
     <w:tmpl w:val="D07E0D08"/>
@@ -1761,7 +1875,7 @@
       </w:pPr>
     </w:lvl>
   </w:abstractNum>
-  <w:abstractNum w:abstractNumId="19" w15:restartNumberingAfterBreak="0">
+  <w:abstractNum w:abstractNumId="20" w15:restartNumberingAfterBreak="0">
     <w:nsid w:val="1DBA2C7A"/>
     <w:multiLevelType w:val="hybridMultilevel"/>
     <w:tmpl w:val="DBA02ADC"/>
@@ -1850,7 +1964,7 @@
       </w:pPr>
     </w:lvl>
   </w:abstractNum>
-  <w:abstractNum w:abstractNumId="20" w15:restartNumberingAfterBreak="0">
+  <w:abstractNum w:abstractNumId="21" w15:restartNumberingAfterBreak="0">
     <w:nsid w:val="1F1B776B"/>
     <w:multiLevelType w:val="hybridMultilevel"/>
     <w:tmpl w:val="D332D93E"/>
@@ -1963,7 +2077,7 @@
       </w:rPr>
     </w:lvl>
   </w:abstractNum>
-  <w:abstractNum w:abstractNumId="21" w15:restartNumberingAfterBreak="0">
+  <w:abstractNum w:abstractNumId="22" w15:restartNumberingAfterBreak="0">
     <w:nsid w:val="201B74B8"/>
     <w:multiLevelType w:val="hybridMultilevel"/>
     <w:tmpl w:val="309AF45C"/>
@@ -2103,7 +2217,7 @@
       </w:rPr>
     </w:lvl>
   </w:abstractNum>
-  <w:abstractNum w:abstractNumId="22" w15:restartNumberingAfterBreak="0">
+  <w:abstractNum w:abstractNumId="23" w15:restartNumberingAfterBreak="0">
     <w:nsid w:val="241C70F9"/>
     <w:multiLevelType w:val="multilevel"/>
     <w:tmpl w:val="812A967C"/>
@@ -2216,7 +2330,7 @@
       </w:rPr>
     </w:lvl>
   </w:abstractNum>
-  <w:abstractNum w:abstractNumId="23" w15:restartNumberingAfterBreak="0">
+  <w:abstractNum w:abstractNumId="24" w15:restartNumberingAfterBreak="0">
     <w:nsid w:val="2C4103A3"/>
     <w:multiLevelType w:val="singleLevel"/>
     <w:tmpl w:val="9C260340"/>
@@ -2236,7 +2350,7 @@
       </w:rPr>
     </w:lvl>
   </w:abstractNum>
-  <w:abstractNum w:abstractNumId="24" w15:restartNumberingAfterBreak="0">
+  <w:abstractNum w:abstractNumId="25" w15:restartNumberingAfterBreak="0">
     <w:nsid w:val="2F0925A4"/>
     <w:multiLevelType w:val="multilevel"/>
     <w:tmpl w:val="602CD6A4"/>
@@ -2377,7 +2491,7 @@
       </w:rPr>
     </w:lvl>
   </w:abstractNum>
-  <w:abstractNum w:abstractNumId="25" w15:restartNumberingAfterBreak="0">
+  <w:abstractNum w:abstractNumId="26" w15:restartNumberingAfterBreak="0">
     <w:nsid w:val="2FEB7D39"/>
     <w:multiLevelType w:val="hybridMultilevel"/>
     <w:tmpl w:val="AF34DE7A"/>
@@ -2466,7 +2580,7 @@
       </w:pPr>
     </w:lvl>
   </w:abstractNum>
-  <w:abstractNum w:abstractNumId="26" w15:restartNumberingAfterBreak="0">
+  <w:abstractNum w:abstractNumId="27" w15:restartNumberingAfterBreak="0">
     <w:nsid w:val="37241CDB"/>
     <w:multiLevelType w:val="hybridMultilevel"/>
     <w:tmpl w:val="51048B7C"/>
@@ -2555,7 +2669,7 @@
       </w:pPr>
     </w:lvl>
   </w:abstractNum>
-  <w:abstractNum w:abstractNumId="27" w15:restartNumberingAfterBreak="0">
+  <w:abstractNum w:abstractNumId="28" w15:restartNumberingAfterBreak="0">
     <w:nsid w:val="37265F4B"/>
     <w:multiLevelType w:val="hybridMultilevel"/>
     <w:tmpl w:val="1AA6B35C"/>
@@ -2644,7 +2758,7 @@
       </w:pPr>
     </w:lvl>
   </w:abstractNum>
-  <w:abstractNum w:abstractNumId="28" w15:restartNumberingAfterBreak="0">
+  <w:abstractNum w:abstractNumId="29" w15:restartNumberingAfterBreak="0">
     <w:nsid w:val="378659A8"/>
     <w:multiLevelType w:val="hybridMultilevel"/>
     <w:tmpl w:val="8F1A73D6"/>
@@ -2733,7 +2847,7 @@
       </w:pPr>
     </w:lvl>
   </w:abstractNum>
-  <w:abstractNum w:abstractNumId="29" w15:restartNumberingAfterBreak="0">
+  <w:abstractNum w:abstractNumId="30" w15:restartNumberingAfterBreak="0">
     <w:nsid w:val="3A1A2F5B"/>
     <w:multiLevelType w:val="hybridMultilevel"/>
     <w:tmpl w:val="DE506256"/>
@@ -2822,7 +2936,7 @@
       </w:pPr>
     </w:lvl>
   </w:abstractNum>
-  <w:abstractNum w:abstractNumId="30" w15:restartNumberingAfterBreak="0">
+  <w:abstractNum w:abstractNumId="31" w15:restartNumberingAfterBreak="0">
     <w:nsid w:val="3D41207E"/>
     <w:multiLevelType w:val="singleLevel"/>
     <w:tmpl w:val="C3F8A22E"/>
@@ -2840,7 +2954,7 @@
       </w:rPr>
     </w:lvl>
   </w:abstractNum>
-  <w:abstractNum w:abstractNumId="31" w15:restartNumberingAfterBreak="0">
+  <w:abstractNum w:abstractNumId="32" w15:restartNumberingAfterBreak="0">
     <w:nsid w:val="3DE71864"/>
     <w:multiLevelType w:val="hybridMultilevel"/>
     <w:tmpl w:val="40A2DBAE"/>
@@ -2980,7 +3094,7 @@
       </w:rPr>
     </w:lvl>
   </w:abstractNum>
-  <w:abstractNum w:abstractNumId="32" w15:restartNumberingAfterBreak="0">
+  <w:abstractNum w:abstractNumId="33" w15:restartNumberingAfterBreak="0">
     <w:nsid w:val="3F682946"/>
     <w:multiLevelType w:val="hybridMultilevel"/>
     <w:tmpl w:val="2A5EDF6A"/>
@@ -3069,7 +3183,7 @@
       </w:pPr>
     </w:lvl>
   </w:abstractNum>
-  <w:abstractNum w:abstractNumId="33" w15:restartNumberingAfterBreak="0">
+  <w:abstractNum w:abstractNumId="34" w15:restartNumberingAfterBreak="0">
     <w:nsid w:val="421D2552"/>
     <w:multiLevelType w:val="hybridMultilevel"/>
     <w:tmpl w:val="E070E8DA"/>
@@ -3158,7 +3272,7 @@
       </w:pPr>
     </w:lvl>
   </w:abstractNum>
-  <w:abstractNum w:abstractNumId="34" w15:restartNumberingAfterBreak="0">
+  <w:abstractNum w:abstractNumId="35" w15:restartNumberingAfterBreak="0">
     <w:nsid w:val="42493E77"/>
     <w:multiLevelType w:val="hybridMultilevel"/>
     <w:tmpl w:val="975AD426"/>
@@ -3247,7 +3361,7 @@
       </w:pPr>
     </w:lvl>
   </w:abstractNum>
-  <w:abstractNum w:abstractNumId="35" w15:restartNumberingAfterBreak="0">
+  <w:abstractNum w:abstractNumId="36" w15:restartNumberingAfterBreak="0">
     <w:nsid w:val="435730E9"/>
     <w:multiLevelType w:val="hybridMultilevel"/>
     <w:tmpl w:val="5246CA56"/>
@@ -3336,7 +3450,7 @@
       </w:pPr>
     </w:lvl>
   </w:abstractNum>
-  <w:abstractNum w:abstractNumId="36" w15:restartNumberingAfterBreak="0">
+  <w:abstractNum w:abstractNumId="37" w15:restartNumberingAfterBreak="0">
     <w:nsid w:val="458B2284"/>
     <w:multiLevelType w:val="multilevel"/>
     <w:tmpl w:val="B9C2C8E4"/>
@@ -3449,7 +3563,7 @@
       </w:rPr>
     </w:lvl>
   </w:abstractNum>
-  <w:abstractNum w:abstractNumId="37" w15:restartNumberingAfterBreak="0">
+  <w:abstractNum w:abstractNumId="38" w15:restartNumberingAfterBreak="0">
     <w:nsid w:val="497B2DF7"/>
     <w:multiLevelType w:val="hybridMultilevel"/>
     <w:tmpl w:val="0C86E09A"/>
@@ -3538,7 +3652,7 @@
       </w:pPr>
     </w:lvl>
   </w:abstractNum>
-  <w:abstractNum w:abstractNumId="38" w15:restartNumberingAfterBreak="0">
+  <w:abstractNum w:abstractNumId="39" w15:restartNumberingAfterBreak="0">
     <w:nsid w:val="4C0F108F"/>
     <w:multiLevelType w:val="hybridMultilevel"/>
     <w:tmpl w:val="C5526C10"/>
@@ -3627,7 +3741,7 @@
       </w:pPr>
     </w:lvl>
   </w:abstractNum>
-  <w:abstractNum w:abstractNumId="39" w15:restartNumberingAfterBreak="0">
+  <w:abstractNum w:abstractNumId="40" w15:restartNumberingAfterBreak="0">
     <w:nsid w:val="4C174FC6"/>
     <w:multiLevelType w:val="hybridMultilevel"/>
     <w:tmpl w:val="66263E42"/>
@@ -3716,7 +3830,7 @@
       </w:pPr>
     </w:lvl>
   </w:abstractNum>
-  <w:abstractNum w:abstractNumId="40" w15:restartNumberingAfterBreak="0">
+  <w:abstractNum w:abstractNumId="41" w15:restartNumberingAfterBreak="0">
     <w:nsid w:val="4E5F5480"/>
     <w:multiLevelType w:val="hybridMultilevel"/>
     <w:tmpl w:val="4ED230C0"/>
@@ -3805,7 +3919,7 @@
       </w:pPr>
     </w:lvl>
   </w:abstractNum>
-  <w:abstractNum w:abstractNumId="41" w15:restartNumberingAfterBreak="0">
+  <w:abstractNum w:abstractNumId="42" w15:restartNumberingAfterBreak="0">
     <w:nsid w:val="4E6C4F82"/>
     <w:multiLevelType w:val="multilevel"/>
     <w:tmpl w:val="78C83582"/>
@@ -3918,7 +4032,7 @@
       </w:rPr>
     </w:lvl>
   </w:abstractNum>
-  <w:abstractNum w:abstractNumId="42" w15:restartNumberingAfterBreak="0">
+  <w:abstractNum w:abstractNumId="43" w15:restartNumberingAfterBreak="0">
     <w:nsid w:val="4F2B77EE"/>
     <w:multiLevelType w:val="hybridMultilevel"/>
     <w:tmpl w:val="4ED230C0"/>
@@ -4007,7 +4121,7 @@
       </w:pPr>
     </w:lvl>
   </w:abstractNum>
-  <w:abstractNum w:abstractNumId="43" w15:restartNumberingAfterBreak="0">
+  <w:abstractNum w:abstractNumId="44" w15:restartNumberingAfterBreak="0">
     <w:nsid w:val="50AC2EBE"/>
     <w:multiLevelType w:val="hybridMultilevel"/>
     <w:tmpl w:val="EE92E71E"/>
@@ -4096,7 +4210,7 @@
       </w:pPr>
     </w:lvl>
   </w:abstractNum>
-  <w:abstractNum w:abstractNumId="44" w15:restartNumberingAfterBreak="0">
+  <w:abstractNum w:abstractNumId="45" w15:restartNumberingAfterBreak="0">
     <w:nsid w:val="54034C84"/>
     <w:multiLevelType w:val="multilevel"/>
     <w:tmpl w:val="EAF0A91E"/>
@@ -4216,7 +4330,7 @@
       </w:rPr>
     </w:lvl>
   </w:abstractNum>
-  <w:abstractNum w:abstractNumId="45" w15:restartNumberingAfterBreak="0">
+  <w:abstractNum w:abstractNumId="46" w15:restartNumberingAfterBreak="0">
     <w:nsid w:val="54865123"/>
     <w:multiLevelType w:val="hybridMultilevel"/>
     <w:tmpl w:val="CD9ECFD4"/>
@@ -4305,7 +4419,7 @@
       </w:pPr>
     </w:lvl>
   </w:abstractNum>
-  <w:abstractNum w:abstractNumId="46" w15:restartNumberingAfterBreak="0">
+  <w:abstractNum w:abstractNumId="47" w15:restartNumberingAfterBreak="0">
     <w:nsid w:val="559E612A"/>
     <w:multiLevelType w:val="hybridMultilevel"/>
     <w:tmpl w:val="8184049C"/>
@@ -4443,7 +4557,7 @@
       </w:rPr>
     </w:lvl>
   </w:abstractNum>
-  <w:abstractNum w:abstractNumId="47" w15:restartNumberingAfterBreak="0">
+  <w:abstractNum w:abstractNumId="48" w15:restartNumberingAfterBreak="0">
     <w:nsid w:val="57BE4A08"/>
     <w:multiLevelType w:val="hybridMultilevel"/>
     <w:tmpl w:val="F3EA0F90"/>
@@ -4556,7 +4670,7 @@
       </w:rPr>
     </w:lvl>
   </w:abstractNum>
-  <w:abstractNum w:abstractNumId="48" w15:restartNumberingAfterBreak="0">
+  <w:abstractNum w:abstractNumId="49" w15:restartNumberingAfterBreak="0">
     <w:nsid w:val="588A5DC1"/>
     <w:multiLevelType w:val="hybridMultilevel"/>
     <w:tmpl w:val="68BEC2E0"/>
@@ -4669,7 +4783,7 @@
       </w:rPr>
     </w:lvl>
   </w:abstractNum>
-  <w:abstractNum w:abstractNumId="49" w15:restartNumberingAfterBreak="0">
+  <w:abstractNum w:abstractNumId="50" w15:restartNumberingAfterBreak="0">
     <w:nsid w:val="58B306F4"/>
     <w:multiLevelType w:val="hybridMultilevel"/>
     <w:tmpl w:val="BB649AB8"/>
@@ -4758,7 +4872,7 @@
       </w:pPr>
     </w:lvl>
   </w:abstractNum>
-  <w:abstractNum w:abstractNumId="50" w15:restartNumberingAfterBreak="0">
+  <w:abstractNum w:abstractNumId="51" w15:restartNumberingAfterBreak="0">
     <w:nsid w:val="5D1249F2"/>
     <w:multiLevelType w:val="multilevel"/>
     <w:tmpl w:val="B7DCE9BC"/>
@@ -4872,7 +4986,7 @@
       </w:rPr>
     </w:lvl>
   </w:abstractNum>
-  <w:abstractNum w:abstractNumId="51" w15:restartNumberingAfterBreak="0">
+  <w:abstractNum w:abstractNumId="52" w15:restartNumberingAfterBreak="0">
     <w:nsid w:val="5D85070E"/>
     <w:multiLevelType w:val="hybridMultilevel"/>
     <w:tmpl w:val="C7689C94"/>
@@ -4961,7 +5075,7 @@
       </w:pPr>
     </w:lvl>
   </w:abstractNum>
-  <w:abstractNum w:abstractNumId="52" w15:restartNumberingAfterBreak="0">
+  <w:abstractNum w:abstractNumId="53" w15:restartNumberingAfterBreak="0">
     <w:nsid w:val="5E720785"/>
     <w:multiLevelType w:val="hybridMultilevel"/>
     <w:tmpl w:val="BA945176"/>
@@ -5050,7 +5164,7 @@
       </w:pPr>
     </w:lvl>
   </w:abstractNum>
-  <w:abstractNum w:abstractNumId="53" w15:restartNumberingAfterBreak="0">
+  <w:abstractNum w:abstractNumId="54" w15:restartNumberingAfterBreak="0">
     <w:nsid w:val="5E802029"/>
     <w:multiLevelType w:val="multilevel"/>
     <w:tmpl w:val="0409001F"/>
@@ -5136,7 +5250,7 @@
       </w:pPr>
     </w:lvl>
   </w:abstractNum>
-  <w:abstractNum w:abstractNumId="54" w15:restartNumberingAfterBreak="0">
+  <w:abstractNum w:abstractNumId="55" w15:restartNumberingAfterBreak="0">
     <w:nsid w:val="64F67F71"/>
     <w:multiLevelType w:val="hybridMultilevel"/>
     <w:tmpl w:val="BCCC962A"/>
@@ -5225,7 +5339,7 @@
       </w:pPr>
     </w:lvl>
   </w:abstractNum>
-  <w:abstractNum w:abstractNumId="55" w15:restartNumberingAfterBreak="0">
+  <w:abstractNum w:abstractNumId="56" w15:restartNumberingAfterBreak="0">
     <w:nsid w:val="675B559B"/>
     <w:multiLevelType w:val="hybridMultilevel"/>
     <w:tmpl w:val="D2E40AF6"/>
@@ -5314,7 +5428,7 @@
       </w:pPr>
     </w:lvl>
   </w:abstractNum>
-  <w:abstractNum w:abstractNumId="56" w15:restartNumberingAfterBreak="0">
+  <w:abstractNum w:abstractNumId="57" w15:restartNumberingAfterBreak="0">
     <w:nsid w:val="6BCB28F7"/>
     <w:multiLevelType w:val="hybridMultilevel"/>
     <w:tmpl w:val="8B1AF07A"/>
@@ -5403,7 +5517,7 @@
       </w:pPr>
     </w:lvl>
   </w:abstractNum>
-  <w:abstractNum w:abstractNumId="57" w15:restartNumberingAfterBreak="0">
+  <w:abstractNum w:abstractNumId="58" w15:restartNumberingAfterBreak="0">
     <w:nsid w:val="6C7D43C2"/>
     <w:multiLevelType w:val="multilevel"/>
     <w:tmpl w:val="E1EC9586"/>
@@ -5543,7 +5657,7 @@
       </w:rPr>
     </w:lvl>
   </w:abstractNum>
-  <w:abstractNum w:abstractNumId="58" w15:restartNumberingAfterBreak="0">
+  <w:abstractNum w:abstractNumId="59" w15:restartNumberingAfterBreak="0">
     <w:nsid w:val="6CE01E01"/>
     <w:multiLevelType w:val="hybridMultilevel"/>
     <w:tmpl w:val="A2B45DDE"/>
@@ -5632,7 +5746,7 @@
       </w:pPr>
     </w:lvl>
   </w:abstractNum>
-  <w:abstractNum w:abstractNumId="59" w15:restartNumberingAfterBreak="0">
+  <w:abstractNum w:abstractNumId="60" w15:restartNumberingAfterBreak="0">
     <w:nsid w:val="6F780EFC"/>
     <w:multiLevelType w:val="hybridMultilevel"/>
     <w:tmpl w:val="36AA8D9E"/>
@@ -5745,7 +5859,7 @@
       </w:rPr>
     </w:lvl>
   </w:abstractNum>
-  <w:abstractNum w:abstractNumId="60" w15:restartNumberingAfterBreak="0">
+  <w:abstractNum w:abstractNumId="61" w15:restartNumberingAfterBreak="0">
     <w:nsid w:val="70720344"/>
     <w:multiLevelType w:val="hybridMultilevel"/>
     <w:tmpl w:val="DE506256"/>
@@ -5834,7 +5948,7 @@
       </w:pPr>
     </w:lvl>
   </w:abstractNum>
-  <w:abstractNum w:abstractNumId="61" w15:restartNumberingAfterBreak="0">
+  <w:abstractNum w:abstractNumId="62" w15:restartNumberingAfterBreak="0">
     <w:nsid w:val="71D71CCC"/>
     <w:multiLevelType w:val="hybridMultilevel"/>
     <w:tmpl w:val="FBCED286"/>
@@ -5923,7 +6037,7 @@
       </w:pPr>
     </w:lvl>
   </w:abstractNum>
-  <w:abstractNum w:abstractNumId="62" w15:restartNumberingAfterBreak="0">
+  <w:abstractNum w:abstractNumId="63" w15:restartNumberingAfterBreak="0">
     <w:nsid w:val="73387463"/>
     <w:multiLevelType w:val="multilevel"/>
     <w:tmpl w:val="9AF0948C"/>
@@ -6036,7 +6150,7 @@
       </w:rPr>
     </w:lvl>
   </w:abstractNum>
-  <w:abstractNum w:abstractNumId="63" w15:restartNumberingAfterBreak="0">
+  <w:abstractNum w:abstractNumId="64" w15:restartNumberingAfterBreak="0">
     <w:nsid w:val="746F2046"/>
     <w:multiLevelType w:val="hybridMultilevel"/>
     <w:tmpl w:val="BA945176"/>
@@ -6125,7 +6239,7 @@
       </w:pPr>
     </w:lvl>
   </w:abstractNum>
-  <w:abstractNum w:abstractNumId="64" w15:restartNumberingAfterBreak="0">
+  <w:abstractNum w:abstractNumId="65" w15:restartNumberingAfterBreak="0">
     <w:nsid w:val="79352AEA"/>
     <w:multiLevelType w:val="hybridMultilevel"/>
     <w:tmpl w:val="334EB83A"/>
@@ -6214,7 +6328,7 @@
       </w:pPr>
     </w:lvl>
   </w:abstractNum>
-  <w:abstractNum w:abstractNumId="65" w15:restartNumberingAfterBreak="0">
+  <w:abstractNum w:abstractNumId="66" w15:restartNumberingAfterBreak="0">
     <w:nsid w:val="79551691"/>
     <w:multiLevelType w:val="hybridMultilevel"/>
     <w:tmpl w:val="CB726154"/>
@@ -6303,7 +6417,7 @@
       </w:pPr>
     </w:lvl>
   </w:abstractNum>
-  <w:abstractNum w:abstractNumId="66" w15:restartNumberingAfterBreak="0">
+  <w:abstractNum w:abstractNumId="67" w15:restartNumberingAfterBreak="0">
     <w:nsid w:val="79E80608"/>
     <w:multiLevelType w:val="hybridMultilevel"/>
     <w:tmpl w:val="07A474F8"/>
@@ -6393,109 +6507,109 @@
     </w:lvl>
   </w:abstractNum>
   <w:num w:numId="1" w16cid:durableId="256212643">
-    <w:abstractNumId w:val="56"/>
+    <w:abstractNumId w:val="57"/>
   </w:num>
   <w:num w:numId="2" w16cid:durableId="843863947">
-    <w:abstractNumId w:val="16"/>
+    <w:abstractNumId w:val="17"/>
   </w:num>
   <w:num w:numId="3" w16cid:durableId="1859273327">
-    <w:abstractNumId w:val="17"/>
+    <w:abstractNumId w:val="18"/>
   </w:num>
   <w:num w:numId="4" w16cid:durableId="1459453479">
     <w:abstractNumId w:val="0"/>
   </w:num>
   <w:num w:numId="5" w16cid:durableId="1905681292">
-    <w:abstractNumId w:val="23"/>
+    <w:abstractNumId w:val="24"/>
   </w:num>
   <w:num w:numId="6" w16cid:durableId="1069964117">
-    <w:abstractNumId w:val="31"/>
+    <w:abstractNumId w:val="32"/>
   </w:num>
   <w:num w:numId="7" w16cid:durableId="195578707">
     <w:abstractNumId w:val="6"/>
   </w:num>
   <w:num w:numId="8" w16cid:durableId="1961762463">
-    <w:abstractNumId w:val="46"/>
+    <w:abstractNumId w:val="47"/>
   </w:num>
   <w:num w:numId="9" w16cid:durableId="1768228453">
-    <w:abstractNumId w:val="24"/>
+    <w:abstractNumId w:val="25"/>
   </w:num>
   <w:num w:numId="10" w16cid:durableId="135998884">
-    <w:abstractNumId w:val="30"/>
+    <w:abstractNumId w:val="31"/>
   </w:num>
   <w:num w:numId="11" w16cid:durableId="466506234">
-    <w:abstractNumId w:val="21"/>
+    <w:abstractNumId w:val="22"/>
   </w:num>
   <w:num w:numId="12" w16cid:durableId="584727594">
-    <w:abstractNumId w:val="57"/>
+    <w:abstractNumId w:val="58"/>
   </w:num>
   <w:num w:numId="13" w16cid:durableId="270361624">
     <w:abstractNumId w:val="2"/>
   </w:num>
   <w:num w:numId="14" w16cid:durableId="701051204">
-    <w:abstractNumId w:val="62"/>
+    <w:abstractNumId w:val="63"/>
   </w:num>
   <w:num w:numId="15" w16cid:durableId="1108352778">
-    <w:abstractNumId w:val="41"/>
+    <w:abstractNumId w:val="42"/>
   </w:num>
   <w:num w:numId="16" w16cid:durableId="1948005820">
-    <w:abstractNumId w:val="64"/>
+    <w:abstractNumId w:val="65"/>
   </w:num>
   <w:num w:numId="17" w16cid:durableId="1003171093">
-    <w:abstractNumId w:val="36"/>
+    <w:abstractNumId w:val="37"/>
   </w:num>
   <w:num w:numId="18" w16cid:durableId="1246233154">
     <w:abstractNumId w:val="11"/>
   </w:num>
   <w:num w:numId="19" w16cid:durableId="673846312">
-    <w:abstractNumId w:val="49"/>
+    <w:abstractNumId w:val="50"/>
   </w:num>
   <w:num w:numId="20" w16cid:durableId="1946183586">
-    <w:abstractNumId w:val="54"/>
+    <w:abstractNumId w:val="55"/>
   </w:num>
   <w:num w:numId="21" w16cid:durableId="130294524">
+    <w:abstractNumId w:val="27"/>
+  </w:num>
+  <w:num w:numId="22" w16cid:durableId="1857111577">
+    <w:abstractNumId w:val="48"/>
+  </w:num>
+  <w:num w:numId="23" w16cid:durableId="1782457513">
+    <w:abstractNumId w:val="44"/>
+  </w:num>
+  <w:num w:numId="24" w16cid:durableId="345711897">
+    <w:abstractNumId w:val="16"/>
+  </w:num>
+  <w:num w:numId="25" w16cid:durableId="1885143424">
+    <w:abstractNumId w:val="28"/>
+  </w:num>
+  <w:num w:numId="26" w16cid:durableId="806124995">
+    <w:abstractNumId w:val="67"/>
+  </w:num>
+  <w:num w:numId="27" w16cid:durableId="8341873">
+    <w:abstractNumId w:val="38"/>
+  </w:num>
+  <w:num w:numId="28" w16cid:durableId="575552810">
+    <w:abstractNumId w:val="36"/>
+  </w:num>
+  <w:num w:numId="29" w16cid:durableId="105196741">
     <w:abstractNumId w:val="26"/>
   </w:num>
-  <w:num w:numId="22" w16cid:durableId="1857111577">
-    <w:abstractNumId w:val="47"/>
-  </w:num>
-  <w:num w:numId="23" w16cid:durableId="1782457513">
-    <w:abstractNumId w:val="43"/>
-  </w:num>
-  <w:num w:numId="24" w16cid:durableId="345711897">
-    <w:abstractNumId w:val="15"/>
-  </w:num>
-  <w:num w:numId="25" w16cid:durableId="1885143424">
-    <w:abstractNumId w:val="27"/>
-  </w:num>
-  <w:num w:numId="26" w16cid:durableId="806124995">
-    <w:abstractNumId w:val="66"/>
-  </w:num>
-  <w:num w:numId="27" w16cid:durableId="8341873">
-    <w:abstractNumId w:val="37"/>
-  </w:num>
-  <w:num w:numId="28" w16cid:durableId="575552810">
-    <w:abstractNumId w:val="35"/>
-  </w:num>
-  <w:num w:numId="29" w16cid:durableId="105196741">
-    <w:abstractNumId w:val="25"/>
-  </w:num>
   <w:num w:numId="30" w16cid:durableId="1479300397">
-    <w:abstractNumId w:val="61"/>
+    <w:abstractNumId w:val="62"/>
   </w:num>
   <w:num w:numId="31" w16cid:durableId="29960902">
-    <w:abstractNumId w:val="28"/>
+    <w:abstractNumId w:val="29"/>
   </w:num>
   <w:num w:numId="32" w16cid:durableId="913782485">
-    <w:abstractNumId w:val="45"/>
+    <w:abstractNumId w:val="46"/>
   </w:num>
   <w:num w:numId="33" w16cid:durableId="1370106582">
     <w:abstractNumId w:val="1"/>
   </w:num>
   <w:num w:numId="34" w16cid:durableId="1914125208">
-    <w:abstractNumId w:val="58"/>
+    <w:abstractNumId w:val="59"/>
   </w:num>
   <w:num w:numId="35" w16cid:durableId="1693722901">
-    <w:abstractNumId w:val="32"/>
+    <w:abstractNumId w:val="33"/>
   </w:num>
   <w:num w:numId="36" w16cid:durableId="1048525874">
     <w:abstractNumId w:val="13"/>
@@ -6504,16 +6618,16 @@
     <w:abstractNumId w:val="8"/>
   </w:num>
   <w:num w:numId="38" w16cid:durableId="406343578">
-    <w:abstractNumId w:val="18"/>
+    <w:abstractNumId w:val="19"/>
   </w:num>
   <w:num w:numId="39" w16cid:durableId="1003122700">
-    <w:abstractNumId w:val="51"/>
+    <w:abstractNumId w:val="52"/>
   </w:num>
   <w:num w:numId="40" w16cid:durableId="1077359595">
     <w:abstractNumId w:val="9"/>
   </w:num>
   <w:num w:numId="41" w16cid:durableId="2100639124">
-    <w:abstractNumId w:val="19"/>
+    <w:abstractNumId w:val="20"/>
   </w:num>
   <w:num w:numId="42" w16cid:durableId="1932617084">
     <w:abstractNumId w:val="4"/>
@@ -6525,73 +6639,76 @@
     <w:abstractNumId w:val="12"/>
   </w:num>
   <w:num w:numId="45" w16cid:durableId="1014381158">
-    <w:abstractNumId w:val="14"/>
+    <w:abstractNumId w:val="15"/>
   </w:num>
   <w:num w:numId="46" w16cid:durableId="843711647">
+    <w:abstractNumId w:val="61"/>
+  </w:num>
+  <w:num w:numId="47" w16cid:durableId="987053659">
     <w:abstractNumId w:val="60"/>
   </w:num>
-  <w:num w:numId="47" w16cid:durableId="987053659">
-    <w:abstractNumId w:val="59"/>
+  <w:num w:numId="48" w16cid:durableId="1639258828">
+    <w:abstractNumId w:val="40"/>
   </w:num>
-  <w:num w:numId="48" w16cid:durableId="1639258828">
+  <w:num w:numId="49" w16cid:durableId="1207833892">
     <w:abstractNumId w:val="39"/>
   </w:num>
-  <w:num w:numId="49" w16cid:durableId="1207833892">
-    <w:abstractNumId w:val="38"/>
-  </w:num>
   <w:num w:numId="50" w16cid:durableId="642082001">
-    <w:abstractNumId w:val="55"/>
+    <w:abstractNumId w:val="56"/>
   </w:num>
   <w:num w:numId="51" w16cid:durableId="1396509661">
-    <w:abstractNumId w:val="42"/>
+    <w:abstractNumId w:val="43"/>
   </w:num>
   <w:num w:numId="52" w16cid:durableId="1415084161">
-    <w:abstractNumId w:val="20"/>
+    <w:abstractNumId w:val="21"/>
   </w:num>
   <w:num w:numId="53" w16cid:durableId="2085518939">
-    <w:abstractNumId w:val="29"/>
+    <w:abstractNumId w:val="30"/>
   </w:num>
   <w:num w:numId="54" w16cid:durableId="1551919221">
-    <w:abstractNumId w:val="48"/>
+    <w:abstractNumId w:val="49"/>
   </w:num>
   <w:num w:numId="55" w16cid:durableId="555092028">
     <w:abstractNumId w:val="3"/>
   </w:num>
   <w:num w:numId="56" w16cid:durableId="1937857212">
-    <w:abstractNumId w:val="40"/>
+    <w:abstractNumId w:val="41"/>
   </w:num>
   <w:num w:numId="57" w16cid:durableId="2138258999">
-    <w:abstractNumId w:val="65"/>
+    <w:abstractNumId w:val="66"/>
   </w:num>
   <w:num w:numId="58" w16cid:durableId="1832526315">
     <w:abstractNumId w:val="5"/>
   </w:num>
   <w:num w:numId="59" w16cid:durableId="279654731">
-    <w:abstractNumId w:val="33"/>
+    <w:abstractNumId w:val="34"/>
   </w:num>
   <w:num w:numId="60" w16cid:durableId="158234867">
-    <w:abstractNumId w:val="34"/>
+    <w:abstractNumId w:val="35"/>
   </w:num>
   <w:num w:numId="61" w16cid:durableId="755858674">
-    <w:abstractNumId w:val="52"/>
+    <w:abstractNumId w:val="53"/>
   </w:num>
   <w:num w:numId="62" w16cid:durableId="1477063418">
-    <w:abstractNumId w:val="63"/>
+    <w:abstractNumId w:val="64"/>
   </w:num>
   <w:num w:numId="63" w16cid:durableId="2001469530">
     <w:abstractNumId w:val="10"/>
   </w:num>
   <w:num w:numId="64" w16cid:durableId="1613853853">
-    <w:abstractNumId w:val="22"/>
+    <w:abstractNumId w:val="23"/>
   </w:num>
   <w:num w:numId="65" w16cid:durableId="1825776060">
-    <w:abstractNumId w:val="53"/>
+    <w:abstractNumId w:val="54"/>
   </w:num>
   <w:num w:numId="66" w16cid:durableId="1241646612">
-    <w:abstractNumId w:val="44"/>
+    <w:abstractNumId w:val="45"/>
   </w:num>
   <w:num w:numId="67" w16cid:durableId="206339062">
-    <w:abstractNumId w:val="50"/>
+    <w:abstractNumId w:val="51"/>
+  </w:num>
+  <w:num w:numId="68" w16cid:durableId="1416394306">
+    <w:abstractNumId w:val="14"/>
   </w:num>
   <w:numIdMacAtCleanup w:val="65"/>
 </w:numbering>
@@ -7041,10 +7158,9 @@
     <w:next w:val="Normal"/>
     <w:link w:val="Heading2Char"/>
     <w:qFormat/>
-    <w:rsid w:val="005A7702"/>
+    <w:rsid w:val="00D34A45"/>
     <w:pPr>
       <w:keepNext/>
-      <w:pageBreakBefore/>
       <w:numPr>
         <w:numId w:val="66"/>
       </w:numPr>
@@ -7252,7 +7368,7 @@
     <w:name w:val="Heading 2 Char"/>
     <w:basedOn w:val="DefaultParagraphFont"/>
     <w:link w:val="Heading2"/>
-    <w:rsid w:val="005A7702"/>
+    <w:rsid w:val="00D34A45"/>
     <w:rPr>
       <w:rFonts w:ascii="Calibri" w:eastAsia="Times New Roman" w:hAnsi="Calibri" w:cstheme="majorBidi"/>
       <w:caps/>
@@ -8125,10 +8241,25 @@
     <w:qFormat/>
     <w:rsid w:val="007D4727"/>
     <w:pPr>
+      <w:spacing w:before="40" w:after="40"/>
+      <w:ind w:left="360" w:hanging="360"/>
+    </w:pPr>
+  </w:style>
+  <w:style w:type="paragraph" w:customStyle="1" w:styleId="DilonStepHeading">
+    <w:name w:val="Dilon Step Heading"/>
+    <w:basedOn w:val="Normal"/>
+    <w:qFormat/>
+    <w:rsid w:val="00F33E93"/>
+  </w:style>
+  <w:style w:type="paragraph" w:customStyle="1" w:styleId="DilonStepClarificationList">
+    <w:name w:val="Dilon Step Clarification List"/>
+    <w:basedOn w:val="ListParagraph"/>
+    <w:qFormat/>
+    <w:rsid w:val="005E482C"/>
+    <w:pPr>
       <w:numPr>
-        <w:numId w:val="67"/>
+        <w:numId w:val="68"/>
       </w:numPr>
-      <w:spacing w:before="40" w:after="40"/>
     </w:pPr>
   </w:style>
 </w:styles>
@@ -8430,6 +8561,18 @@
 </file>
 
 <file path=customXml/item1.xml><?xml version="1.0" encoding="utf-8"?>
+<p:properties xmlns:p="http://schemas.microsoft.com/office/2006/metadata/properties" xmlns:xsi="http://www.w3.org/2001/XMLSchema-instance" xmlns:pc="http://schemas.microsoft.com/office/infopath/2007/PartnerControls">
+  <documentManagement>
+    <TaxCatchAll xmlns="14fbb133-db97-4d09-8590-d31f72208e11" xsi:nil="true"/>
+    <lcf76f155ced4ddcb4097134ff3c332f xmlns="ff91e89a-fa89-409e-b2c2-0afa0b8362dc">
+      <Terms xmlns="http://schemas.microsoft.com/office/infopath/2007/PartnerControls"/>
+    </lcf76f155ced4ddcb4097134ff3c332f>
+    <Index xmlns="ff91e89a-fa89-409e-b2c2-0afa0b8362dc" xsi:nil="true"/>
+  </documentManagement>
+</p:properties>
+</file>
+
+<file path=customXml/item2.xml><?xml version="1.0" encoding="utf-8"?>
 <?mso-contentType ?>
 <FormTemplates xmlns="http://schemas.microsoft.com/sharepoint/v3/contenttype/forms">
   <Display>DocumentLibraryForm</Display>
@@ -8438,11 +8581,11 @@
 </FormTemplates>
 </file>
 
-<file path=customXml/item2.xml><?xml version="1.0" encoding="utf-8"?>
+<file path=customXml/item3.xml><?xml version="1.0" encoding="utf-8"?>
 <b:Sources xmlns:b="http://schemas.openxmlformats.org/officeDocument/2006/bibliography" xmlns="http://schemas.openxmlformats.org/officeDocument/2006/bibliography" SelectedStyle="\APASixthEditionOfficeOnline.xsl" StyleName="APA" Version="6"/>
 </file>
 
-<file path=customXml/item3.xml><?xml version="1.0" encoding="utf-8"?>
+<file path=customXml/item4.xml><?xml version="1.0" encoding="utf-8"?>
 <ct:contentTypeSchema xmlns:ct="http://schemas.microsoft.com/office/2006/metadata/contentType" xmlns:ma="http://schemas.microsoft.com/office/2006/metadata/properties/metaAttributes" ct:_="" ma:_="" ma:contentTypeName="Document" ma:contentTypeID="0x01010097F8571949118944A44552DCE70F9EBD" ma:contentTypeVersion="14" ma:contentTypeDescription="Create a new document." ma:contentTypeScope="" ma:versionID="1baecbd0e49fa7b0dfe9f28182595f2e">
   <xsd:schema xmlns:xsd="http://www.w3.org/2001/XMLSchema" xmlns:xs="http://www.w3.org/2001/XMLSchema" xmlns:p="http://schemas.microsoft.com/office/2006/metadata/properties" xmlns:ns2="ff91e89a-fa89-409e-b2c2-0afa0b8362dc" xmlns:ns3="14fbb133-db97-4d09-8590-d31f72208e11" targetNamespace="http://schemas.microsoft.com/office/2006/metadata/properties" ma:root="true" ma:fieldsID="75805e7a8f6b447aa2bdfad3b9e935b1" ns2:_="" ns3:_="">
     <xsd:import namespace="ff91e89a-fa89-409e-b2c2-0afa0b8362dc"/>
@@ -8649,19 +8792,18 @@
 </ct:contentTypeSchema>
 </file>
 
-<file path=customXml/item4.xml><?xml version="1.0" encoding="utf-8"?>
-<p:properties xmlns:p="http://schemas.microsoft.com/office/2006/metadata/properties" xmlns:xsi="http://www.w3.org/2001/XMLSchema-instance" xmlns:pc="http://schemas.microsoft.com/office/infopath/2007/PartnerControls">
-  <documentManagement>
-    <TaxCatchAll xmlns="14fbb133-db97-4d09-8590-d31f72208e11" xsi:nil="true"/>
-    <lcf76f155ced4ddcb4097134ff3c332f xmlns="ff91e89a-fa89-409e-b2c2-0afa0b8362dc">
-      <Terms xmlns="http://schemas.microsoft.com/office/infopath/2007/PartnerControls"/>
-    </lcf76f155ced4ddcb4097134ff3c332f>
-    <Index xmlns="ff91e89a-fa89-409e-b2c2-0afa0b8362dc" xsi:nil="true"/>
-  </documentManagement>
-</p:properties>
+<file path=customXml/itemProps1.xml><?xml version="1.0" encoding="utf-8"?>
+<ds:datastoreItem xmlns:ds="http://schemas.openxmlformats.org/officeDocument/2006/customXml" ds:itemID="{D1B430AD-7F5E-4A6C-AC1E-18B5A5C8823C}">
+  <ds:schemaRefs>
+    <ds:schemaRef ds:uri="http://schemas.microsoft.com/office/2006/metadata/properties"/>
+    <ds:schemaRef ds:uri="http://schemas.microsoft.com/office/infopath/2007/PartnerControls"/>
+    <ds:schemaRef ds:uri="14fbb133-db97-4d09-8590-d31f72208e11"/>
+    <ds:schemaRef ds:uri="ff91e89a-fa89-409e-b2c2-0afa0b8362dc"/>
+  </ds:schemaRefs>
+</ds:datastoreItem>
 </file>
 
-<file path=customXml/itemProps1.xml><?xml version="1.0" encoding="utf-8"?>
+<file path=customXml/itemProps2.xml><?xml version="1.0" encoding="utf-8"?>
 <ds:datastoreItem xmlns:ds="http://schemas.openxmlformats.org/officeDocument/2006/customXml" ds:itemID="{F43CE1E5-002C-49C3-ABAF-F4181BBA83E9}">
   <ds:schemaRefs>
     <ds:schemaRef ds:uri="http://schemas.microsoft.com/sharepoint/v3/contenttype/forms"/>
@@ -8669,7 +8811,7 @@
 </ds:datastoreItem>
 </file>
 
-<file path=customXml/itemProps2.xml><?xml version="1.0" encoding="utf-8"?>
+<file path=customXml/itemProps3.xml><?xml version="1.0" encoding="utf-8"?>
 <ds:datastoreItem xmlns:ds="http://schemas.openxmlformats.org/officeDocument/2006/customXml" ds:itemID="{79F96F0D-53C7-457F-BF3B-DB3D5A728589}">
   <ds:schemaRefs>
     <ds:schemaRef ds:uri="http://schemas.openxmlformats.org/officeDocument/2006/bibliography"/>
@@ -8677,7 +8819,7 @@
 </ds:datastoreItem>
 </file>
 
-<file path=customXml/itemProps3.xml><?xml version="1.0" encoding="utf-8"?>
+<file path=customXml/itemProps4.xml><?xml version="1.0" encoding="utf-8"?>
 <ds:datastoreItem xmlns:ds="http://schemas.openxmlformats.org/officeDocument/2006/customXml" ds:itemID="{3E5D323C-384B-42D5-B47B-6F44F9FD8BE0}">
   <ds:schemaRefs>
     <ds:schemaRef ds:uri="http://schemas.microsoft.com/office/2006/metadata/contentType"/>
@@ -8694,15 +8836,4 @@
     <ds:schemaRef ds:uri="http://schemas.microsoft.com/internal/obd"/>
   </ds:schemaRefs>
 </ds:datastoreItem>
-</file>
-
-<file path=customXml/itemProps4.xml><?xml version="1.0" encoding="utf-8"?>
-<ds:datastoreItem xmlns:ds="http://schemas.openxmlformats.org/officeDocument/2006/customXml" ds:itemID="{D1B430AD-7F5E-4A6C-AC1E-18B5A5C8823C}">
-  <ds:schemaRefs>
-    <ds:schemaRef ds:uri="http://schemas.microsoft.com/office/2006/metadata/properties"/>
-    <ds:schemaRef ds:uri="http://schemas.microsoft.com/office/infopath/2007/PartnerControls"/>
-    <ds:schemaRef ds:uri="14fbb133-db97-4d09-8590-d31f72208e11"/>
-    <ds:schemaRef ds:uri="ff91e89a-fa89-409e-b2c2-0afa0b8362dc"/>
-  </ds:schemaRefs>
-</ds:datastoreItem>
 </file>
</xml_diff>

<commit_message>
feat: variable-length signature approvers, TOC page break, template fixes
- Replace fixed regulatory_rep/quality_rep front matter with a
  variable-length signature_fields list (department/name pairs) across
  the writer/form-writer templates, compiler, and extractor
- Force a page break immediately after the compiled table of contents
- Fix STYLEREF/SEQ field corruption when resolving xrefs on
  field-numbered step headings
- Wire numbering onto the base template's Dilon Step Clarification
  List style and shrink its indent from 1"/0.5" to 0.25"/0.25" hanging

Co-Authored-By: Claude Sonnet 5 <noreply@anthropic.com>
</commit_message>
<xml_diff>
--- a/templates/TEMPLATE_Word_Base.docx
+++ b/templates/TEMPLATE_Word_Base.docx
@@ -1342,15 +1342,15 @@
   <w:abstractNum w:abstractNumId="14" w15:restartNumberingAfterBreak="0">
     <w:nsid w:val="0C95591C"/>
     <w:multiLevelType w:val="multilevel"/>
-    <w:tmpl w:val="B1824F7A"/>
+    <w:tmpl w:val="4CE0B5A0"/>
     <w:lvl w:ilvl="0">
       <w:start w:val="1"/>
-      <w:numFmt w:val="lowerLetter"/>
-      <w:pStyle w:val="DilonStepClarificationList"/>
-      <w:lvlText w:val="%1."/>
-      <w:lvlJc w:val="left"/>
-      <w:pPr>
-        <w:ind w:left="720" w:hanging="360"/>
+      <w:numFmt w:val="decimal"/>
+      <w:pStyle w:val="Heading2"/>
+      <w:lvlText w:val="%1"/>
+      <w:lvlJc w:val="left"/>
+      <w:pPr>
+        <w:ind w:left="360" w:hanging="360"/>
       </w:pPr>
       <w:rPr>
         <w:rFonts w:hint="default"/>
@@ -1359,10 +1359,11 @@
     <w:lvl w:ilvl="1">
       <w:start w:val="1"/>
       <w:numFmt w:val="decimal"/>
-      <w:lvlText w:val="%1.%2."/>
-      <w:lvlJc w:val="left"/>
-      <w:pPr>
-        <w:ind w:left="720" w:hanging="360"/>
+      <w:pStyle w:val="Heading3"/>
+      <w:lvlText w:val="%1.%2"/>
+      <w:lvlJc w:val="left"/>
+      <w:pPr>
+        <w:ind w:left="720" w:hanging="720"/>
       </w:pPr>
       <w:rPr>
         <w:rFonts w:hint="default"/>
@@ -1370,11 +1371,12 @@
     </w:lvl>
     <w:lvl w:ilvl="2">
       <w:start w:val="1"/>
-      <w:numFmt w:val="lowerRoman"/>
-      <w:lvlText w:val="%3)"/>
-      <w:lvlJc w:val="left"/>
-      <w:pPr>
-        <w:ind w:left="1080" w:hanging="360"/>
+      <w:numFmt w:val="decimal"/>
+      <w:pStyle w:val="Heading4"/>
+      <w:lvlText w:val="%1.%2.%3"/>
+      <w:lvlJc w:val="left"/>
+      <w:pPr>
+        <w:ind w:left="720" w:hanging="720"/>
       </w:pPr>
       <w:rPr>
         <w:rFonts w:hint="default"/>
@@ -1383,10 +1385,11 @@
     <w:lvl w:ilvl="3">
       <w:start w:val="1"/>
       <w:numFmt w:val="decimal"/>
-      <w:lvlText w:val="(%4)"/>
-      <w:lvlJc w:val="left"/>
-      <w:pPr>
-        <w:ind w:left="1440" w:hanging="360"/>
+      <w:pStyle w:val="Heading5"/>
+      <w:lvlText w:val="%1.%2.%3.%4"/>
+      <w:lvlJc w:val="left"/>
+      <w:pPr>
+        <w:ind w:left="1440" w:hanging="720"/>
       </w:pPr>
       <w:rPr>
         <w:rFonts w:hint="default"/>
@@ -1394,11 +1397,12 @@
     </w:lvl>
     <w:lvl w:ilvl="4">
       <w:start w:val="1"/>
-      <w:numFmt w:val="lowerLetter"/>
-      <w:lvlText w:val="(%5)"/>
-      <w:lvlJc w:val="left"/>
-      <w:pPr>
-        <w:ind w:left="1800" w:hanging="360"/>
+      <w:numFmt w:val="decimal"/>
+      <w:pStyle w:val="Heading6"/>
+      <w:lvlText w:val="%1.%2.%3.%4.%5"/>
+      <w:lvlJc w:val="left"/>
+      <w:pPr>
+        <w:ind w:left="2160" w:hanging="720"/>
       </w:pPr>
       <w:rPr>
         <w:rFonts w:hint="default"/>
@@ -1406,11 +1410,12 @@
     </w:lvl>
     <w:lvl w:ilvl="5">
       <w:start w:val="1"/>
-      <w:numFmt w:val="lowerRoman"/>
-      <w:lvlText w:val="(%6)"/>
-      <w:lvlJc w:val="left"/>
-      <w:pPr>
-        <w:ind w:left="2160" w:hanging="360"/>
+      <w:numFmt w:val="decimal"/>
+      <w:pStyle w:val="Heading7"/>
+      <w:lvlText w:val="%1.%2.%3.%4.%5.%6"/>
+      <w:lvlJc w:val="left"/>
+      <w:pPr>
+        <w:ind w:left="2880" w:hanging="720"/>
       </w:pPr>
       <w:rPr>
         <w:rFonts w:hint="default"/>
@@ -1419,10 +1424,13 @@
     <w:lvl w:ilvl="6">
       <w:start w:val="1"/>
       <w:numFmt w:val="decimal"/>
-      <w:lvlText w:val="%7."/>
-      <w:lvlJc w:val="left"/>
-      <w:pPr>
-        <w:ind w:left="2520" w:hanging="360"/>
+      <w:lvlText w:val="%1.%2.%3.%4.%5.%6.%7"/>
+      <w:lvlJc w:val="left"/>
+      <w:pPr>
+        <w:tabs>
+          <w:tab w:val="num" w:pos="2880"/>
+        </w:tabs>
+        <w:ind w:left="3600" w:hanging="720"/>
       </w:pPr>
       <w:rPr>
         <w:rFonts w:hint="default"/>
@@ -1430,11 +1438,14 @@
     </w:lvl>
     <w:lvl w:ilvl="7">
       <w:start w:val="1"/>
-      <w:numFmt w:val="lowerLetter"/>
-      <w:lvlText w:val="%8."/>
-      <w:lvlJc w:val="left"/>
-      <w:pPr>
-        <w:ind w:left="2880" w:hanging="360"/>
+      <w:numFmt w:val="decimal"/>
+      <w:lvlText w:val="%1.%2.%3.%4.%5.%6.%7.%8"/>
+      <w:lvlJc w:val="left"/>
+      <w:pPr>
+        <w:tabs>
+          <w:tab w:val="num" w:pos="3600"/>
+        </w:tabs>
+        <w:ind w:left="4320" w:hanging="720"/>
       </w:pPr>
       <w:rPr>
         <w:rFonts w:hint="default"/>
@@ -1442,11 +1453,11 @@
     </w:lvl>
     <w:lvl w:ilvl="8">
       <w:start w:val="1"/>
-      <w:numFmt w:val="lowerRoman"/>
-      <w:lvlText w:val="%9."/>
-      <w:lvlJc w:val="left"/>
-      <w:pPr>
-        <w:ind w:left="3240" w:hanging="360"/>
+      <w:numFmt w:val="decimal"/>
+      <w:lvlText w:val="%1.%2.%3.%4.%5.%6.%7.%8.%9"/>
+      <w:lvlJc w:val="left"/>
+      <w:pPr>
+        <w:ind w:left="5040" w:hanging="720"/>
       </w:pPr>
       <w:rPr>
         <w:rFonts w:hint="default"/>
@@ -4213,11 +4224,10 @@
   <w:abstractNum w:abstractNumId="45" w15:restartNumberingAfterBreak="0">
     <w:nsid w:val="54034C84"/>
     <w:multiLevelType w:val="multilevel"/>
-    <w:tmpl w:val="EAF0A91E"/>
+    <w:tmpl w:val="E18E924C"/>
     <w:lvl w:ilvl="0">
       <w:start w:val="1"/>
       <w:numFmt w:val="decimal"/>
-      <w:pStyle w:val="Heading2"/>
       <w:lvlText w:val="%1."/>
       <w:lvlJc w:val="left"/>
       <w:pPr>
@@ -4230,7 +4240,6 @@
     <w:lvl w:ilvl="1">
       <w:start w:val="1"/>
       <w:numFmt w:val="decimal"/>
-      <w:pStyle w:val="Heading3"/>
       <w:lvlText w:val="%1.%2 "/>
       <w:lvlJc w:val="left"/>
       <w:pPr>
@@ -4243,7 +4252,6 @@
     <w:lvl w:ilvl="2">
       <w:start w:val="1"/>
       <w:numFmt w:val="decimal"/>
-      <w:pStyle w:val="Heading4"/>
       <w:lvlText w:val="%1.%2.%3"/>
       <w:lvlJc w:val="left"/>
       <w:pPr>
@@ -4256,7 +4264,6 @@
     <w:lvl w:ilvl="3">
       <w:start w:val="1"/>
       <w:numFmt w:val="decimal"/>
-      <w:pStyle w:val="Heading5"/>
       <w:lvlText w:val="%1.%2.%3.%4"/>
       <w:lvlJc w:val="left"/>
       <w:pPr>
@@ -4269,7 +4276,6 @@
     <w:lvl w:ilvl="4">
       <w:start w:val="1"/>
       <w:numFmt w:val="decimal"/>
-      <w:pStyle w:val="Heading6"/>
       <w:lvlText w:val="%1.%2.%3.%4.%5"/>
       <w:lvlJc w:val="left"/>
       <w:pPr>
@@ -4282,7 +4288,6 @@
     <w:lvl w:ilvl="5">
       <w:start w:val="1"/>
       <w:numFmt w:val="decimal"/>
-      <w:pStyle w:val="Heading7"/>
       <w:lvlText w:val="%1.%2.%3.%4.%5.%6"/>
       <w:lvlJc w:val="left"/>
       <w:pPr>
@@ -4671,6 +4676,120 @@
     </w:lvl>
   </w:abstractNum>
   <w:abstractNum w:abstractNumId="49" w15:restartNumberingAfterBreak="0">
+    <w:nsid w:val="57F52640"/>
+    <w:multiLevelType w:val="multilevel"/>
+    <w:tmpl w:val="12FC9156"/>
+    <w:lvl w:ilvl="0">
+      <w:start w:val="1"/>
+      <w:numFmt w:val="lowerLetter"/>
+      <w:pStyle w:val="DilonStepClarificationList"/>
+      <w:lvlText w:val="%1."/>
+      <w:lvlJc w:val="left"/>
+      <w:pPr>
+        <w:ind w:left="1440" w:hanging="720"/>
+      </w:pPr>
+      <w:rPr>
+        <w:rFonts w:hint="default"/>
+      </w:rPr>
+    </w:lvl>
+    <w:lvl w:ilvl="1">
+      <w:start w:val="1"/>
+      <w:numFmt w:val="lowerLetter"/>
+      <w:lvlText w:val="%2."/>
+      <w:lvlJc w:val="left"/>
+      <w:pPr>
+        <w:ind w:left="1800" w:hanging="720"/>
+      </w:pPr>
+      <w:rPr>
+        <w:rFonts w:hint="default"/>
+      </w:rPr>
+    </w:lvl>
+    <w:lvl w:ilvl="2">
+      <w:start w:val="1"/>
+      <w:numFmt w:val="lowerRoman"/>
+      <w:lvlText w:val="%3."/>
+      <w:lvlJc w:val="right"/>
+      <w:pPr>
+        <w:ind w:left="2160" w:hanging="180"/>
+      </w:pPr>
+      <w:rPr>
+        <w:rFonts w:hint="default"/>
+      </w:rPr>
+    </w:lvl>
+    <w:lvl w:ilvl="3">
+      <w:start w:val="1"/>
+      <w:numFmt w:val="decimal"/>
+      <w:lvlText w:val="%4."/>
+      <w:lvlJc w:val="left"/>
+      <w:pPr>
+        <w:ind w:left="2880" w:hanging="360"/>
+      </w:pPr>
+      <w:rPr>
+        <w:rFonts w:hint="default"/>
+      </w:rPr>
+    </w:lvl>
+    <w:lvl w:ilvl="4">
+      <w:start w:val="1"/>
+      <w:numFmt w:val="lowerLetter"/>
+      <w:lvlText w:val="%5."/>
+      <w:lvlJc w:val="left"/>
+      <w:pPr>
+        <w:ind w:left="3600" w:hanging="360"/>
+      </w:pPr>
+      <w:rPr>
+        <w:rFonts w:hint="default"/>
+      </w:rPr>
+    </w:lvl>
+    <w:lvl w:ilvl="5">
+      <w:start w:val="1"/>
+      <w:numFmt w:val="lowerRoman"/>
+      <w:lvlText w:val="%6."/>
+      <w:lvlJc w:val="right"/>
+      <w:pPr>
+        <w:ind w:left="4320" w:hanging="180"/>
+      </w:pPr>
+      <w:rPr>
+        <w:rFonts w:hint="default"/>
+      </w:rPr>
+    </w:lvl>
+    <w:lvl w:ilvl="6">
+      <w:start w:val="1"/>
+      <w:numFmt w:val="decimal"/>
+      <w:lvlText w:val="%7."/>
+      <w:lvlJc w:val="left"/>
+      <w:pPr>
+        <w:ind w:left="5040" w:hanging="360"/>
+      </w:pPr>
+      <w:rPr>
+        <w:rFonts w:hint="default"/>
+      </w:rPr>
+    </w:lvl>
+    <w:lvl w:ilvl="7">
+      <w:start w:val="1"/>
+      <w:numFmt w:val="lowerLetter"/>
+      <w:lvlText w:val="%8."/>
+      <w:lvlJc w:val="left"/>
+      <w:pPr>
+        <w:ind w:left="5760" w:hanging="360"/>
+      </w:pPr>
+      <w:rPr>
+        <w:rFonts w:hint="default"/>
+      </w:rPr>
+    </w:lvl>
+    <w:lvl w:ilvl="8">
+      <w:start w:val="1"/>
+      <w:numFmt w:val="lowerRoman"/>
+      <w:lvlText w:val="%9."/>
+      <w:lvlJc w:val="right"/>
+      <w:pPr>
+        <w:ind w:left="6480" w:hanging="180"/>
+      </w:pPr>
+      <w:rPr>
+        <w:rFonts w:hint="default"/>
+      </w:rPr>
+    </w:lvl>
+  </w:abstractNum>
+  <w:abstractNum w:abstractNumId="50" w15:restartNumberingAfterBreak="0">
     <w:nsid w:val="588A5DC1"/>
     <w:multiLevelType w:val="hybridMultilevel"/>
     <w:tmpl w:val="68BEC2E0"/>
@@ -4783,7 +4902,7 @@
       </w:rPr>
     </w:lvl>
   </w:abstractNum>
-  <w:abstractNum w:abstractNumId="50" w15:restartNumberingAfterBreak="0">
+  <w:abstractNum w:abstractNumId="51" w15:restartNumberingAfterBreak="0">
     <w:nsid w:val="58B306F4"/>
     <w:multiLevelType w:val="hybridMultilevel"/>
     <w:tmpl w:val="BB649AB8"/>
@@ -4872,7 +4991,7 @@
       </w:pPr>
     </w:lvl>
   </w:abstractNum>
-  <w:abstractNum w:abstractNumId="51" w15:restartNumberingAfterBreak="0">
+  <w:abstractNum w:abstractNumId="52" w15:restartNumberingAfterBreak="0">
     <w:nsid w:val="5D1249F2"/>
     <w:multiLevelType w:val="multilevel"/>
     <w:tmpl w:val="B7DCE9BC"/>
@@ -4986,7 +5105,7 @@
       </w:rPr>
     </w:lvl>
   </w:abstractNum>
-  <w:abstractNum w:abstractNumId="52" w15:restartNumberingAfterBreak="0">
+  <w:abstractNum w:abstractNumId="53" w15:restartNumberingAfterBreak="0">
     <w:nsid w:val="5D85070E"/>
     <w:multiLevelType w:val="hybridMultilevel"/>
     <w:tmpl w:val="C7689C94"/>
@@ -5075,7 +5194,7 @@
       </w:pPr>
     </w:lvl>
   </w:abstractNum>
-  <w:abstractNum w:abstractNumId="53" w15:restartNumberingAfterBreak="0">
+  <w:abstractNum w:abstractNumId="54" w15:restartNumberingAfterBreak="0">
     <w:nsid w:val="5E720785"/>
     <w:multiLevelType w:val="hybridMultilevel"/>
     <w:tmpl w:val="BA945176"/>
@@ -5164,7 +5283,7 @@
       </w:pPr>
     </w:lvl>
   </w:abstractNum>
-  <w:abstractNum w:abstractNumId="54" w15:restartNumberingAfterBreak="0">
+  <w:abstractNum w:abstractNumId="55" w15:restartNumberingAfterBreak="0">
     <w:nsid w:val="5E802029"/>
     <w:multiLevelType w:val="multilevel"/>
     <w:tmpl w:val="0409001F"/>
@@ -5250,7 +5369,7 @@
       </w:pPr>
     </w:lvl>
   </w:abstractNum>
-  <w:abstractNum w:abstractNumId="55" w15:restartNumberingAfterBreak="0">
+  <w:abstractNum w:abstractNumId="56" w15:restartNumberingAfterBreak="0">
     <w:nsid w:val="64F67F71"/>
     <w:multiLevelType w:val="hybridMultilevel"/>
     <w:tmpl w:val="BCCC962A"/>
@@ -5339,7 +5458,7 @@
       </w:pPr>
     </w:lvl>
   </w:abstractNum>
-  <w:abstractNum w:abstractNumId="56" w15:restartNumberingAfterBreak="0">
+  <w:abstractNum w:abstractNumId="57" w15:restartNumberingAfterBreak="0">
     <w:nsid w:val="675B559B"/>
     <w:multiLevelType w:val="hybridMultilevel"/>
     <w:tmpl w:val="D2E40AF6"/>
@@ -5428,7 +5547,7 @@
       </w:pPr>
     </w:lvl>
   </w:abstractNum>
-  <w:abstractNum w:abstractNumId="57" w15:restartNumberingAfterBreak="0">
+  <w:abstractNum w:abstractNumId="58" w15:restartNumberingAfterBreak="0">
     <w:nsid w:val="6BCB28F7"/>
     <w:multiLevelType w:val="hybridMultilevel"/>
     <w:tmpl w:val="8B1AF07A"/>
@@ -5517,7 +5636,7 @@
       </w:pPr>
     </w:lvl>
   </w:abstractNum>
-  <w:abstractNum w:abstractNumId="58" w15:restartNumberingAfterBreak="0">
+  <w:abstractNum w:abstractNumId="59" w15:restartNumberingAfterBreak="0">
     <w:nsid w:val="6C7D43C2"/>
     <w:multiLevelType w:val="multilevel"/>
     <w:tmpl w:val="E1EC9586"/>
@@ -5657,7 +5776,7 @@
       </w:rPr>
     </w:lvl>
   </w:abstractNum>
-  <w:abstractNum w:abstractNumId="59" w15:restartNumberingAfterBreak="0">
+  <w:abstractNum w:abstractNumId="60" w15:restartNumberingAfterBreak="0">
     <w:nsid w:val="6CE01E01"/>
     <w:multiLevelType w:val="hybridMultilevel"/>
     <w:tmpl w:val="A2B45DDE"/>
@@ -5746,7 +5865,7 @@
       </w:pPr>
     </w:lvl>
   </w:abstractNum>
-  <w:abstractNum w:abstractNumId="60" w15:restartNumberingAfterBreak="0">
+  <w:abstractNum w:abstractNumId="61" w15:restartNumberingAfterBreak="0">
     <w:nsid w:val="6F780EFC"/>
     <w:multiLevelType w:val="hybridMultilevel"/>
     <w:tmpl w:val="36AA8D9E"/>
@@ -5859,7 +5978,7 @@
       </w:rPr>
     </w:lvl>
   </w:abstractNum>
-  <w:abstractNum w:abstractNumId="61" w15:restartNumberingAfterBreak="0">
+  <w:abstractNum w:abstractNumId="62" w15:restartNumberingAfterBreak="0">
     <w:nsid w:val="70720344"/>
     <w:multiLevelType w:val="hybridMultilevel"/>
     <w:tmpl w:val="DE506256"/>
@@ -5948,7 +6067,7 @@
       </w:pPr>
     </w:lvl>
   </w:abstractNum>
-  <w:abstractNum w:abstractNumId="62" w15:restartNumberingAfterBreak="0">
+  <w:abstractNum w:abstractNumId="63" w15:restartNumberingAfterBreak="0">
     <w:nsid w:val="71D71CCC"/>
     <w:multiLevelType w:val="hybridMultilevel"/>
     <w:tmpl w:val="FBCED286"/>
@@ -6037,7 +6156,7 @@
       </w:pPr>
     </w:lvl>
   </w:abstractNum>
-  <w:abstractNum w:abstractNumId="63" w15:restartNumberingAfterBreak="0">
+  <w:abstractNum w:abstractNumId="64" w15:restartNumberingAfterBreak="0">
     <w:nsid w:val="73387463"/>
     <w:multiLevelType w:val="multilevel"/>
     <w:tmpl w:val="9AF0948C"/>
@@ -6150,7 +6269,7 @@
       </w:rPr>
     </w:lvl>
   </w:abstractNum>
-  <w:abstractNum w:abstractNumId="64" w15:restartNumberingAfterBreak="0">
+  <w:abstractNum w:abstractNumId="65" w15:restartNumberingAfterBreak="0">
     <w:nsid w:val="746F2046"/>
     <w:multiLevelType w:val="hybridMultilevel"/>
     <w:tmpl w:val="BA945176"/>
@@ -6239,7 +6358,7 @@
       </w:pPr>
     </w:lvl>
   </w:abstractNum>
-  <w:abstractNum w:abstractNumId="65" w15:restartNumberingAfterBreak="0">
+  <w:abstractNum w:abstractNumId="66" w15:restartNumberingAfterBreak="0">
     <w:nsid w:val="79352AEA"/>
     <w:multiLevelType w:val="hybridMultilevel"/>
     <w:tmpl w:val="334EB83A"/>
@@ -6328,7 +6447,7 @@
       </w:pPr>
     </w:lvl>
   </w:abstractNum>
-  <w:abstractNum w:abstractNumId="66" w15:restartNumberingAfterBreak="0">
+  <w:abstractNum w:abstractNumId="67" w15:restartNumberingAfterBreak="0">
     <w:nsid w:val="79551691"/>
     <w:multiLevelType w:val="hybridMultilevel"/>
     <w:tmpl w:val="CB726154"/>
@@ -6417,7 +6536,7 @@
       </w:pPr>
     </w:lvl>
   </w:abstractNum>
-  <w:abstractNum w:abstractNumId="67" w15:restartNumberingAfterBreak="0">
+  <w:abstractNum w:abstractNumId="68" w15:restartNumberingAfterBreak="0">
     <w:nsid w:val="79E80608"/>
     <w:multiLevelType w:val="hybridMultilevel"/>
     <w:tmpl w:val="07A474F8"/>
@@ -6507,7 +6626,7 @@
     </w:lvl>
   </w:abstractNum>
   <w:num w:numId="1" w16cid:durableId="256212643">
-    <w:abstractNumId w:val="57"/>
+    <w:abstractNumId w:val="58"/>
   </w:num>
   <w:num w:numId="2" w16cid:durableId="843863947">
     <w:abstractNumId w:val="17"/>
@@ -6540,19 +6659,19 @@
     <w:abstractNumId w:val="22"/>
   </w:num>
   <w:num w:numId="12" w16cid:durableId="584727594">
-    <w:abstractNumId w:val="58"/>
+    <w:abstractNumId w:val="59"/>
   </w:num>
   <w:num w:numId="13" w16cid:durableId="270361624">
     <w:abstractNumId w:val="2"/>
   </w:num>
   <w:num w:numId="14" w16cid:durableId="701051204">
-    <w:abstractNumId w:val="63"/>
+    <w:abstractNumId w:val="64"/>
   </w:num>
   <w:num w:numId="15" w16cid:durableId="1108352778">
     <w:abstractNumId w:val="42"/>
   </w:num>
   <w:num w:numId="16" w16cid:durableId="1948005820">
-    <w:abstractNumId w:val="65"/>
+    <w:abstractNumId w:val="66"/>
   </w:num>
   <w:num w:numId="17" w16cid:durableId="1003171093">
     <w:abstractNumId w:val="37"/>
@@ -6561,10 +6680,10 @@
     <w:abstractNumId w:val="11"/>
   </w:num>
   <w:num w:numId="19" w16cid:durableId="673846312">
-    <w:abstractNumId w:val="50"/>
+    <w:abstractNumId w:val="51"/>
   </w:num>
   <w:num w:numId="20" w16cid:durableId="1946183586">
-    <w:abstractNumId w:val="55"/>
+    <w:abstractNumId w:val="56"/>
   </w:num>
   <w:num w:numId="21" w16cid:durableId="130294524">
     <w:abstractNumId w:val="27"/>
@@ -6582,7 +6701,7 @@
     <w:abstractNumId w:val="28"/>
   </w:num>
   <w:num w:numId="26" w16cid:durableId="806124995">
-    <w:abstractNumId w:val="67"/>
+    <w:abstractNumId w:val="68"/>
   </w:num>
   <w:num w:numId="27" w16cid:durableId="8341873">
     <w:abstractNumId w:val="38"/>
@@ -6594,7 +6713,7 @@
     <w:abstractNumId w:val="26"/>
   </w:num>
   <w:num w:numId="30" w16cid:durableId="1479300397">
-    <w:abstractNumId w:val="62"/>
+    <w:abstractNumId w:val="63"/>
   </w:num>
   <w:num w:numId="31" w16cid:durableId="29960902">
     <w:abstractNumId w:val="29"/>
@@ -6606,7 +6725,7 @@
     <w:abstractNumId w:val="1"/>
   </w:num>
   <w:num w:numId="34" w16cid:durableId="1914125208">
-    <w:abstractNumId w:val="59"/>
+    <w:abstractNumId w:val="60"/>
   </w:num>
   <w:num w:numId="35" w16cid:durableId="1693722901">
     <w:abstractNumId w:val="33"/>
@@ -6621,7 +6740,7 @@
     <w:abstractNumId w:val="19"/>
   </w:num>
   <w:num w:numId="39" w16cid:durableId="1003122700">
-    <w:abstractNumId w:val="52"/>
+    <w:abstractNumId w:val="53"/>
   </w:num>
   <w:num w:numId="40" w16cid:durableId="1077359595">
     <w:abstractNumId w:val="9"/>
@@ -6642,10 +6761,10 @@
     <w:abstractNumId w:val="15"/>
   </w:num>
   <w:num w:numId="46" w16cid:durableId="843711647">
-    <w:abstractNumId w:val="61"/>
+    <w:abstractNumId w:val="62"/>
   </w:num>
   <w:num w:numId="47" w16cid:durableId="987053659">
-    <w:abstractNumId w:val="60"/>
+    <w:abstractNumId w:val="61"/>
   </w:num>
   <w:num w:numId="48" w16cid:durableId="1639258828">
     <w:abstractNumId w:val="40"/>
@@ -6654,7 +6773,7 @@
     <w:abstractNumId w:val="39"/>
   </w:num>
   <w:num w:numId="50" w16cid:durableId="642082001">
-    <w:abstractNumId w:val="56"/>
+    <w:abstractNumId w:val="57"/>
   </w:num>
   <w:num w:numId="51" w16cid:durableId="1396509661">
     <w:abstractNumId w:val="43"/>
@@ -6666,7 +6785,7 @@
     <w:abstractNumId w:val="30"/>
   </w:num>
   <w:num w:numId="54" w16cid:durableId="1551919221">
-    <w:abstractNumId w:val="49"/>
+    <w:abstractNumId w:val="50"/>
   </w:num>
   <w:num w:numId="55" w16cid:durableId="555092028">
     <w:abstractNumId w:val="3"/>
@@ -6675,7 +6794,7 @@
     <w:abstractNumId w:val="41"/>
   </w:num>
   <w:num w:numId="57" w16cid:durableId="2138258999">
-    <w:abstractNumId w:val="66"/>
+    <w:abstractNumId w:val="67"/>
   </w:num>
   <w:num w:numId="58" w16cid:durableId="1832526315">
     <w:abstractNumId w:val="5"/>
@@ -6687,10 +6806,10 @@
     <w:abstractNumId w:val="35"/>
   </w:num>
   <w:num w:numId="61" w16cid:durableId="755858674">
-    <w:abstractNumId w:val="53"/>
+    <w:abstractNumId w:val="54"/>
   </w:num>
   <w:num w:numId="62" w16cid:durableId="1477063418">
-    <w:abstractNumId w:val="64"/>
+    <w:abstractNumId w:val="65"/>
   </w:num>
   <w:num w:numId="63" w16cid:durableId="2001469530">
     <w:abstractNumId w:val="10"/>
@@ -6699,16 +6818,19 @@
     <w:abstractNumId w:val="23"/>
   </w:num>
   <w:num w:numId="65" w16cid:durableId="1825776060">
-    <w:abstractNumId w:val="54"/>
+    <w:abstractNumId w:val="55"/>
   </w:num>
   <w:num w:numId="66" w16cid:durableId="1241646612">
     <w:abstractNumId w:val="45"/>
   </w:num>
   <w:num w:numId="67" w16cid:durableId="206339062">
-    <w:abstractNumId w:val="51"/>
+    <w:abstractNumId w:val="52"/>
   </w:num>
   <w:num w:numId="68" w16cid:durableId="1416394306">
     <w:abstractNumId w:val="14"/>
+  </w:num>
+  <w:num w:numId="69" w16cid:durableId="1040669236">
+    <w:abstractNumId w:val="49"/>
   </w:num>
   <w:numIdMacAtCleanup w:val="65"/>
 </w:numbering>
@@ -7158,19 +7280,19 @@
     <w:next w:val="Normal"/>
     <w:link w:val="Heading2Char"/>
     <w:qFormat/>
-    <w:rsid w:val="00D34A45"/>
+    <w:rsid w:val="0091386F"/>
     <w:pPr>
       <w:keepNext/>
       <w:numPr>
-        <w:numId w:val="66"/>
+        <w:numId w:val="68"/>
       </w:numPr>
-      <w:spacing w:before="240"/>
       <w:outlineLvl w:val="1"/>
     </w:pPr>
     <w:rPr>
       <w:rFonts w:cstheme="majorBidi"/>
+      <w:b/>
       <w:caps/>
-      <w:sz w:val="40"/>
+      <w:sz w:val="28"/>
       <w:szCs w:val="24"/>
     </w:rPr>
   </w:style>
@@ -7182,21 +7304,23 @@
     <w:uiPriority w:val="99"/>
     <w:unhideWhenUsed/>
     <w:qFormat/>
-    <w:rsid w:val="00B32420"/>
+    <w:rsid w:val="0091386F"/>
     <w:pPr>
       <w:keepNext/>
-      <w:keepLines/>
       <w:numPr>
         <w:ilvl w:val="1"/>
-        <w:numId w:val="66"/>
+        <w:numId w:val="68"/>
       </w:numPr>
-      <w:spacing w:before="160" w:after="80"/>
+      <w:tabs>
+        <w:tab w:val="left" w:pos="900"/>
+      </w:tabs>
       <w:outlineLvl w:val="2"/>
     </w:pPr>
     <w:rPr>
       <w:rFonts w:eastAsiaTheme="majorEastAsia" w:cstheme="majorBidi"/>
-      <w:color w:val="0F4761" w:themeColor="accent1" w:themeShade="BF"/>
-      <w:sz w:val="32"/>
+      <w:b/>
+      <w:color w:val="000000" w:themeColor="text1"/>
+      <w:sz w:val="28"/>
       <w:szCs w:val="28"/>
     </w:rPr>
   </w:style>
@@ -7207,21 +7331,23 @@
     <w:link w:val="Heading4Char"/>
     <w:unhideWhenUsed/>
     <w:qFormat/>
-    <w:rsid w:val="00B32420"/>
+    <w:rsid w:val="0091386F"/>
     <w:pPr>
       <w:keepNext/>
       <w:keepLines/>
       <w:numPr>
         <w:ilvl w:val="2"/>
-        <w:numId w:val="66"/>
+        <w:numId w:val="68"/>
       </w:numPr>
-      <w:spacing w:before="80" w:after="40"/>
+      <w:tabs>
+        <w:tab w:val="left" w:pos="1440"/>
+      </w:tabs>
       <w:outlineLvl w:val="3"/>
     </w:pPr>
     <w:rPr>
       <w:rFonts w:eastAsiaTheme="majorEastAsia" w:cstheme="majorBidi"/>
       <w:iCs/>
-      <w:color w:val="0F4761" w:themeColor="accent1" w:themeShade="BF"/>
+      <w:color w:val="000000" w:themeColor="text1"/>
     </w:rPr>
   </w:style>
   <w:style w:type="paragraph" w:styleId="Heading5">
@@ -7231,20 +7357,21 @@
     <w:link w:val="Heading5Char"/>
     <w:unhideWhenUsed/>
     <w:qFormat/>
-    <w:rsid w:val="00602229"/>
+    <w:rsid w:val="00562403"/>
     <w:pPr>
       <w:keepNext/>
       <w:keepLines/>
       <w:numPr>
         <w:ilvl w:val="3"/>
-        <w:numId w:val="66"/>
+        <w:numId w:val="68"/>
       </w:numPr>
       <w:spacing w:before="80" w:after="40"/>
       <w:outlineLvl w:val="4"/>
     </w:pPr>
     <w:rPr>
       <w:rFonts w:eastAsiaTheme="majorEastAsia" w:cstheme="majorBidi"/>
-      <w:color w:val="0F4761" w:themeColor="accent1" w:themeShade="BF"/>
+      <w:i/>
+      <w:color w:val="000000" w:themeColor="text1"/>
     </w:rPr>
   </w:style>
   <w:style w:type="paragraph" w:styleId="Heading6">
@@ -7254,22 +7381,21 @@
     <w:link w:val="Heading6Char"/>
     <w:unhideWhenUsed/>
     <w:qFormat/>
-    <w:rsid w:val="00602229"/>
+    <w:rsid w:val="00562403"/>
     <w:pPr>
       <w:keepNext/>
       <w:keepLines/>
       <w:numPr>
         <w:ilvl w:val="4"/>
-        <w:numId w:val="66"/>
+        <w:numId w:val="68"/>
       </w:numPr>
       <w:spacing w:before="40"/>
       <w:outlineLvl w:val="5"/>
     </w:pPr>
     <w:rPr>
       <w:rFonts w:eastAsiaTheme="majorEastAsia" w:cstheme="majorBidi"/>
-      <w:i/>
       <w:iCs/>
-      <w:color w:val="595959" w:themeColor="text1" w:themeTint="A6"/>
+      <w:color w:val="000000" w:themeColor="text1"/>
     </w:rPr>
   </w:style>
   <w:style w:type="paragraph" w:styleId="Heading7">
@@ -7279,20 +7405,21 @@
     <w:link w:val="Heading7Char"/>
     <w:unhideWhenUsed/>
     <w:qFormat/>
-    <w:rsid w:val="00602229"/>
+    <w:rsid w:val="00562403"/>
     <w:pPr>
       <w:keepNext/>
       <w:keepLines/>
       <w:numPr>
         <w:ilvl w:val="5"/>
-        <w:numId w:val="66"/>
+        <w:numId w:val="68"/>
       </w:numPr>
       <w:spacing w:before="40"/>
       <w:outlineLvl w:val="6"/>
     </w:pPr>
     <w:rPr>
       <w:rFonts w:eastAsiaTheme="majorEastAsia" w:cstheme="majorBidi"/>
-      <w:color w:val="595959" w:themeColor="text1" w:themeTint="A6"/>
+      <w:i/>
+      <w:color w:val="000000" w:themeColor="text1"/>
     </w:rPr>
   </w:style>
   <w:style w:type="paragraph" w:styleId="Heading8">
@@ -7368,12 +7495,13 @@
     <w:name w:val="Heading 2 Char"/>
     <w:basedOn w:val="DefaultParagraphFont"/>
     <w:link w:val="Heading2"/>
-    <w:rsid w:val="00D34A45"/>
+    <w:rsid w:val="0091386F"/>
     <w:rPr>
       <w:rFonts w:ascii="Calibri" w:eastAsia="Times New Roman" w:hAnsi="Calibri" w:cstheme="majorBidi"/>
+      <w:b/>
       <w:caps/>
       <w:kern w:val="0"/>
-      <w:sz w:val="40"/>
+      <w:sz w:val="28"/>
       <w:szCs w:val="24"/>
       <w:lang w:bidi="ar-SA"/>
       <w14:ligatures w14:val="none"/>
@@ -7399,12 +7527,13 @@
     <w:basedOn w:val="DefaultParagraphFont"/>
     <w:link w:val="Heading3"/>
     <w:uiPriority w:val="99"/>
-    <w:rsid w:val="00B32420"/>
+    <w:rsid w:val="0091386F"/>
     <w:rPr>
-      <w:rFonts w:ascii="Times New Roman" w:eastAsiaTheme="majorEastAsia" w:hAnsi="Times New Roman" w:cstheme="majorBidi"/>
-      <w:color w:val="0F4761" w:themeColor="accent1" w:themeShade="BF"/>
+      <w:rFonts w:ascii="Calibri" w:eastAsiaTheme="majorEastAsia" w:hAnsi="Calibri" w:cstheme="majorBidi"/>
+      <w:b/>
+      <w:color w:val="000000" w:themeColor="text1"/>
       <w:kern w:val="0"/>
-      <w:sz w:val="32"/>
+      <w:sz w:val="28"/>
       <w:szCs w:val="28"/>
       <w:lang w:bidi="ar-SA"/>
       <w14:ligatures w14:val="none"/>
@@ -7414,11 +7543,11 @@
     <w:name w:val="Heading 4 Char"/>
     <w:basedOn w:val="DefaultParagraphFont"/>
     <w:link w:val="Heading4"/>
-    <w:rsid w:val="00B32420"/>
+    <w:rsid w:val="0091386F"/>
     <w:rPr>
-      <w:rFonts w:ascii="Times New Roman" w:eastAsiaTheme="majorEastAsia" w:hAnsi="Times New Roman" w:cstheme="majorBidi"/>
+      <w:rFonts w:ascii="Calibri" w:eastAsiaTheme="majorEastAsia" w:hAnsi="Calibri" w:cstheme="majorBidi"/>
       <w:iCs/>
-      <w:color w:val="0F4761" w:themeColor="accent1" w:themeShade="BF"/>
+      <w:color w:val="000000" w:themeColor="text1"/>
       <w:kern w:val="0"/>
       <w:sz w:val="24"/>
       <w:szCs w:val="20"/>
@@ -7430,38 +7559,48 @@
     <w:name w:val="Heading 5 Char"/>
     <w:basedOn w:val="DefaultParagraphFont"/>
     <w:link w:val="Heading5"/>
-    <w:uiPriority w:val="9"/>
-    <w:semiHidden/>
-    <w:rsid w:val="00602229"/>
+    <w:rsid w:val="00562403"/>
     <w:rPr>
-      <w:rFonts w:eastAsiaTheme="majorEastAsia" w:cstheme="majorBidi"/>
-      <w:color w:val="0F4761" w:themeColor="accent1" w:themeShade="BF"/>
+      <w:rFonts w:ascii="Calibri" w:eastAsiaTheme="majorEastAsia" w:hAnsi="Calibri" w:cstheme="majorBidi"/>
+      <w:i/>
+      <w:color w:val="000000" w:themeColor="text1"/>
+      <w:kern w:val="0"/>
+      <w:sz w:val="24"/>
+      <w:szCs w:val="20"/>
+      <w:lang w:bidi="ar-SA"/>
+      <w14:ligatures w14:val="none"/>
     </w:rPr>
   </w:style>
   <w:style w:type="character" w:customStyle="1" w:styleId="Heading6Char">
     <w:name w:val="Heading 6 Char"/>
     <w:basedOn w:val="DefaultParagraphFont"/>
     <w:link w:val="Heading6"/>
-    <w:uiPriority w:val="9"/>
-    <w:semiHidden/>
-    <w:rsid w:val="00602229"/>
+    <w:rsid w:val="00562403"/>
     <w:rPr>
-      <w:rFonts w:eastAsiaTheme="majorEastAsia" w:cstheme="majorBidi"/>
-      <w:i/>
+      <w:rFonts w:ascii="Calibri" w:eastAsiaTheme="majorEastAsia" w:hAnsi="Calibri" w:cstheme="majorBidi"/>
       <w:iCs/>
-      <w:color w:val="595959" w:themeColor="text1" w:themeTint="A6"/>
+      <w:color w:val="000000" w:themeColor="text1"/>
+      <w:kern w:val="0"/>
+      <w:sz w:val="24"/>
+      <w:szCs w:val="20"/>
+      <w:lang w:bidi="ar-SA"/>
+      <w14:ligatures w14:val="none"/>
     </w:rPr>
   </w:style>
   <w:style w:type="character" w:customStyle="1" w:styleId="Heading7Char">
     <w:name w:val="Heading 7 Char"/>
     <w:basedOn w:val="DefaultParagraphFont"/>
     <w:link w:val="Heading7"/>
-    <w:uiPriority w:val="9"/>
-    <w:semiHidden/>
-    <w:rsid w:val="00602229"/>
+    <w:rsid w:val="00562403"/>
     <w:rPr>
-      <w:rFonts w:eastAsiaTheme="majorEastAsia" w:cstheme="majorBidi"/>
-      <w:color w:val="595959" w:themeColor="text1" w:themeTint="A6"/>
+      <w:rFonts w:ascii="Calibri" w:eastAsiaTheme="majorEastAsia" w:hAnsi="Calibri" w:cstheme="majorBidi"/>
+      <w:i/>
+      <w:color w:val="000000" w:themeColor="text1"/>
+      <w:kern w:val="0"/>
+      <w:sz w:val="24"/>
+      <w:szCs w:val="20"/>
+      <w:lang w:bidi="ar-SA"/>
+      <w14:ligatures w14:val="none"/>
     </w:rPr>
   </w:style>
   <w:style w:type="character" w:customStyle="1" w:styleId="Heading8Char">
@@ -8218,10 +8357,9 @@
     <w:basedOn w:val="Normal"/>
     <w:next w:val="Normal"/>
     <w:qFormat/>
-    <w:rsid w:val="006345A2"/>
+    <w:rsid w:val="005C3F4B"/>
     <w:pPr>
       <w:spacing w:before="0" w:after="40"/>
-      <w:ind w:left="360" w:hanging="360"/>
     </w:pPr>
   </w:style>
   <w:style w:type="paragraph" w:customStyle="1" w:styleId="FooterText">
@@ -8249,16 +8387,22 @@
     <w:name w:val="Dilon Step Heading"/>
     <w:basedOn w:val="Normal"/>
     <w:qFormat/>
-    <w:rsid w:val="00F33E93"/>
+    <w:rsid w:val="0038494F"/>
+    <w:pPr>
+      <w:tabs>
+        <w:tab w:val="left" w:pos="360"/>
+      </w:tabs>
+      <w:ind w:left="720" w:hanging="720"/>
+    </w:pPr>
   </w:style>
   <w:style w:type="paragraph" w:customStyle="1" w:styleId="DilonStepClarificationList">
     <w:name w:val="Dilon Step Clarification List"/>
     <w:basedOn w:val="ListParagraph"/>
     <w:qFormat/>
-    <w:rsid w:val="006B403A"/>
+    <w:rsid w:val="005A4AC3"/>
     <w:pPr>
       <w:numPr>
-        <w:numId w:val="68"/>
+        <w:numId w:val="69"/>
       </w:numPr>
     </w:pPr>
   </w:style>

</xml_diff>